<commit_message>
chore: log merge event for 7a801a4e47af316137118504759fdb8c167f08e6
</commit_message>
<xml_diff>
--- a/merge_agent/logs/merge-events-report.docx
+++ b/merge_agent/logs/merge-events-report.docx
@@ -44,7 +44,7 @@
           <w:color w:val="9CA3AF"/>
           <w:sz w:val="20"/>
         </w:rPr>
-        <w:t>Generated: March 03, 2026 at 10:34 UTC  •  1 merge events on record</w:t>
+        <w:t>Generated: March 03, 2026 at 11:02 UTC  •  2 merge events on record</w:t>
       </w:r>
     </w:p>
     <w:p>
@@ -104,7 +104,7 @@
                 <w:color w:val="1E3A5F"/>
                 <w:sz w:val="36"/>
               </w:rPr>
-              <w:t>1</w:t>
+              <w:t>2</w:t>
             </w:r>
           </w:p>
         </w:tc>
@@ -179,7 +179,7 @@
                 <w:color w:val="D97706"/>
                 <w:sz w:val="36"/>
               </w:rPr>
-              <w:t>+3/2</w:t>
+              <w:t>+5/3</w:t>
             </w:r>
           </w:p>
         </w:tc>
@@ -321,6 +321,37 @@
           <w:color w:val="1F2937"/>
           <w:sz w:val="20"/>
         </w:rPr>
+        <w:t>PR #3 — Update .gitignore</w:t>
+      </w:r>
+    </w:p>
+    <w:p>
+      <w:pPr>
+        <w:spacing w:before="80" w:after="200"/>
+        <w:ind w:left="432"/>
+        <w:pBdr>
+          <w:left w:val="single" w:sz="12" w:space="10" w:color="3B82F6"/>
+        </w:pBdr>
+      </w:pPr>
+      <w:r>
+        <w:rPr>
+          <w:i/>
+          <w:color w:val="1F2937"/>
+          <w:sz w:val="21"/>
+        </w:rPr>
+        <w:t>No description</w:t>
+      </w:r>
+    </w:p>
+    <w:p>
+      <w:pPr>
+        <w:spacing w:before="0" w:after="40"/>
+      </w:pPr>
+      <w:r>
+        <w:rPr>
+          <w:b/>
+          <w:i w:val="0"/>
+          <w:color w:val="1F2937"/>
+          <w:sz w:val="20"/>
+        </w:rPr>
         <w:t>PR #2 — Add comment to check v2 bot functionality</w:t>
       </w:r>
     </w:p>
@@ -362,6 +393,864 @@
         </w:rPr>
         <w:t>Merge Event Details</w:t>
       </w:r>
+    </w:p>
+    <w:p>
+      <w:pPr>
+        <w:spacing w:before="280" w:after="80"/>
+      </w:pPr>
+      <w:r>
+        <w:rPr>
+          <w:b/>
+          <w:color w:val="6B7280"/>
+          <w:sz w:val="26"/>
+        </w:rPr>
+        <w:t xml:space="preserve">PR #3 — </w:t>
+      </w:r>
+      <w:r>
+        <w:rPr>
+          <w:b/>
+          <w:color w:val="1F2937"/>
+          <w:sz w:val="26"/>
+        </w:rPr>
+        <w:t>Update .gitignore</w:t>
+      </w:r>
+    </w:p>
+    <w:p>
+      <w:pPr>
+        <w:spacing w:before="80" w:after="200"/>
+        <w:ind w:left="432"/>
+        <w:pBdr>
+          <w:left w:val="single" w:sz="12" w:space="10" w:color="10B981"/>
+        </w:pBdr>
+      </w:pPr>
+      <w:r>
+        <w:rPr>
+          <w:i/>
+          <w:color w:val="1F2937"/>
+          <w:sz w:val="21"/>
+        </w:rPr>
+        <w:t>💡 No description</w:t>
+      </w:r>
+    </w:p>
+    <w:tbl>
+      <w:tblPr>
+        <w:tblStyle w:val="TableGrid"/>
+        <w:tblW w:type="auto" w:w="0"/>
+        <w:tblLook w:firstColumn="1" w:firstRow="1" w:lastColumn="0" w:lastRow="0" w:noHBand="0" w:noVBand="1" w:val="04A0"/>
+      </w:tblPr>
+      <w:tblGrid>
+        <w:gridCol w:w="4680"/>
+        <w:gridCol w:w="4680"/>
+      </w:tblGrid>
+      <w:tr>
+        <w:tc>
+          <w:tcPr>
+            <w:tcW w:type="dxa" w:w="2592"/>
+            <w:shd w:val="clear" w:color="auto" w:fill="F9FAFB"/>
+            <w:tcBorders>
+              <w:top w:val="single" w:sz="4" w:space="0" w:color="CCCCCC"/>
+              <w:left w:val="single" w:sz="4" w:space="0" w:color="CCCCCC"/>
+              <w:bottom w:val="single" w:sz="4" w:space="0" w:color="CCCCCC"/>
+              <w:right w:val="single" w:sz="4" w:space="0" w:color="CCCCCC"/>
+            </w:tcBorders>
+          </w:tcPr>
+          <w:p>
+            <w:r>
+              <w:rPr>
+                <w:b/>
+                <w:color w:val="1F2937"/>
+                <w:sz w:val="20"/>
+              </w:rPr>
+              <w:t>PR Author</w:t>
+            </w:r>
+          </w:p>
+        </w:tc>
+        <w:tc>
+          <w:tcPr>
+            <w:tcW w:type="dxa" w:w="8208"/>
+            <w:tcBorders>
+              <w:top w:val="single" w:sz="4" w:space="0" w:color="CCCCCC"/>
+              <w:left w:val="single" w:sz="4" w:space="0" w:color="CCCCCC"/>
+              <w:bottom w:val="single" w:sz="4" w:space="0" w:color="CCCCCC"/>
+              <w:right w:val="single" w:sz="4" w:space="0" w:color="CCCCCC"/>
+            </w:tcBorders>
+          </w:tcPr>
+          <w:p>
+            <w:r>
+              <w:rPr>
+                <w:sz w:val="20"/>
+              </w:rPr>
+              <w:t>likiita</w:t>
+            </w:r>
+          </w:p>
+        </w:tc>
+      </w:tr>
+      <w:tr>
+        <w:tc>
+          <w:tcPr>
+            <w:tcW w:type="dxa" w:w="2592"/>
+            <w:shd w:val="clear" w:color="auto" w:fill="F9FAFB"/>
+            <w:tcBorders>
+              <w:top w:val="single" w:sz="4" w:space="0" w:color="CCCCCC"/>
+              <w:left w:val="single" w:sz="4" w:space="0" w:color="CCCCCC"/>
+              <w:bottom w:val="single" w:sz="4" w:space="0" w:color="CCCCCC"/>
+              <w:right w:val="single" w:sz="4" w:space="0" w:color="CCCCCC"/>
+            </w:tcBorders>
+          </w:tcPr>
+          <w:p>
+            <w:r>
+              <w:rPr>
+                <w:b/>
+                <w:color w:val="1F2937"/>
+                <w:sz w:val="20"/>
+              </w:rPr>
+              <w:t>Merged By</w:t>
+            </w:r>
+          </w:p>
+        </w:tc>
+        <w:tc>
+          <w:tcPr>
+            <w:tcW w:type="dxa" w:w="8208"/>
+            <w:tcBorders>
+              <w:top w:val="single" w:sz="4" w:space="0" w:color="CCCCCC"/>
+              <w:left w:val="single" w:sz="4" w:space="0" w:color="CCCCCC"/>
+              <w:bottom w:val="single" w:sz="4" w:space="0" w:color="CCCCCC"/>
+              <w:right w:val="single" w:sz="4" w:space="0" w:color="CCCCCC"/>
+            </w:tcBorders>
+          </w:tcPr>
+          <w:p>
+            <w:r>
+              <w:rPr>
+                <w:sz w:val="20"/>
+              </w:rPr>
+              <w:t>likiita</w:t>
+            </w:r>
+          </w:p>
+        </w:tc>
+      </w:tr>
+      <w:tr>
+        <w:tc>
+          <w:tcPr>
+            <w:tcW w:type="dxa" w:w="2592"/>
+            <w:shd w:val="clear" w:color="auto" w:fill="F9FAFB"/>
+            <w:tcBorders>
+              <w:top w:val="single" w:sz="4" w:space="0" w:color="CCCCCC"/>
+              <w:left w:val="single" w:sz="4" w:space="0" w:color="CCCCCC"/>
+              <w:bottom w:val="single" w:sz="4" w:space="0" w:color="CCCCCC"/>
+              <w:right w:val="single" w:sz="4" w:space="0" w:color="CCCCCC"/>
+            </w:tcBorders>
+          </w:tcPr>
+          <w:p>
+            <w:r>
+              <w:rPr>
+                <w:b/>
+                <w:color w:val="1F2937"/>
+                <w:sz w:val="20"/>
+              </w:rPr>
+              <w:t>Merged At</w:t>
+            </w:r>
+          </w:p>
+        </w:tc>
+        <w:tc>
+          <w:tcPr>
+            <w:tcW w:type="dxa" w:w="8208"/>
+            <w:tcBorders>
+              <w:top w:val="single" w:sz="4" w:space="0" w:color="CCCCCC"/>
+              <w:left w:val="single" w:sz="4" w:space="0" w:color="CCCCCC"/>
+              <w:bottom w:val="single" w:sz="4" w:space="0" w:color="CCCCCC"/>
+              <w:right w:val="single" w:sz="4" w:space="0" w:color="CCCCCC"/>
+            </w:tcBorders>
+          </w:tcPr>
+          <w:p>
+            <w:r>
+              <w:rPr>
+                <w:sz w:val="20"/>
+              </w:rPr>
+              <w:t>2026-03-03 11:01:59</w:t>
+            </w:r>
+          </w:p>
+        </w:tc>
+      </w:tr>
+      <w:tr>
+        <w:tc>
+          <w:tcPr>
+            <w:tcW w:type="dxa" w:w="2592"/>
+            <w:shd w:val="clear" w:color="auto" w:fill="F9FAFB"/>
+            <w:tcBorders>
+              <w:top w:val="single" w:sz="4" w:space="0" w:color="CCCCCC"/>
+              <w:left w:val="single" w:sz="4" w:space="0" w:color="CCCCCC"/>
+              <w:bottom w:val="single" w:sz="4" w:space="0" w:color="CCCCCC"/>
+              <w:right w:val="single" w:sz="4" w:space="0" w:color="CCCCCC"/>
+            </w:tcBorders>
+          </w:tcPr>
+          <w:p>
+            <w:r>
+              <w:rPr>
+                <w:b/>
+                <w:color w:val="1F2937"/>
+                <w:sz w:val="20"/>
+              </w:rPr>
+              <w:t>Merge Commit</w:t>
+            </w:r>
+          </w:p>
+        </w:tc>
+        <w:tc>
+          <w:tcPr>
+            <w:tcW w:type="dxa" w:w="8208"/>
+            <w:tcBorders>
+              <w:top w:val="single" w:sz="4" w:space="0" w:color="CCCCCC"/>
+              <w:left w:val="single" w:sz="4" w:space="0" w:color="CCCCCC"/>
+              <w:bottom w:val="single" w:sz="4" w:space="0" w:color="CCCCCC"/>
+              <w:right w:val="single" w:sz="4" w:space="0" w:color="CCCCCC"/>
+            </w:tcBorders>
+          </w:tcPr>
+          <w:p>
+            <w:r>
+              <w:rPr>
+                <w:sz w:val="20"/>
+              </w:rPr>
+              <w:t>7a801a4e47af...</w:t>
+            </w:r>
+          </w:p>
+        </w:tc>
+      </w:tr>
+      <w:tr>
+        <w:tc>
+          <w:tcPr>
+            <w:tcW w:type="dxa" w:w="2592"/>
+            <w:shd w:val="clear" w:color="auto" w:fill="F9FAFB"/>
+            <w:tcBorders>
+              <w:top w:val="single" w:sz="4" w:space="0" w:color="CCCCCC"/>
+              <w:left w:val="single" w:sz="4" w:space="0" w:color="CCCCCC"/>
+              <w:bottom w:val="single" w:sz="4" w:space="0" w:color="CCCCCC"/>
+              <w:right w:val="single" w:sz="4" w:space="0" w:color="CCCCCC"/>
+            </w:tcBorders>
+          </w:tcPr>
+          <w:p>
+            <w:r>
+              <w:rPr>
+                <w:b/>
+                <w:color w:val="1F2937"/>
+                <w:sz w:val="20"/>
+              </w:rPr>
+              <w:t>Branch</w:t>
+            </w:r>
+          </w:p>
+        </w:tc>
+        <w:tc>
+          <w:tcPr>
+            <w:tcW w:type="dxa" w:w="8208"/>
+            <w:tcBorders>
+              <w:top w:val="single" w:sz="4" w:space="0" w:color="CCCCCC"/>
+              <w:left w:val="single" w:sz="4" w:space="0" w:color="CCCCCC"/>
+              <w:bottom w:val="single" w:sz="4" w:space="0" w:color="CCCCCC"/>
+              <w:right w:val="single" w:sz="4" w:space="0" w:color="CCCCCC"/>
+            </w:tcBorders>
+          </w:tcPr>
+          <w:p>
+            <w:r>
+              <w:rPr>
+                <w:sz w:val="20"/>
+              </w:rPr>
+              <w:t>bot_test → master</w:t>
+            </w:r>
+          </w:p>
+        </w:tc>
+      </w:tr>
+      <w:tr>
+        <w:tc>
+          <w:tcPr>
+            <w:tcW w:type="dxa" w:w="2592"/>
+            <w:shd w:val="clear" w:color="auto" w:fill="F9FAFB"/>
+            <w:tcBorders>
+              <w:top w:val="single" w:sz="4" w:space="0" w:color="CCCCCC"/>
+              <w:left w:val="single" w:sz="4" w:space="0" w:color="CCCCCC"/>
+              <w:bottom w:val="single" w:sz="4" w:space="0" w:color="CCCCCC"/>
+              <w:right w:val="single" w:sz="4" w:space="0" w:color="CCCCCC"/>
+            </w:tcBorders>
+          </w:tcPr>
+          <w:p>
+            <w:r>
+              <w:rPr>
+                <w:b/>
+                <w:color w:val="1F2937"/>
+                <w:sz w:val="20"/>
+              </w:rPr>
+              <w:t>Labels</w:t>
+            </w:r>
+          </w:p>
+        </w:tc>
+        <w:tc>
+          <w:tcPr>
+            <w:tcW w:type="dxa" w:w="8208"/>
+            <w:tcBorders>
+              <w:top w:val="single" w:sz="4" w:space="0" w:color="CCCCCC"/>
+              <w:left w:val="single" w:sz="4" w:space="0" w:color="CCCCCC"/>
+              <w:bottom w:val="single" w:sz="4" w:space="0" w:color="CCCCCC"/>
+              <w:right w:val="single" w:sz="4" w:space="0" w:color="CCCCCC"/>
+            </w:tcBorders>
+          </w:tcPr>
+          <w:p>
+            <w:r>
+              <w:rPr>
+                <w:sz w:val="20"/>
+              </w:rPr>
+              <w:t>None</w:t>
+            </w:r>
+          </w:p>
+        </w:tc>
+      </w:tr>
+      <w:tr>
+        <w:tc>
+          <w:tcPr>
+            <w:tcW w:type="dxa" w:w="2592"/>
+            <w:shd w:val="clear" w:color="auto" w:fill="F9FAFB"/>
+            <w:tcBorders>
+              <w:top w:val="single" w:sz="4" w:space="0" w:color="CCCCCC"/>
+              <w:left w:val="single" w:sz="4" w:space="0" w:color="CCCCCC"/>
+              <w:bottom w:val="single" w:sz="4" w:space="0" w:color="CCCCCC"/>
+              <w:right w:val="single" w:sz="4" w:space="0" w:color="CCCCCC"/>
+            </w:tcBorders>
+          </w:tcPr>
+          <w:p>
+            <w:r>
+              <w:rPr>
+                <w:b/>
+                <w:color w:val="1F2937"/>
+                <w:sz w:val="20"/>
+              </w:rPr>
+              <w:t>Code Delta</w:t>
+            </w:r>
+          </w:p>
+        </w:tc>
+        <w:tc>
+          <w:tcPr>
+            <w:tcW w:type="dxa" w:w="8208"/>
+            <w:tcBorders>
+              <w:top w:val="single" w:sz="4" w:space="0" w:color="CCCCCC"/>
+              <w:left w:val="single" w:sz="4" w:space="0" w:color="CCCCCC"/>
+              <w:bottom w:val="single" w:sz="4" w:space="0" w:color="CCCCCC"/>
+              <w:right w:val="single" w:sz="4" w:space="0" w:color="CCCCCC"/>
+            </w:tcBorders>
+          </w:tcPr>
+          <w:p>
+            <w:r>
+              <w:rPr>
+                <w:sz w:val="20"/>
+              </w:rPr>
+              <w:t>+2 / -1 lines</w:t>
+            </w:r>
+          </w:p>
+        </w:tc>
+      </w:tr>
+      <w:tr>
+        <w:tc>
+          <w:tcPr>
+            <w:tcW w:type="dxa" w:w="2592"/>
+            <w:shd w:val="clear" w:color="auto" w:fill="F9FAFB"/>
+            <w:tcBorders>
+              <w:top w:val="single" w:sz="4" w:space="0" w:color="CCCCCC"/>
+              <w:left w:val="single" w:sz="4" w:space="0" w:color="CCCCCC"/>
+              <w:bottom w:val="single" w:sz="4" w:space="0" w:color="CCCCCC"/>
+              <w:right w:val="single" w:sz="4" w:space="0" w:color="CCCCCC"/>
+            </w:tcBorders>
+          </w:tcPr>
+          <w:p>
+            <w:r>
+              <w:rPr>
+                <w:b/>
+                <w:color w:val="1F2937"/>
+                <w:sz w:val="20"/>
+              </w:rPr>
+              <w:t>Commits</w:t>
+            </w:r>
+          </w:p>
+        </w:tc>
+        <w:tc>
+          <w:tcPr>
+            <w:tcW w:type="dxa" w:w="8208"/>
+            <w:tcBorders>
+              <w:top w:val="single" w:sz="4" w:space="0" w:color="CCCCCC"/>
+              <w:left w:val="single" w:sz="4" w:space="0" w:color="CCCCCC"/>
+              <w:bottom w:val="single" w:sz="4" w:space="0" w:color="CCCCCC"/>
+              <w:right w:val="single" w:sz="4" w:space="0" w:color="CCCCCC"/>
+            </w:tcBorders>
+          </w:tcPr>
+          <w:p>
+            <w:r>
+              <w:rPr>
+                <w:sz w:val="20"/>
+              </w:rPr>
+              <w:t>1</w:t>
+            </w:r>
+          </w:p>
+        </w:tc>
+      </w:tr>
+      <w:tr>
+        <w:tc>
+          <w:tcPr>
+            <w:tcW w:type="dxa" w:w="2592"/>
+            <w:shd w:val="clear" w:color="auto" w:fill="F9FAFB"/>
+            <w:tcBorders>
+              <w:top w:val="single" w:sz="4" w:space="0" w:color="CCCCCC"/>
+              <w:left w:val="single" w:sz="4" w:space="0" w:color="CCCCCC"/>
+              <w:bottom w:val="single" w:sz="4" w:space="0" w:color="CCCCCC"/>
+              <w:right w:val="single" w:sz="4" w:space="0" w:color="CCCCCC"/>
+            </w:tcBorders>
+          </w:tcPr>
+          <w:p>
+            <w:r>
+              <w:rPr>
+                <w:b/>
+                <w:color w:val="1F2937"/>
+                <w:sz w:val="20"/>
+              </w:rPr>
+              <w:t>Files Changed</w:t>
+            </w:r>
+          </w:p>
+        </w:tc>
+        <w:tc>
+          <w:tcPr>
+            <w:tcW w:type="dxa" w:w="8208"/>
+            <w:tcBorders>
+              <w:top w:val="single" w:sz="4" w:space="0" w:color="CCCCCC"/>
+              <w:left w:val="single" w:sz="4" w:space="0" w:color="CCCCCC"/>
+              <w:bottom w:val="single" w:sz="4" w:space="0" w:color="CCCCCC"/>
+              <w:right w:val="single" w:sz="4" w:space="0" w:color="CCCCCC"/>
+            </w:tcBorders>
+          </w:tcPr>
+          <w:p>
+            <w:r>
+              <w:rPr>
+                <w:sz w:val="20"/>
+              </w:rPr>
+              <w:t>1</w:t>
+            </w:r>
+          </w:p>
+        </w:tc>
+      </w:tr>
+      <w:tr>
+        <w:tc>
+          <w:tcPr>
+            <w:tcW w:type="dxa" w:w="2592"/>
+            <w:shd w:val="clear" w:color="auto" w:fill="F9FAFB"/>
+            <w:tcBorders>
+              <w:top w:val="single" w:sz="4" w:space="0" w:color="CCCCCC"/>
+              <w:left w:val="single" w:sz="4" w:space="0" w:color="CCCCCC"/>
+              <w:bottom w:val="single" w:sz="4" w:space="0" w:color="CCCCCC"/>
+              <w:right w:val="single" w:sz="4" w:space="0" w:color="CCCCCC"/>
+            </w:tcBorders>
+          </w:tcPr>
+          <w:p>
+            <w:r>
+              <w:rPr>
+                <w:b/>
+                <w:color w:val="1F2937"/>
+                <w:sz w:val="20"/>
+              </w:rPr>
+              <w:t>Approvals</w:t>
+            </w:r>
+          </w:p>
+        </w:tc>
+        <w:tc>
+          <w:tcPr>
+            <w:tcW w:type="dxa" w:w="8208"/>
+            <w:tcBorders>
+              <w:top w:val="single" w:sz="4" w:space="0" w:color="CCCCCC"/>
+              <w:left w:val="single" w:sz="4" w:space="0" w:color="CCCCCC"/>
+              <w:bottom w:val="single" w:sz="4" w:space="0" w:color="CCCCCC"/>
+              <w:right w:val="single" w:sz="4" w:space="0" w:color="CCCCCC"/>
+            </w:tcBorders>
+          </w:tcPr>
+          <w:p>
+            <w:r>
+              <w:rPr>
+                <w:sz w:val="20"/>
+              </w:rPr>
+              <w:t>None</w:t>
+            </w:r>
+          </w:p>
+        </w:tc>
+      </w:tr>
+      <w:tr>
+        <w:tc>
+          <w:tcPr>
+            <w:tcW w:type="dxa" w:w="2592"/>
+            <w:shd w:val="clear" w:color="auto" w:fill="F9FAFB"/>
+            <w:tcBorders>
+              <w:top w:val="single" w:sz="4" w:space="0" w:color="CCCCCC"/>
+              <w:left w:val="single" w:sz="4" w:space="0" w:color="CCCCCC"/>
+              <w:bottom w:val="single" w:sz="4" w:space="0" w:color="CCCCCC"/>
+              <w:right w:val="single" w:sz="4" w:space="0" w:color="CCCCCC"/>
+            </w:tcBorders>
+          </w:tcPr>
+          <w:p>
+            <w:r>
+              <w:rPr>
+                <w:b/>
+                <w:color w:val="1F2937"/>
+                <w:sz w:val="20"/>
+              </w:rPr>
+              <w:t>Changes Requested</w:t>
+            </w:r>
+          </w:p>
+        </w:tc>
+        <w:tc>
+          <w:tcPr>
+            <w:tcW w:type="dxa" w:w="8208"/>
+            <w:tcBorders>
+              <w:top w:val="single" w:sz="4" w:space="0" w:color="CCCCCC"/>
+              <w:left w:val="single" w:sz="4" w:space="0" w:color="CCCCCC"/>
+              <w:bottom w:val="single" w:sz="4" w:space="0" w:color="CCCCCC"/>
+              <w:right w:val="single" w:sz="4" w:space="0" w:color="CCCCCC"/>
+            </w:tcBorders>
+          </w:tcPr>
+          <w:p>
+            <w:r>
+              <w:rPr>
+                <w:sz w:val="20"/>
+              </w:rPr>
+              <w:t>None</w:t>
+            </w:r>
+          </w:p>
+        </w:tc>
+      </w:tr>
+      <w:tr>
+        <w:tc>
+          <w:tcPr>
+            <w:tcW w:type="dxa" w:w="2592"/>
+            <w:shd w:val="clear" w:color="auto" w:fill="F9FAFB"/>
+            <w:tcBorders>
+              <w:top w:val="single" w:sz="4" w:space="0" w:color="CCCCCC"/>
+              <w:left w:val="single" w:sz="4" w:space="0" w:color="CCCCCC"/>
+              <w:bottom w:val="single" w:sz="4" w:space="0" w:color="CCCCCC"/>
+              <w:right w:val="single" w:sz="4" w:space="0" w:color="CCCCCC"/>
+            </w:tcBorders>
+          </w:tcPr>
+          <w:p>
+            <w:r>
+              <w:rPr>
+                <w:b/>
+                <w:color w:val="1F2937"/>
+                <w:sz w:val="20"/>
+              </w:rPr>
+              <w:t>Comments</w:t>
+            </w:r>
+          </w:p>
+        </w:tc>
+        <w:tc>
+          <w:tcPr>
+            <w:tcW w:type="dxa" w:w="8208"/>
+            <w:tcBorders>
+              <w:top w:val="single" w:sz="4" w:space="0" w:color="CCCCCC"/>
+              <w:left w:val="single" w:sz="4" w:space="0" w:color="CCCCCC"/>
+              <w:bottom w:val="single" w:sz="4" w:space="0" w:color="CCCCCC"/>
+              <w:right w:val="single" w:sz="4" w:space="0" w:color="CCCCCC"/>
+            </w:tcBorders>
+          </w:tcPr>
+          <w:p>
+            <w:r>
+              <w:rPr>
+                <w:sz w:val="20"/>
+              </w:rPr>
+              <w:t>0 general  |  0 review</w:t>
+            </w:r>
+          </w:p>
+        </w:tc>
+      </w:tr>
+      <w:tr>
+        <w:tc>
+          <w:tcPr>
+            <w:tcW w:type="dxa" w:w="2592"/>
+            <w:shd w:val="clear" w:color="auto" w:fill="F9FAFB"/>
+            <w:tcBorders>
+              <w:top w:val="single" w:sz="4" w:space="0" w:color="CCCCCC"/>
+              <w:left w:val="single" w:sz="4" w:space="0" w:color="CCCCCC"/>
+              <w:bottom w:val="single" w:sz="4" w:space="0" w:color="CCCCCC"/>
+              <w:right w:val="single" w:sz="4" w:space="0" w:color="CCCCCC"/>
+            </w:tcBorders>
+          </w:tcPr>
+          <w:p>
+            <w:r>
+              <w:rPr>
+                <w:b/>
+                <w:color w:val="1F2937"/>
+                <w:sz w:val="20"/>
+              </w:rPr>
+              <w:t>Linked Issues</w:t>
+            </w:r>
+          </w:p>
+        </w:tc>
+        <w:tc>
+          <w:tcPr>
+            <w:tcW w:type="dxa" w:w="8208"/>
+            <w:tcBorders>
+              <w:top w:val="single" w:sz="4" w:space="0" w:color="CCCCCC"/>
+              <w:left w:val="single" w:sz="4" w:space="0" w:color="CCCCCC"/>
+              <w:bottom w:val="single" w:sz="4" w:space="0" w:color="CCCCCC"/>
+              <w:right w:val="single" w:sz="4" w:space="0" w:color="CCCCCC"/>
+            </w:tcBorders>
+          </w:tcPr>
+          <w:p>
+            <w:r>
+              <w:rPr>
+                <w:sz w:val="20"/>
+              </w:rPr>
+              <w:t>0</w:t>
+            </w:r>
+          </w:p>
+        </w:tc>
+      </w:tr>
+      <w:tr>
+        <w:tc>
+          <w:tcPr>
+            <w:tcW w:type="dxa" w:w="2592"/>
+            <w:shd w:val="clear" w:color="auto" w:fill="F9FAFB"/>
+            <w:tcBorders>
+              <w:top w:val="single" w:sz="4" w:space="0" w:color="CCCCCC"/>
+              <w:left w:val="single" w:sz="4" w:space="0" w:color="CCCCCC"/>
+              <w:bottom w:val="single" w:sz="4" w:space="0" w:color="CCCCCC"/>
+              <w:right w:val="single" w:sz="4" w:space="0" w:color="CCCCCC"/>
+            </w:tcBorders>
+          </w:tcPr>
+          <w:p>
+            <w:r>
+              <w:rPr>
+                <w:b/>
+                <w:color w:val="1F2937"/>
+                <w:sz w:val="20"/>
+              </w:rPr>
+              <w:t>PR URL</w:t>
+            </w:r>
+          </w:p>
+        </w:tc>
+        <w:tc>
+          <w:tcPr>
+            <w:tcW w:type="dxa" w:w="8208"/>
+            <w:tcBorders>
+              <w:top w:val="single" w:sz="4" w:space="0" w:color="CCCCCC"/>
+              <w:left w:val="single" w:sz="4" w:space="0" w:color="CCCCCC"/>
+              <w:bottom w:val="single" w:sz="4" w:space="0" w:color="CCCCCC"/>
+              <w:right w:val="single" w:sz="4" w:space="0" w:color="CCCCCC"/>
+            </w:tcBorders>
+          </w:tcPr>
+          <w:p>
+            <w:r>
+              <w:rPr>
+                <w:sz w:val="20"/>
+              </w:rPr>
+              <w:t>https://github.com/Janiyamt/PR-AGENT/pull/3</w:t>
+            </w:r>
+          </w:p>
+        </w:tc>
+      </w:tr>
+    </w:tbl>
+    <w:p>
+      <w:pPr>
+        <w:spacing w:before="160" w:after="40"/>
+      </w:pPr>
+      <w:r>
+        <w:rPr>
+          <w:b/>
+          <w:i w:val="0"/>
+          <w:color w:val="1F2937"/>
+          <w:sz w:val="20"/>
+        </w:rPr>
+        <w:t>Commit Messages:</w:t>
+      </w:r>
+    </w:p>
+    <w:p>
+      <w:pPr>
+        <w:spacing w:before="0" w:after="40"/>
+      </w:pPr>
+      <w:r>
+        <w:rPr>
+          <w:b w:val="0"/>
+          <w:i w:val="0"/>
+          <w:color w:val="6B7280"/>
+          <w:sz w:val="18"/>
+        </w:rPr>
+        <w:t xml:space="preserve">  • Update .gitignore</w:t>
+      </w:r>
+    </w:p>
+    <w:p>
+      <w:pPr>
+        <w:spacing w:before="160" w:after="40"/>
+      </w:pPr>
+      <w:r>
+        <w:rPr>
+          <w:b/>
+          <w:i w:val="0"/>
+          <w:color w:val="1F2937"/>
+          <w:sz w:val="20"/>
+        </w:rPr>
+        <w:t>Before → After:</w:t>
+      </w:r>
+    </w:p>
+    <w:p>
+      <w:pPr>
+        <w:spacing w:before="80" w:after="200"/>
+        <w:ind w:left="432"/>
+        <w:pBdr>
+          <w:left w:val="single" w:sz="12" w:space="10" w:color="3B82F6"/>
+        </w:pBdr>
+      </w:pPr>
+      <w:r>
+        <w:rPr>
+          <w:i/>
+          <w:color w:val="1F2937"/>
+          <w:sz w:val="21"/>
+        </w:rPr>
+        <w:t>AI analysis unavailable — check OCI credentials in GitHub Secrets.</w:t>
+      </w:r>
+    </w:p>
+    <w:p>
+      <w:pPr>
+        <w:spacing w:before="120" w:after="40"/>
+      </w:pPr>
+      <w:r>
+        <w:rPr>
+          <w:b/>
+          <w:i w:val="0"/>
+          <w:color w:val="1F2937"/>
+          <w:sz w:val="20"/>
+        </w:rPr>
+        <w:t>Key Impacts:</w:t>
+      </w:r>
+    </w:p>
+    <w:p>
+      <w:pPr>
+        <w:spacing w:before="0" w:after="40"/>
+      </w:pPr>
+      <w:r>
+        <w:rPr>
+          <w:b w:val="0"/>
+          <w:i w:val="0"/>
+          <w:color w:val="6B7280"/>
+          <w:sz w:val="18"/>
+        </w:rPr>
+        <w:t xml:space="preserve">  • Changed 1 file(s)</w:t>
+      </w:r>
+    </w:p>
+    <w:p>
+      <w:pPr>
+        <w:spacing w:before="120" w:after="40"/>
+      </w:pPr>
+      <w:r>
+        <w:rPr>
+          <w:b/>
+          <w:i w:val="0"/>
+          <w:color w:val="1F2937"/>
+          <w:sz w:val="20"/>
+        </w:rPr>
+        <w:t>Review Notes:</w:t>
+      </w:r>
+    </w:p>
+    <w:p>
+      <w:pPr>
+        <w:spacing w:before="0" w:after="80"/>
+      </w:pPr>
+      <w:r>
+        <w:rPr>
+          <w:b w:val="0"/>
+          <w:i w:val="0"/>
+          <w:color w:val="6B7280"/>
+          <w:sz w:val="18"/>
+        </w:rPr>
+        <w:t>Approved by: No approvals recorded.</w:t>
+      </w:r>
+    </w:p>
+    <w:p>
+      <w:pPr>
+        <w:spacing w:before="120" w:after="40"/>
+      </w:pPr>
+      <w:r>
+        <w:rPr>
+          <w:b/>
+          <w:i w:val="0"/>
+          <w:color w:val="1F2937"/>
+          <w:sz w:val="20"/>
+        </w:rPr>
+        <w:t>Files Changed:</w:t>
+      </w:r>
+    </w:p>
+    <w:p>
+      <w:pPr>
+        <w:spacing w:before="0" w:after="20"/>
+      </w:pPr>
+      <w:r>
+        <w:rPr>
+          <w:b w:val="0"/>
+          <w:i w:val="0"/>
+          <w:color w:val="6B7280"/>
+          <w:sz w:val="16"/>
+        </w:rPr>
+        <w:t xml:space="preserve">  .gitignore</w:t>
+      </w:r>
+    </w:p>
+    <w:p>
+      <w:pPr>
+        <w:spacing w:before="120" w:after="40"/>
+      </w:pPr>
+      <w:r>
+        <w:rPr>
+          <w:b/>
+          <w:i w:val="0"/>
+          <w:color w:val="1F2937"/>
+          <w:sz w:val="20"/>
+        </w:rPr>
+        <w:t>Code Diffs (sample):</w:t>
+      </w:r>
+    </w:p>
+    <w:p>
+      <w:pPr>
+        <w:spacing w:before="80" w:after="40"/>
+      </w:pPr>
+      <w:r>
+        <w:rPr>
+          <w:b/>
+          <w:i w:val="0"/>
+          <w:color w:val="1E3A5F"/>
+          <w:sz w:val="18"/>
+        </w:rPr>
+        <w:t>MODIFIED: .gitignore  (+2 / -1)</w:t>
+      </w:r>
+    </w:p>
+    <w:p>
+      <w:pPr>
+        <w:spacing w:before="0" w:after="80"/>
+      </w:pPr>
+      <w:r>
+        <w:rPr>
+          <w:b w:val="0"/>
+          <w:i w:val="0"/>
+          <w:color w:val="6B7280"/>
+          <w:sz w:val="16"/>
+        </w:rPr>
+        <w:t>@@ -3,4 +3,5 @@ __pycache__/</w:t>
+        <w:br/>
+        <w:t xml:space="preserve"> pr_report.docx</w:t>
+        <w:br/>
+        <w:t xml:space="preserve"> venv/</w:t>
+        <w:br/>
+        <w:t xml:space="preserve"> .venv/</w:t>
+        <w:br/>
+        <w:t>-config.py</w:t>
+        <w:br/>
+        <w:t>\ No newline at end of file</w:t>
+        <w:br/>
+        <w:t>+config.py</w:t>
+        <w:br/>
+        <w:t>+#tHIS IS THE SECOND COMMENT MADE TO EXPLAIN AND UNDERSTAND THE BOT AS THE 1ST ONE FAILED</w:t>
+      </w:r>
+    </w:p>
+    <w:p>
+      <w:pPr>
+        <w:spacing w:before="80" w:after="80"/>
+        <w:pBdr>
+          <w:bottom w:val="single" w:sz="4" w:space="1" w:color="E5E7EB"/>
+        </w:pBdr>
+      </w:pPr>
     </w:p>
     <w:p>
       <w:pPr>
@@ -1347,7 +2236,7 @@
           <w:color w:val="9CA3AF"/>
           <w:sz w:val="18"/>
         </w:rPr>
-        <w:t>Merge Events Report  •  Generated by PR-Agent v2  •  March 03, 2026 at 10:34 UTC</w:t>
+        <w:t>Merge Events Report  •  Generated by PR-Agent v2  •  March 03, 2026 at 11:02 UTC</w:t>
       </w:r>
     </w:p>
     <w:sectPr>

</xml_diff>

<commit_message>
chore: log merge event for 71f19dca2b81e600715870760d260bde6c012a94
</commit_message>
<xml_diff>
--- a/merge_agent/logs/merge-events-report.docx
+++ b/merge_agent/logs/merge-events-report.docx
@@ -44,7 +44,7 @@
           <w:color w:val="9CA3AF"/>
           <w:sz w:val="20"/>
         </w:rPr>
-        <w:t>Generated: March 03, 2026 at 11:02 UTC  •  2 merge events on record</w:t>
+        <w:t>Generated: March 03, 2026 at 11:21 UTC  •  3 merge events on record</w:t>
       </w:r>
     </w:p>
     <w:p>
@@ -104,7 +104,7 @@
                 <w:color w:val="1E3A5F"/>
                 <w:sz w:val="36"/>
               </w:rPr>
-              <w:t>2</w:t>
+              <w:t>3</w:t>
             </w:r>
           </w:p>
         </w:tc>
@@ -179,7 +179,7 @@
                 <w:color w:val="D97706"/>
                 <w:sz w:val="36"/>
               </w:rPr>
-              <w:t>+5/3</w:t>
+              <w:t>+6/4</w:t>
             </w:r>
           </w:p>
         </w:tc>
@@ -321,6 +321,37 @@
           <w:color w:val="1F2937"/>
           <w:sz w:val="20"/>
         </w:rPr>
+        <w:t>PR #4 — Update .gitignore</w:t>
+      </w:r>
+    </w:p>
+    <w:p>
+      <w:pPr>
+        <w:spacing w:before="80" w:after="200"/>
+        <w:ind w:left="432"/>
+        <w:pBdr>
+          <w:left w:val="single" w:sz="12" w:space="10" w:color="3B82F6"/>
+        </w:pBdr>
+      </w:pPr>
+      <w:r>
+        <w:rPr>
+          <w:i/>
+          <w:color w:val="1F2937"/>
+          <w:sz w:val="21"/>
+        </w:rPr>
+        <w:t>No description</w:t>
+      </w:r>
+    </w:p>
+    <w:p>
+      <w:pPr>
+        <w:spacing w:before="0" w:after="40"/>
+      </w:pPr>
+      <w:r>
+        <w:rPr>
+          <w:b/>
+          <w:i w:val="0"/>
+          <w:color w:val="1F2937"/>
+          <w:sz w:val="20"/>
+        </w:rPr>
         <w:t>PR #3 — Update .gitignore</w:t>
       </w:r>
     </w:p>
@@ -393,6 +424,860 @@
         </w:rPr>
         <w:t>Merge Event Details</w:t>
       </w:r>
+    </w:p>
+    <w:p>
+      <w:pPr>
+        <w:spacing w:before="280" w:after="80"/>
+      </w:pPr>
+      <w:r>
+        <w:rPr>
+          <w:b/>
+          <w:color w:val="6B7280"/>
+          <w:sz w:val="26"/>
+        </w:rPr>
+        <w:t xml:space="preserve">PR #4 — </w:t>
+      </w:r>
+      <w:r>
+        <w:rPr>
+          <w:b/>
+          <w:color w:val="1F2937"/>
+          <w:sz w:val="26"/>
+        </w:rPr>
+        <w:t>Update .gitignore</w:t>
+      </w:r>
+    </w:p>
+    <w:p>
+      <w:pPr>
+        <w:spacing w:before="80" w:after="200"/>
+        <w:ind w:left="432"/>
+        <w:pBdr>
+          <w:left w:val="single" w:sz="12" w:space="10" w:color="10B981"/>
+        </w:pBdr>
+      </w:pPr>
+      <w:r>
+        <w:rPr>
+          <w:i/>
+          <w:color w:val="1F2937"/>
+          <w:sz w:val="21"/>
+        </w:rPr>
+        <w:t>💡 No description</w:t>
+      </w:r>
+    </w:p>
+    <w:tbl>
+      <w:tblPr>
+        <w:tblStyle w:val="TableGrid"/>
+        <w:tblW w:type="auto" w:w="0"/>
+        <w:tblLook w:firstColumn="1" w:firstRow="1" w:lastColumn="0" w:lastRow="0" w:noHBand="0" w:noVBand="1" w:val="04A0"/>
+      </w:tblPr>
+      <w:tblGrid>
+        <w:gridCol w:w="4680"/>
+        <w:gridCol w:w="4680"/>
+      </w:tblGrid>
+      <w:tr>
+        <w:tc>
+          <w:tcPr>
+            <w:tcW w:type="dxa" w:w="2592"/>
+            <w:shd w:val="clear" w:color="auto" w:fill="F9FAFB"/>
+            <w:tcBorders>
+              <w:top w:val="single" w:sz="4" w:space="0" w:color="CCCCCC"/>
+              <w:left w:val="single" w:sz="4" w:space="0" w:color="CCCCCC"/>
+              <w:bottom w:val="single" w:sz="4" w:space="0" w:color="CCCCCC"/>
+              <w:right w:val="single" w:sz="4" w:space="0" w:color="CCCCCC"/>
+            </w:tcBorders>
+          </w:tcPr>
+          <w:p>
+            <w:r>
+              <w:rPr>
+                <w:b/>
+                <w:color w:val="1F2937"/>
+                <w:sz w:val="20"/>
+              </w:rPr>
+              <w:t>PR Author</w:t>
+            </w:r>
+          </w:p>
+        </w:tc>
+        <w:tc>
+          <w:tcPr>
+            <w:tcW w:type="dxa" w:w="8208"/>
+            <w:tcBorders>
+              <w:top w:val="single" w:sz="4" w:space="0" w:color="CCCCCC"/>
+              <w:left w:val="single" w:sz="4" w:space="0" w:color="CCCCCC"/>
+              <w:bottom w:val="single" w:sz="4" w:space="0" w:color="CCCCCC"/>
+              <w:right w:val="single" w:sz="4" w:space="0" w:color="CCCCCC"/>
+            </w:tcBorders>
+          </w:tcPr>
+          <w:p>
+            <w:r>
+              <w:rPr>
+                <w:sz w:val="20"/>
+              </w:rPr>
+              <w:t>likiita</w:t>
+            </w:r>
+          </w:p>
+        </w:tc>
+      </w:tr>
+      <w:tr>
+        <w:tc>
+          <w:tcPr>
+            <w:tcW w:type="dxa" w:w="2592"/>
+            <w:shd w:val="clear" w:color="auto" w:fill="F9FAFB"/>
+            <w:tcBorders>
+              <w:top w:val="single" w:sz="4" w:space="0" w:color="CCCCCC"/>
+              <w:left w:val="single" w:sz="4" w:space="0" w:color="CCCCCC"/>
+              <w:bottom w:val="single" w:sz="4" w:space="0" w:color="CCCCCC"/>
+              <w:right w:val="single" w:sz="4" w:space="0" w:color="CCCCCC"/>
+            </w:tcBorders>
+          </w:tcPr>
+          <w:p>
+            <w:r>
+              <w:rPr>
+                <w:b/>
+                <w:color w:val="1F2937"/>
+                <w:sz w:val="20"/>
+              </w:rPr>
+              <w:t>Merged By</w:t>
+            </w:r>
+          </w:p>
+        </w:tc>
+        <w:tc>
+          <w:tcPr>
+            <w:tcW w:type="dxa" w:w="8208"/>
+            <w:tcBorders>
+              <w:top w:val="single" w:sz="4" w:space="0" w:color="CCCCCC"/>
+              <w:left w:val="single" w:sz="4" w:space="0" w:color="CCCCCC"/>
+              <w:bottom w:val="single" w:sz="4" w:space="0" w:color="CCCCCC"/>
+              <w:right w:val="single" w:sz="4" w:space="0" w:color="CCCCCC"/>
+            </w:tcBorders>
+          </w:tcPr>
+          <w:p>
+            <w:r>
+              <w:rPr>
+                <w:sz w:val="20"/>
+              </w:rPr>
+              <w:t>likiita</w:t>
+            </w:r>
+          </w:p>
+        </w:tc>
+      </w:tr>
+      <w:tr>
+        <w:tc>
+          <w:tcPr>
+            <w:tcW w:type="dxa" w:w="2592"/>
+            <w:shd w:val="clear" w:color="auto" w:fill="F9FAFB"/>
+            <w:tcBorders>
+              <w:top w:val="single" w:sz="4" w:space="0" w:color="CCCCCC"/>
+              <w:left w:val="single" w:sz="4" w:space="0" w:color="CCCCCC"/>
+              <w:bottom w:val="single" w:sz="4" w:space="0" w:color="CCCCCC"/>
+              <w:right w:val="single" w:sz="4" w:space="0" w:color="CCCCCC"/>
+            </w:tcBorders>
+          </w:tcPr>
+          <w:p>
+            <w:r>
+              <w:rPr>
+                <w:b/>
+                <w:color w:val="1F2937"/>
+                <w:sz w:val="20"/>
+              </w:rPr>
+              <w:t>Merged At</w:t>
+            </w:r>
+          </w:p>
+        </w:tc>
+        <w:tc>
+          <w:tcPr>
+            <w:tcW w:type="dxa" w:w="8208"/>
+            <w:tcBorders>
+              <w:top w:val="single" w:sz="4" w:space="0" w:color="CCCCCC"/>
+              <w:left w:val="single" w:sz="4" w:space="0" w:color="CCCCCC"/>
+              <w:bottom w:val="single" w:sz="4" w:space="0" w:color="CCCCCC"/>
+              <w:right w:val="single" w:sz="4" w:space="0" w:color="CCCCCC"/>
+            </w:tcBorders>
+          </w:tcPr>
+          <w:p>
+            <w:r>
+              <w:rPr>
+                <w:sz w:val="20"/>
+              </w:rPr>
+              <w:t>2026-03-03 11:21:44</w:t>
+            </w:r>
+          </w:p>
+        </w:tc>
+      </w:tr>
+      <w:tr>
+        <w:tc>
+          <w:tcPr>
+            <w:tcW w:type="dxa" w:w="2592"/>
+            <w:shd w:val="clear" w:color="auto" w:fill="F9FAFB"/>
+            <w:tcBorders>
+              <w:top w:val="single" w:sz="4" w:space="0" w:color="CCCCCC"/>
+              <w:left w:val="single" w:sz="4" w:space="0" w:color="CCCCCC"/>
+              <w:bottom w:val="single" w:sz="4" w:space="0" w:color="CCCCCC"/>
+              <w:right w:val="single" w:sz="4" w:space="0" w:color="CCCCCC"/>
+            </w:tcBorders>
+          </w:tcPr>
+          <w:p>
+            <w:r>
+              <w:rPr>
+                <w:b/>
+                <w:color w:val="1F2937"/>
+                <w:sz w:val="20"/>
+              </w:rPr>
+              <w:t>Merge Commit</w:t>
+            </w:r>
+          </w:p>
+        </w:tc>
+        <w:tc>
+          <w:tcPr>
+            <w:tcW w:type="dxa" w:w="8208"/>
+            <w:tcBorders>
+              <w:top w:val="single" w:sz="4" w:space="0" w:color="CCCCCC"/>
+              <w:left w:val="single" w:sz="4" w:space="0" w:color="CCCCCC"/>
+              <w:bottom w:val="single" w:sz="4" w:space="0" w:color="CCCCCC"/>
+              <w:right w:val="single" w:sz="4" w:space="0" w:color="CCCCCC"/>
+            </w:tcBorders>
+          </w:tcPr>
+          <w:p>
+            <w:r>
+              <w:rPr>
+                <w:sz w:val="20"/>
+              </w:rPr>
+              <w:t>71f19dca2b81...</w:t>
+            </w:r>
+          </w:p>
+        </w:tc>
+      </w:tr>
+      <w:tr>
+        <w:tc>
+          <w:tcPr>
+            <w:tcW w:type="dxa" w:w="2592"/>
+            <w:shd w:val="clear" w:color="auto" w:fill="F9FAFB"/>
+            <w:tcBorders>
+              <w:top w:val="single" w:sz="4" w:space="0" w:color="CCCCCC"/>
+              <w:left w:val="single" w:sz="4" w:space="0" w:color="CCCCCC"/>
+              <w:bottom w:val="single" w:sz="4" w:space="0" w:color="CCCCCC"/>
+              <w:right w:val="single" w:sz="4" w:space="0" w:color="CCCCCC"/>
+            </w:tcBorders>
+          </w:tcPr>
+          <w:p>
+            <w:r>
+              <w:rPr>
+                <w:b/>
+                <w:color w:val="1F2937"/>
+                <w:sz w:val="20"/>
+              </w:rPr>
+              <w:t>Branch</w:t>
+            </w:r>
+          </w:p>
+        </w:tc>
+        <w:tc>
+          <w:tcPr>
+            <w:tcW w:type="dxa" w:w="8208"/>
+            <w:tcBorders>
+              <w:top w:val="single" w:sz="4" w:space="0" w:color="CCCCCC"/>
+              <w:left w:val="single" w:sz="4" w:space="0" w:color="CCCCCC"/>
+              <w:bottom w:val="single" w:sz="4" w:space="0" w:color="CCCCCC"/>
+              <w:right w:val="single" w:sz="4" w:space="0" w:color="CCCCCC"/>
+            </w:tcBorders>
+          </w:tcPr>
+          <w:p>
+            <w:r>
+              <w:rPr>
+                <w:sz w:val="20"/>
+              </w:rPr>
+              <w:t>bot_test → master</w:t>
+            </w:r>
+          </w:p>
+        </w:tc>
+      </w:tr>
+      <w:tr>
+        <w:tc>
+          <w:tcPr>
+            <w:tcW w:type="dxa" w:w="2592"/>
+            <w:shd w:val="clear" w:color="auto" w:fill="F9FAFB"/>
+            <w:tcBorders>
+              <w:top w:val="single" w:sz="4" w:space="0" w:color="CCCCCC"/>
+              <w:left w:val="single" w:sz="4" w:space="0" w:color="CCCCCC"/>
+              <w:bottom w:val="single" w:sz="4" w:space="0" w:color="CCCCCC"/>
+              <w:right w:val="single" w:sz="4" w:space="0" w:color="CCCCCC"/>
+            </w:tcBorders>
+          </w:tcPr>
+          <w:p>
+            <w:r>
+              <w:rPr>
+                <w:b/>
+                <w:color w:val="1F2937"/>
+                <w:sz w:val="20"/>
+              </w:rPr>
+              <w:t>Labels</w:t>
+            </w:r>
+          </w:p>
+        </w:tc>
+        <w:tc>
+          <w:tcPr>
+            <w:tcW w:type="dxa" w:w="8208"/>
+            <w:tcBorders>
+              <w:top w:val="single" w:sz="4" w:space="0" w:color="CCCCCC"/>
+              <w:left w:val="single" w:sz="4" w:space="0" w:color="CCCCCC"/>
+              <w:bottom w:val="single" w:sz="4" w:space="0" w:color="CCCCCC"/>
+              <w:right w:val="single" w:sz="4" w:space="0" w:color="CCCCCC"/>
+            </w:tcBorders>
+          </w:tcPr>
+          <w:p>
+            <w:r>
+              <w:rPr>
+                <w:sz w:val="20"/>
+              </w:rPr>
+              <w:t>None</w:t>
+            </w:r>
+          </w:p>
+        </w:tc>
+      </w:tr>
+      <w:tr>
+        <w:tc>
+          <w:tcPr>
+            <w:tcW w:type="dxa" w:w="2592"/>
+            <w:shd w:val="clear" w:color="auto" w:fill="F9FAFB"/>
+            <w:tcBorders>
+              <w:top w:val="single" w:sz="4" w:space="0" w:color="CCCCCC"/>
+              <w:left w:val="single" w:sz="4" w:space="0" w:color="CCCCCC"/>
+              <w:bottom w:val="single" w:sz="4" w:space="0" w:color="CCCCCC"/>
+              <w:right w:val="single" w:sz="4" w:space="0" w:color="CCCCCC"/>
+            </w:tcBorders>
+          </w:tcPr>
+          <w:p>
+            <w:r>
+              <w:rPr>
+                <w:b/>
+                <w:color w:val="1F2937"/>
+                <w:sz w:val="20"/>
+              </w:rPr>
+              <w:t>Code Delta</w:t>
+            </w:r>
+          </w:p>
+        </w:tc>
+        <w:tc>
+          <w:tcPr>
+            <w:tcW w:type="dxa" w:w="8208"/>
+            <w:tcBorders>
+              <w:top w:val="single" w:sz="4" w:space="0" w:color="CCCCCC"/>
+              <w:left w:val="single" w:sz="4" w:space="0" w:color="CCCCCC"/>
+              <w:bottom w:val="single" w:sz="4" w:space="0" w:color="CCCCCC"/>
+              <w:right w:val="single" w:sz="4" w:space="0" w:color="CCCCCC"/>
+            </w:tcBorders>
+          </w:tcPr>
+          <w:p>
+            <w:r>
+              <w:rPr>
+                <w:sz w:val="20"/>
+              </w:rPr>
+              <w:t>+1 / -1 lines</w:t>
+            </w:r>
+          </w:p>
+        </w:tc>
+      </w:tr>
+      <w:tr>
+        <w:tc>
+          <w:tcPr>
+            <w:tcW w:type="dxa" w:w="2592"/>
+            <w:shd w:val="clear" w:color="auto" w:fill="F9FAFB"/>
+            <w:tcBorders>
+              <w:top w:val="single" w:sz="4" w:space="0" w:color="CCCCCC"/>
+              <w:left w:val="single" w:sz="4" w:space="0" w:color="CCCCCC"/>
+              <w:bottom w:val="single" w:sz="4" w:space="0" w:color="CCCCCC"/>
+              <w:right w:val="single" w:sz="4" w:space="0" w:color="CCCCCC"/>
+            </w:tcBorders>
+          </w:tcPr>
+          <w:p>
+            <w:r>
+              <w:rPr>
+                <w:b/>
+                <w:color w:val="1F2937"/>
+                <w:sz w:val="20"/>
+              </w:rPr>
+              <w:t>Commits</w:t>
+            </w:r>
+          </w:p>
+        </w:tc>
+        <w:tc>
+          <w:tcPr>
+            <w:tcW w:type="dxa" w:w="8208"/>
+            <w:tcBorders>
+              <w:top w:val="single" w:sz="4" w:space="0" w:color="CCCCCC"/>
+              <w:left w:val="single" w:sz="4" w:space="0" w:color="CCCCCC"/>
+              <w:bottom w:val="single" w:sz="4" w:space="0" w:color="CCCCCC"/>
+              <w:right w:val="single" w:sz="4" w:space="0" w:color="CCCCCC"/>
+            </w:tcBorders>
+          </w:tcPr>
+          <w:p>
+            <w:r>
+              <w:rPr>
+                <w:sz w:val="20"/>
+              </w:rPr>
+              <w:t>1</w:t>
+            </w:r>
+          </w:p>
+        </w:tc>
+      </w:tr>
+      <w:tr>
+        <w:tc>
+          <w:tcPr>
+            <w:tcW w:type="dxa" w:w="2592"/>
+            <w:shd w:val="clear" w:color="auto" w:fill="F9FAFB"/>
+            <w:tcBorders>
+              <w:top w:val="single" w:sz="4" w:space="0" w:color="CCCCCC"/>
+              <w:left w:val="single" w:sz="4" w:space="0" w:color="CCCCCC"/>
+              <w:bottom w:val="single" w:sz="4" w:space="0" w:color="CCCCCC"/>
+              <w:right w:val="single" w:sz="4" w:space="0" w:color="CCCCCC"/>
+            </w:tcBorders>
+          </w:tcPr>
+          <w:p>
+            <w:r>
+              <w:rPr>
+                <w:b/>
+                <w:color w:val="1F2937"/>
+                <w:sz w:val="20"/>
+              </w:rPr>
+              <w:t>Files Changed</w:t>
+            </w:r>
+          </w:p>
+        </w:tc>
+        <w:tc>
+          <w:tcPr>
+            <w:tcW w:type="dxa" w:w="8208"/>
+            <w:tcBorders>
+              <w:top w:val="single" w:sz="4" w:space="0" w:color="CCCCCC"/>
+              <w:left w:val="single" w:sz="4" w:space="0" w:color="CCCCCC"/>
+              <w:bottom w:val="single" w:sz="4" w:space="0" w:color="CCCCCC"/>
+              <w:right w:val="single" w:sz="4" w:space="0" w:color="CCCCCC"/>
+            </w:tcBorders>
+          </w:tcPr>
+          <w:p>
+            <w:r>
+              <w:rPr>
+                <w:sz w:val="20"/>
+              </w:rPr>
+              <w:t>1</w:t>
+            </w:r>
+          </w:p>
+        </w:tc>
+      </w:tr>
+      <w:tr>
+        <w:tc>
+          <w:tcPr>
+            <w:tcW w:type="dxa" w:w="2592"/>
+            <w:shd w:val="clear" w:color="auto" w:fill="F9FAFB"/>
+            <w:tcBorders>
+              <w:top w:val="single" w:sz="4" w:space="0" w:color="CCCCCC"/>
+              <w:left w:val="single" w:sz="4" w:space="0" w:color="CCCCCC"/>
+              <w:bottom w:val="single" w:sz="4" w:space="0" w:color="CCCCCC"/>
+              <w:right w:val="single" w:sz="4" w:space="0" w:color="CCCCCC"/>
+            </w:tcBorders>
+          </w:tcPr>
+          <w:p>
+            <w:r>
+              <w:rPr>
+                <w:b/>
+                <w:color w:val="1F2937"/>
+                <w:sz w:val="20"/>
+              </w:rPr>
+              <w:t>Approvals</w:t>
+            </w:r>
+          </w:p>
+        </w:tc>
+        <w:tc>
+          <w:tcPr>
+            <w:tcW w:type="dxa" w:w="8208"/>
+            <w:tcBorders>
+              <w:top w:val="single" w:sz="4" w:space="0" w:color="CCCCCC"/>
+              <w:left w:val="single" w:sz="4" w:space="0" w:color="CCCCCC"/>
+              <w:bottom w:val="single" w:sz="4" w:space="0" w:color="CCCCCC"/>
+              <w:right w:val="single" w:sz="4" w:space="0" w:color="CCCCCC"/>
+            </w:tcBorders>
+          </w:tcPr>
+          <w:p>
+            <w:r>
+              <w:rPr>
+                <w:sz w:val="20"/>
+              </w:rPr>
+              <w:t>None</w:t>
+            </w:r>
+          </w:p>
+        </w:tc>
+      </w:tr>
+      <w:tr>
+        <w:tc>
+          <w:tcPr>
+            <w:tcW w:type="dxa" w:w="2592"/>
+            <w:shd w:val="clear" w:color="auto" w:fill="F9FAFB"/>
+            <w:tcBorders>
+              <w:top w:val="single" w:sz="4" w:space="0" w:color="CCCCCC"/>
+              <w:left w:val="single" w:sz="4" w:space="0" w:color="CCCCCC"/>
+              <w:bottom w:val="single" w:sz="4" w:space="0" w:color="CCCCCC"/>
+              <w:right w:val="single" w:sz="4" w:space="0" w:color="CCCCCC"/>
+            </w:tcBorders>
+          </w:tcPr>
+          <w:p>
+            <w:r>
+              <w:rPr>
+                <w:b/>
+                <w:color w:val="1F2937"/>
+                <w:sz w:val="20"/>
+              </w:rPr>
+              <w:t>Changes Requested</w:t>
+            </w:r>
+          </w:p>
+        </w:tc>
+        <w:tc>
+          <w:tcPr>
+            <w:tcW w:type="dxa" w:w="8208"/>
+            <w:tcBorders>
+              <w:top w:val="single" w:sz="4" w:space="0" w:color="CCCCCC"/>
+              <w:left w:val="single" w:sz="4" w:space="0" w:color="CCCCCC"/>
+              <w:bottom w:val="single" w:sz="4" w:space="0" w:color="CCCCCC"/>
+              <w:right w:val="single" w:sz="4" w:space="0" w:color="CCCCCC"/>
+            </w:tcBorders>
+          </w:tcPr>
+          <w:p>
+            <w:r>
+              <w:rPr>
+                <w:sz w:val="20"/>
+              </w:rPr>
+              <w:t>None</w:t>
+            </w:r>
+          </w:p>
+        </w:tc>
+      </w:tr>
+      <w:tr>
+        <w:tc>
+          <w:tcPr>
+            <w:tcW w:type="dxa" w:w="2592"/>
+            <w:shd w:val="clear" w:color="auto" w:fill="F9FAFB"/>
+            <w:tcBorders>
+              <w:top w:val="single" w:sz="4" w:space="0" w:color="CCCCCC"/>
+              <w:left w:val="single" w:sz="4" w:space="0" w:color="CCCCCC"/>
+              <w:bottom w:val="single" w:sz="4" w:space="0" w:color="CCCCCC"/>
+              <w:right w:val="single" w:sz="4" w:space="0" w:color="CCCCCC"/>
+            </w:tcBorders>
+          </w:tcPr>
+          <w:p>
+            <w:r>
+              <w:rPr>
+                <w:b/>
+                <w:color w:val="1F2937"/>
+                <w:sz w:val="20"/>
+              </w:rPr>
+              <w:t>Comments</w:t>
+            </w:r>
+          </w:p>
+        </w:tc>
+        <w:tc>
+          <w:tcPr>
+            <w:tcW w:type="dxa" w:w="8208"/>
+            <w:tcBorders>
+              <w:top w:val="single" w:sz="4" w:space="0" w:color="CCCCCC"/>
+              <w:left w:val="single" w:sz="4" w:space="0" w:color="CCCCCC"/>
+              <w:bottom w:val="single" w:sz="4" w:space="0" w:color="CCCCCC"/>
+              <w:right w:val="single" w:sz="4" w:space="0" w:color="CCCCCC"/>
+            </w:tcBorders>
+          </w:tcPr>
+          <w:p>
+            <w:r>
+              <w:rPr>
+                <w:sz w:val="20"/>
+              </w:rPr>
+              <w:t>0 general  |  0 review</w:t>
+            </w:r>
+          </w:p>
+        </w:tc>
+      </w:tr>
+      <w:tr>
+        <w:tc>
+          <w:tcPr>
+            <w:tcW w:type="dxa" w:w="2592"/>
+            <w:shd w:val="clear" w:color="auto" w:fill="F9FAFB"/>
+            <w:tcBorders>
+              <w:top w:val="single" w:sz="4" w:space="0" w:color="CCCCCC"/>
+              <w:left w:val="single" w:sz="4" w:space="0" w:color="CCCCCC"/>
+              <w:bottom w:val="single" w:sz="4" w:space="0" w:color="CCCCCC"/>
+              <w:right w:val="single" w:sz="4" w:space="0" w:color="CCCCCC"/>
+            </w:tcBorders>
+          </w:tcPr>
+          <w:p>
+            <w:r>
+              <w:rPr>
+                <w:b/>
+                <w:color w:val="1F2937"/>
+                <w:sz w:val="20"/>
+              </w:rPr>
+              <w:t>Linked Issues</w:t>
+            </w:r>
+          </w:p>
+        </w:tc>
+        <w:tc>
+          <w:tcPr>
+            <w:tcW w:type="dxa" w:w="8208"/>
+            <w:tcBorders>
+              <w:top w:val="single" w:sz="4" w:space="0" w:color="CCCCCC"/>
+              <w:left w:val="single" w:sz="4" w:space="0" w:color="CCCCCC"/>
+              <w:bottom w:val="single" w:sz="4" w:space="0" w:color="CCCCCC"/>
+              <w:right w:val="single" w:sz="4" w:space="0" w:color="CCCCCC"/>
+            </w:tcBorders>
+          </w:tcPr>
+          <w:p>
+            <w:r>
+              <w:rPr>
+                <w:sz w:val="20"/>
+              </w:rPr>
+              <w:t>0</w:t>
+            </w:r>
+          </w:p>
+        </w:tc>
+      </w:tr>
+      <w:tr>
+        <w:tc>
+          <w:tcPr>
+            <w:tcW w:type="dxa" w:w="2592"/>
+            <w:shd w:val="clear" w:color="auto" w:fill="F9FAFB"/>
+            <w:tcBorders>
+              <w:top w:val="single" w:sz="4" w:space="0" w:color="CCCCCC"/>
+              <w:left w:val="single" w:sz="4" w:space="0" w:color="CCCCCC"/>
+              <w:bottom w:val="single" w:sz="4" w:space="0" w:color="CCCCCC"/>
+              <w:right w:val="single" w:sz="4" w:space="0" w:color="CCCCCC"/>
+            </w:tcBorders>
+          </w:tcPr>
+          <w:p>
+            <w:r>
+              <w:rPr>
+                <w:b/>
+                <w:color w:val="1F2937"/>
+                <w:sz w:val="20"/>
+              </w:rPr>
+              <w:t>PR URL</w:t>
+            </w:r>
+          </w:p>
+        </w:tc>
+        <w:tc>
+          <w:tcPr>
+            <w:tcW w:type="dxa" w:w="8208"/>
+            <w:tcBorders>
+              <w:top w:val="single" w:sz="4" w:space="0" w:color="CCCCCC"/>
+              <w:left w:val="single" w:sz="4" w:space="0" w:color="CCCCCC"/>
+              <w:bottom w:val="single" w:sz="4" w:space="0" w:color="CCCCCC"/>
+              <w:right w:val="single" w:sz="4" w:space="0" w:color="CCCCCC"/>
+            </w:tcBorders>
+          </w:tcPr>
+          <w:p>
+            <w:r>
+              <w:rPr>
+                <w:sz w:val="20"/>
+              </w:rPr>
+              <w:t>https://github.com/Janiyamt/PR-AGENT/pull/4</w:t>
+            </w:r>
+          </w:p>
+        </w:tc>
+      </w:tr>
+    </w:tbl>
+    <w:p>
+      <w:pPr>
+        <w:spacing w:before="160" w:after="40"/>
+      </w:pPr>
+      <w:r>
+        <w:rPr>
+          <w:b/>
+          <w:i w:val="0"/>
+          <w:color w:val="1F2937"/>
+          <w:sz w:val="20"/>
+        </w:rPr>
+        <w:t>Commit Messages:</w:t>
+      </w:r>
+    </w:p>
+    <w:p>
+      <w:pPr>
+        <w:spacing w:before="0" w:after="40"/>
+      </w:pPr>
+      <w:r>
+        <w:rPr>
+          <w:b w:val="0"/>
+          <w:i w:val="0"/>
+          <w:color w:val="6B7280"/>
+          <w:sz w:val="18"/>
+        </w:rPr>
+        <w:t xml:space="preserve">  • Update .gitignore</w:t>
+      </w:r>
+    </w:p>
+    <w:p>
+      <w:pPr>
+        <w:spacing w:before="160" w:after="40"/>
+      </w:pPr>
+      <w:r>
+        <w:rPr>
+          <w:b/>
+          <w:i w:val="0"/>
+          <w:color w:val="1F2937"/>
+          <w:sz w:val="20"/>
+        </w:rPr>
+        <w:t>Before → After:</w:t>
+      </w:r>
+    </w:p>
+    <w:p>
+      <w:pPr>
+        <w:spacing w:before="80" w:after="200"/>
+        <w:ind w:left="432"/>
+        <w:pBdr>
+          <w:left w:val="single" w:sz="12" w:space="10" w:color="3B82F6"/>
+        </w:pBdr>
+      </w:pPr>
+      <w:r>
+        <w:rPr>
+          <w:i/>
+          <w:color w:val="1F2937"/>
+          <w:sz w:val="21"/>
+        </w:rPr>
+        <w:t>AI analysis unavailable — check OCI credentials in GitHub Secrets.</w:t>
+      </w:r>
+    </w:p>
+    <w:p>
+      <w:pPr>
+        <w:spacing w:before="120" w:after="40"/>
+      </w:pPr>
+      <w:r>
+        <w:rPr>
+          <w:b/>
+          <w:i w:val="0"/>
+          <w:color w:val="1F2937"/>
+          <w:sz w:val="20"/>
+        </w:rPr>
+        <w:t>Key Impacts:</w:t>
+      </w:r>
+    </w:p>
+    <w:p>
+      <w:pPr>
+        <w:spacing w:before="0" w:after="40"/>
+      </w:pPr>
+      <w:r>
+        <w:rPr>
+          <w:b w:val="0"/>
+          <w:i w:val="0"/>
+          <w:color w:val="6B7280"/>
+          <w:sz w:val="18"/>
+        </w:rPr>
+        <w:t xml:space="preserve">  • Changed 1 file(s)</w:t>
+      </w:r>
+    </w:p>
+    <w:p>
+      <w:pPr>
+        <w:spacing w:before="120" w:after="40"/>
+      </w:pPr>
+      <w:r>
+        <w:rPr>
+          <w:b/>
+          <w:i w:val="0"/>
+          <w:color w:val="1F2937"/>
+          <w:sz w:val="20"/>
+        </w:rPr>
+        <w:t>Review Notes:</w:t>
+      </w:r>
+    </w:p>
+    <w:p>
+      <w:pPr>
+        <w:spacing w:before="0" w:after="80"/>
+      </w:pPr>
+      <w:r>
+        <w:rPr>
+          <w:b w:val="0"/>
+          <w:i w:val="0"/>
+          <w:color w:val="6B7280"/>
+          <w:sz w:val="18"/>
+        </w:rPr>
+        <w:t>Approved by: No approvals recorded.</w:t>
+      </w:r>
+    </w:p>
+    <w:p>
+      <w:pPr>
+        <w:spacing w:before="120" w:after="40"/>
+      </w:pPr>
+      <w:r>
+        <w:rPr>
+          <w:b/>
+          <w:i w:val="0"/>
+          <w:color w:val="1F2937"/>
+          <w:sz w:val="20"/>
+        </w:rPr>
+        <w:t>Files Changed:</w:t>
+      </w:r>
+    </w:p>
+    <w:p>
+      <w:pPr>
+        <w:spacing w:before="0" w:after="20"/>
+      </w:pPr>
+      <w:r>
+        <w:rPr>
+          <w:b w:val="0"/>
+          <w:i w:val="0"/>
+          <w:color w:val="6B7280"/>
+          <w:sz w:val="16"/>
+        </w:rPr>
+        <w:t xml:space="preserve">  .gitignore</w:t>
+      </w:r>
+    </w:p>
+    <w:p>
+      <w:pPr>
+        <w:spacing w:before="120" w:after="40"/>
+      </w:pPr>
+      <w:r>
+        <w:rPr>
+          <w:b/>
+          <w:i w:val="0"/>
+          <w:color w:val="1F2937"/>
+          <w:sz w:val="20"/>
+        </w:rPr>
+        <w:t>Code Diffs (sample):</w:t>
+      </w:r>
+    </w:p>
+    <w:p>
+      <w:pPr>
+        <w:spacing w:before="80" w:after="40"/>
+      </w:pPr>
+      <w:r>
+        <w:rPr>
+          <w:b/>
+          <w:i w:val="0"/>
+          <w:color w:val="1E3A5F"/>
+          <w:sz w:val="18"/>
+        </w:rPr>
+        <w:t>MODIFIED: .gitignore  (+1 / -1)</w:t>
+      </w:r>
+    </w:p>
+    <w:p>
+      <w:pPr>
+        <w:spacing w:before="0" w:after="80"/>
+      </w:pPr>
+      <w:r>
+        <w:rPr>
+          <w:b w:val="0"/>
+          <w:i w:val="0"/>
+          <w:color w:val="6B7280"/>
+          <w:sz w:val="16"/>
+        </w:rPr>
+        <w:t>@@ -4,4 +4,4 @@ pr_report.docx</w:t>
+        <w:br/>
+        <w:t xml:space="preserve"> venv/</w:t>
+        <w:br/>
+        <w:t xml:space="preserve"> .venv/</w:t>
+        <w:br/>
+        <w:t xml:space="preserve"> config.py</w:t>
+        <w:br/>
+        <w:t>-#tHIS IS THE SECOND COMMENT MADE TO EXPLAIN AND UNDERSTAND THE BOT AS THE 1ST ONE FAILED</w:t>
+        <w:br/>
+        <w:t>+# this is the last comment to check the bot with all oci services</w:t>
+      </w:r>
+    </w:p>
+    <w:p>
+      <w:pPr>
+        <w:spacing w:before="80" w:after="80"/>
+        <w:pBdr>
+          <w:bottom w:val="single" w:sz="4" w:space="1" w:color="E5E7EB"/>
+        </w:pBdr>
+      </w:pPr>
     </w:p>
     <w:p>
       <w:pPr>
@@ -2236,7 +3121,7 @@
           <w:color w:val="9CA3AF"/>
           <w:sz w:val="18"/>
         </w:rPr>
-        <w:t>Merge Events Report  •  Generated by PR-Agent v2  •  March 03, 2026 at 11:02 UTC</w:t>
+        <w:t>Merge Events Report  •  Generated by PR-Agent v2  •  March 03, 2026 at 11:21 UTC</w:t>
       </w:r>
     </w:p>
     <w:sectPr>

</xml_diff>

<commit_message>
chore: log merge event for 7a4e90bf9ad6b9b7978fb89e1d6a3e4c55ad9661
</commit_message>
<xml_diff>
--- a/merge_agent/logs/merge-events-report.docx
+++ b/merge_agent/logs/merge-events-report.docx
@@ -44,7 +44,7 @@
           <w:color w:val="9CA3AF"/>
           <w:sz w:val="20"/>
         </w:rPr>
-        <w:t>Generated: March 03, 2026 at 11:21 UTC  •  3 merge events on record</w:t>
+        <w:t>Generated: March 04, 2026 at 05:56 UTC  •  4 merge events on record</w:t>
       </w:r>
     </w:p>
     <w:p>
@@ -104,7 +104,7 @@
                 <w:color w:val="1E3A5F"/>
                 <w:sz w:val="36"/>
               </w:rPr>
-              <w:t>3</w:t>
+              <w:t>4</w:t>
             </w:r>
           </w:p>
         </w:tc>
@@ -179,7 +179,7 @@
                 <w:color w:val="D97706"/>
                 <w:sz w:val="36"/>
               </w:rPr>
-              <w:t>+6/4</w:t>
+              <w:t>+7/5</w:t>
             </w:r>
           </w:p>
         </w:tc>
@@ -321,6 +321,37 @@
           <w:color w:val="1F2937"/>
           <w:sz w:val="20"/>
         </w:rPr>
+        <w:t>PR #7 — Update comment in .gitignore for clarity</w:t>
+      </w:r>
+    </w:p>
+    <w:p>
+      <w:pPr>
+        <w:spacing w:before="80" w:after="200"/>
+        <w:ind w:left="432"/>
+        <w:pBdr>
+          <w:left w:val="single" w:sz="12" w:space="10" w:color="3B82F6"/>
+        </w:pBdr>
+      </w:pPr>
+      <w:r>
+        <w:rPr>
+          <w:i/>
+          <w:color w:val="1F2937"/>
+          <w:sz w:val="21"/>
+        </w:rPr>
+        <w:t>No description</w:t>
+      </w:r>
+    </w:p>
+    <w:p>
+      <w:pPr>
+        <w:spacing w:before="0" w:after="40"/>
+      </w:pPr>
+      <w:r>
+        <w:rPr>
+          <w:b/>
+          <w:i w:val="0"/>
+          <w:color w:val="1F2937"/>
+          <w:sz w:val="20"/>
+        </w:rPr>
         <w:t>PR #4 — Update .gitignore</w:t>
       </w:r>
     </w:p>
@@ -424,6 +455,860 @@
         </w:rPr>
         <w:t>Merge Event Details</w:t>
       </w:r>
+    </w:p>
+    <w:p>
+      <w:pPr>
+        <w:spacing w:before="280" w:after="80"/>
+      </w:pPr>
+      <w:r>
+        <w:rPr>
+          <w:b/>
+          <w:color w:val="6B7280"/>
+          <w:sz w:val="26"/>
+        </w:rPr>
+        <w:t xml:space="preserve">PR #7 — </w:t>
+      </w:r>
+      <w:r>
+        <w:rPr>
+          <w:b/>
+          <w:color w:val="1F2937"/>
+          <w:sz w:val="26"/>
+        </w:rPr>
+        <w:t>Update comment in .gitignore for clarity</w:t>
+      </w:r>
+    </w:p>
+    <w:p>
+      <w:pPr>
+        <w:spacing w:before="80" w:after="200"/>
+        <w:ind w:left="432"/>
+        <w:pBdr>
+          <w:left w:val="single" w:sz="12" w:space="10" w:color="10B981"/>
+        </w:pBdr>
+      </w:pPr>
+      <w:r>
+        <w:rPr>
+          <w:i/>
+          <w:color w:val="1F2937"/>
+          <w:sz w:val="21"/>
+        </w:rPr>
+        <w:t>💡 No description</w:t>
+      </w:r>
+    </w:p>
+    <w:tbl>
+      <w:tblPr>
+        <w:tblStyle w:val="TableGrid"/>
+        <w:tblW w:type="auto" w:w="0"/>
+        <w:tblLook w:firstColumn="1" w:firstRow="1" w:lastColumn="0" w:lastRow="0" w:noHBand="0" w:noVBand="1" w:val="04A0"/>
+      </w:tblPr>
+      <w:tblGrid>
+        <w:gridCol w:w="4680"/>
+        <w:gridCol w:w="4680"/>
+      </w:tblGrid>
+      <w:tr>
+        <w:tc>
+          <w:tcPr>
+            <w:tcW w:type="dxa" w:w="2592"/>
+            <w:shd w:val="clear" w:color="auto" w:fill="F9FAFB"/>
+            <w:tcBorders>
+              <w:top w:val="single" w:sz="4" w:space="0" w:color="CCCCCC"/>
+              <w:left w:val="single" w:sz="4" w:space="0" w:color="CCCCCC"/>
+              <w:bottom w:val="single" w:sz="4" w:space="0" w:color="CCCCCC"/>
+              <w:right w:val="single" w:sz="4" w:space="0" w:color="CCCCCC"/>
+            </w:tcBorders>
+          </w:tcPr>
+          <w:p>
+            <w:r>
+              <w:rPr>
+                <w:b/>
+                <w:color w:val="1F2937"/>
+                <w:sz w:val="20"/>
+              </w:rPr>
+              <w:t>PR Author</w:t>
+            </w:r>
+          </w:p>
+        </w:tc>
+        <w:tc>
+          <w:tcPr>
+            <w:tcW w:type="dxa" w:w="8208"/>
+            <w:tcBorders>
+              <w:top w:val="single" w:sz="4" w:space="0" w:color="CCCCCC"/>
+              <w:left w:val="single" w:sz="4" w:space="0" w:color="CCCCCC"/>
+              <w:bottom w:val="single" w:sz="4" w:space="0" w:color="CCCCCC"/>
+              <w:right w:val="single" w:sz="4" w:space="0" w:color="CCCCCC"/>
+            </w:tcBorders>
+          </w:tcPr>
+          <w:p>
+            <w:r>
+              <w:rPr>
+                <w:sz w:val="20"/>
+              </w:rPr>
+              <w:t>likiita</w:t>
+            </w:r>
+          </w:p>
+        </w:tc>
+      </w:tr>
+      <w:tr>
+        <w:tc>
+          <w:tcPr>
+            <w:tcW w:type="dxa" w:w="2592"/>
+            <w:shd w:val="clear" w:color="auto" w:fill="F9FAFB"/>
+            <w:tcBorders>
+              <w:top w:val="single" w:sz="4" w:space="0" w:color="CCCCCC"/>
+              <w:left w:val="single" w:sz="4" w:space="0" w:color="CCCCCC"/>
+              <w:bottom w:val="single" w:sz="4" w:space="0" w:color="CCCCCC"/>
+              <w:right w:val="single" w:sz="4" w:space="0" w:color="CCCCCC"/>
+            </w:tcBorders>
+          </w:tcPr>
+          <w:p>
+            <w:r>
+              <w:rPr>
+                <w:b/>
+                <w:color w:val="1F2937"/>
+                <w:sz w:val="20"/>
+              </w:rPr>
+              <w:t>Merged By</w:t>
+            </w:r>
+          </w:p>
+        </w:tc>
+        <w:tc>
+          <w:tcPr>
+            <w:tcW w:type="dxa" w:w="8208"/>
+            <w:tcBorders>
+              <w:top w:val="single" w:sz="4" w:space="0" w:color="CCCCCC"/>
+              <w:left w:val="single" w:sz="4" w:space="0" w:color="CCCCCC"/>
+              <w:bottom w:val="single" w:sz="4" w:space="0" w:color="CCCCCC"/>
+              <w:right w:val="single" w:sz="4" w:space="0" w:color="CCCCCC"/>
+            </w:tcBorders>
+          </w:tcPr>
+          <w:p>
+            <w:r>
+              <w:rPr>
+                <w:sz w:val="20"/>
+              </w:rPr>
+              <w:t>likiita</w:t>
+            </w:r>
+          </w:p>
+        </w:tc>
+      </w:tr>
+      <w:tr>
+        <w:tc>
+          <w:tcPr>
+            <w:tcW w:type="dxa" w:w="2592"/>
+            <w:shd w:val="clear" w:color="auto" w:fill="F9FAFB"/>
+            <w:tcBorders>
+              <w:top w:val="single" w:sz="4" w:space="0" w:color="CCCCCC"/>
+              <w:left w:val="single" w:sz="4" w:space="0" w:color="CCCCCC"/>
+              <w:bottom w:val="single" w:sz="4" w:space="0" w:color="CCCCCC"/>
+              <w:right w:val="single" w:sz="4" w:space="0" w:color="CCCCCC"/>
+            </w:tcBorders>
+          </w:tcPr>
+          <w:p>
+            <w:r>
+              <w:rPr>
+                <w:b/>
+                <w:color w:val="1F2937"/>
+                <w:sz w:val="20"/>
+              </w:rPr>
+              <w:t>Merged At</w:t>
+            </w:r>
+          </w:p>
+        </w:tc>
+        <w:tc>
+          <w:tcPr>
+            <w:tcW w:type="dxa" w:w="8208"/>
+            <w:tcBorders>
+              <w:top w:val="single" w:sz="4" w:space="0" w:color="CCCCCC"/>
+              <w:left w:val="single" w:sz="4" w:space="0" w:color="CCCCCC"/>
+              <w:bottom w:val="single" w:sz="4" w:space="0" w:color="CCCCCC"/>
+              <w:right w:val="single" w:sz="4" w:space="0" w:color="CCCCCC"/>
+            </w:tcBorders>
+          </w:tcPr>
+          <w:p>
+            <w:r>
+              <w:rPr>
+                <w:sz w:val="20"/>
+              </w:rPr>
+              <w:t>2026-03-04 05:56:05</w:t>
+            </w:r>
+          </w:p>
+        </w:tc>
+      </w:tr>
+      <w:tr>
+        <w:tc>
+          <w:tcPr>
+            <w:tcW w:type="dxa" w:w="2592"/>
+            <w:shd w:val="clear" w:color="auto" w:fill="F9FAFB"/>
+            <w:tcBorders>
+              <w:top w:val="single" w:sz="4" w:space="0" w:color="CCCCCC"/>
+              <w:left w:val="single" w:sz="4" w:space="0" w:color="CCCCCC"/>
+              <w:bottom w:val="single" w:sz="4" w:space="0" w:color="CCCCCC"/>
+              <w:right w:val="single" w:sz="4" w:space="0" w:color="CCCCCC"/>
+            </w:tcBorders>
+          </w:tcPr>
+          <w:p>
+            <w:r>
+              <w:rPr>
+                <w:b/>
+                <w:color w:val="1F2937"/>
+                <w:sz w:val="20"/>
+              </w:rPr>
+              <w:t>Merge Commit</w:t>
+            </w:r>
+          </w:p>
+        </w:tc>
+        <w:tc>
+          <w:tcPr>
+            <w:tcW w:type="dxa" w:w="8208"/>
+            <w:tcBorders>
+              <w:top w:val="single" w:sz="4" w:space="0" w:color="CCCCCC"/>
+              <w:left w:val="single" w:sz="4" w:space="0" w:color="CCCCCC"/>
+              <w:bottom w:val="single" w:sz="4" w:space="0" w:color="CCCCCC"/>
+              <w:right w:val="single" w:sz="4" w:space="0" w:color="CCCCCC"/>
+            </w:tcBorders>
+          </w:tcPr>
+          <w:p>
+            <w:r>
+              <w:rPr>
+                <w:sz w:val="20"/>
+              </w:rPr>
+              <w:t>7a4e90bf9ad6...</w:t>
+            </w:r>
+          </w:p>
+        </w:tc>
+      </w:tr>
+      <w:tr>
+        <w:tc>
+          <w:tcPr>
+            <w:tcW w:type="dxa" w:w="2592"/>
+            <w:shd w:val="clear" w:color="auto" w:fill="F9FAFB"/>
+            <w:tcBorders>
+              <w:top w:val="single" w:sz="4" w:space="0" w:color="CCCCCC"/>
+              <w:left w:val="single" w:sz="4" w:space="0" w:color="CCCCCC"/>
+              <w:bottom w:val="single" w:sz="4" w:space="0" w:color="CCCCCC"/>
+              <w:right w:val="single" w:sz="4" w:space="0" w:color="CCCCCC"/>
+            </w:tcBorders>
+          </w:tcPr>
+          <w:p>
+            <w:r>
+              <w:rPr>
+                <w:b/>
+                <w:color w:val="1F2937"/>
+                <w:sz w:val="20"/>
+              </w:rPr>
+              <w:t>Branch</w:t>
+            </w:r>
+          </w:p>
+        </w:tc>
+        <w:tc>
+          <w:tcPr>
+            <w:tcW w:type="dxa" w:w="8208"/>
+            <w:tcBorders>
+              <w:top w:val="single" w:sz="4" w:space="0" w:color="CCCCCC"/>
+              <w:left w:val="single" w:sz="4" w:space="0" w:color="CCCCCC"/>
+              <w:bottom w:val="single" w:sz="4" w:space="0" w:color="CCCCCC"/>
+              <w:right w:val="single" w:sz="4" w:space="0" w:color="CCCCCC"/>
+            </w:tcBorders>
+          </w:tcPr>
+          <w:p>
+            <w:r>
+              <w:rPr>
+                <w:sz w:val="20"/>
+              </w:rPr>
+              <w:t>bot_test → master</w:t>
+            </w:r>
+          </w:p>
+        </w:tc>
+      </w:tr>
+      <w:tr>
+        <w:tc>
+          <w:tcPr>
+            <w:tcW w:type="dxa" w:w="2592"/>
+            <w:shd w:val="clear" w:color="auto" w:fill="F9FAFB"/>
+            <w:tcBorders>
+              <w:top w:val="single" w:sz="4" w:space="0" w:color="CCCCCC"/>
+              <w:left w:val="single" w:sz="4" w:space="0" w:color="CCCCCC"/>
+              <w:bottom w:val="single" w:sz="4" w:space="0" w:color="CCCCCC"/>
+              <w:right w:val="single" w:sz="4" w:space="0" w:color="CCCCCC"/>
+            </w:tcBorders>
+          </w:tcPr>
+          <w:p>
+            <w:r>
+              <w:rPr>
+                <w:b/>
+                <w:color w:val="1F2937"/>
+                <w:sz w:val="20"/>
+              </w:rPr>
+              <w:t>Labels</w:t>
+            </w:r>
+          </w:p>
+        </w:tc>
+        <w:tc>
+          <w:tcPr>
+            <w:tcW w:type="dxa" w:w="8208"/>
+            <w:tcBorders>
+              <w:top w:val="single" w:sz="4" w:space="0" w:color="CCCCCC"/>
+              <w:left w:val="single" w:sz="4" w:space="0" w:color="CCCCCC"/>
+              <w:bottom w:val="single" w:sz="4" w:space="0" w:color="CCCCCC"/>
+              <w:right w:val="single" w:sz="4" w:space="0" w:color="CCCCCC"/>
+            </w:tcBorders>
+          </w:tcPr>
+          <w:p>
+            <w:r>
+              <w:rPr>
+                <w:sz w:val="20"/>
+              </w:rPr>
+              <w:t>None</w:t>
+            </w:r>
+          </w:p>
+        </w:tc>
+      </w:tr>
+      <w:tr>
+        <w:tc>
+          <w:tcPr>
+            <w:tcW w:type="dxa" w:w="2592"/>
+            <w:shd w:val="clear" w:color="auto" w:fill="F9FAFB"/>
+            <w:tcBorders>
+              <w:top w:val="single" w:sz="4" w:space="0" w:color="CCCCCC"/>
+              <w:left w:val="single" w:sz="4" w:space="0" w:color="CCCCCC"/>
+              <w:bottom w:val="single" w:sz="4" w:space="0" w:color="CCCCCC"/>
+              <w:right w:val="single" w:sz="4" w:space="0" w:color="CCCCCC"/>
+            </w:tcBorders>
+          </w:tcPr>
+          <w:p>
+            <w:r>
+              <w:rPr>
+                <w:b/>
+                <w:color w:val="1F2937"/>
+                <w:sz w:val="20"/>
+              </w:rPr>
+              <w:t>Code Delta</w:t>
+            </w:r>
+          </w:p>
+        </w:tc>
+        <w:tc>
+          <w:tcPr>
+            <w:tcW w:type="dxa" w:w="8208"/>
+            <w:tcBorders>
+              <w:top w:val="single" w:sz="4" w:space="0" w:color="CCCCCC"/>
+              <w:left w:val="single" w:sz="4" w:space="0" w:color="CCCCCC"/>
+              <w:bottom w:val="single" w:sz="4" w:space="0" w:color="CCCCCC"/>
+              <w:right w:val="single" w:sz="4" w:space="0" w:color="CCCCCC"/>
+            </w:tcBorders>
+          </w:tcPr>
+          <w:p>
+            <w:r>
+              <w:rPr>
+                <w:sz w:val="20"/>
+              </w:rPr>
+              <w:t>+1 / -1 lines</w:t>
+            </w:r>
+          </w:p>
+        </w:tc>
+      </w:tr>
+      <w:tr>
+        <w:tc>
+          <w:tcPr>
+            <w:tcW w:type="dxa" w:w="2592"/>
+            <w:shd w:val="clear" w:color="auto" w:fill="F9FAFB"/>
+            <w:tcBorders>
+              <w:top w:val="single" w:sz="4" w:space="0" w:color="CCCCCC"/>
+              <w:left w:val="single" w:sz="4" w:space="0" w:color="CCCCCC"/>
+              <w:bottom w:val="single" w:sz="4" w:space="0" w:color="CCCCCC"/>
+              <w:right w:val="single" w:sz="4" w:space="0" w:color="CCCCCC"/>
+            </w:tcBorders>
+          </w:tcPr>
+          <w:p>
+            <w:r>
+              <w:rPr>
+                <w:b/>
+                <w:color w:val="1F2937"/>
+                <w:sz w:val="20"/>
+              </w:rPr>
+              <w:t>Commits</w:t>
+            </w:r>
+          </w:p>
+        </w:tc>
+        <w:tc>
+          <w:tcPr>
+            <w:tcW w:type="dxa" w:w="8208"/>
+            <w:tcBorders>
+              <w:top w:val="single" w:sz="4" w:space="0" w:color="CCCCCC"/>
+              <w:left w:val="single" w:sz="4" w:space="0" w:color="CCCCCC"/>
+              <w:bottom w:val="single" w:sz="4" w:space="0" w:color="CCCCCC"/>
+              <w:right w:val="single" w:sz="4" w:space="0" w:color="CCCCCC"/>
+            </w:tcBorders>
+          </w:tcPr>
+          <w:p>
+            <w:r>
+              <w:rPr>
+                <w:sz w:val="20"/>
+              </w:rPr>
+              <w:t>1</w:t>
+            </w:r>
+          </w:p>
+        </w:tc>
+      </w:tr>
+      <w:tr>
+        <w:tc>
+          <w:tcPr>
+            <w:tcW w:type="dxa" w:w="2592"/>
+            <w:shd w:val="clear" w:color="auto" w:fill="F9FAFB"/>
+            <w:tcBorders>
+              <w:top w:val="single" w:sz="4" w:space="0" w:color="CCCCCC"/>
+              <w:left w:val="single" w:sz="4" w:space="0" w:color="CCCCCC"/>
+              <w:bottom w:val="single" w:sz="4" w:space="0" w:color="CCCCCC"/>
+              <w:right w:val="single" w:sz="4" w:space="0" w:color="CCCCCC"/>
+            </w:tcBorders>
+          </w:tcPr>
+          <w:p>
+            <w:r>
+              <w:rPr>
+                <w:b/>
+                <w:color w:val="1F2937"/>
+                <w:sz w:val="20"/>
+              </w:rPr>
+              <w:t>Files Changed</w:t>
+            </w:r>
+          </w:p>
+        </w:tc>
+        <w:tc>
+          <w:tcPr>
+            <w:tcW w:type="dxa" w:w="8208"/>
+            <w:tcBorders>
+              <w:top w:val="single" w:sz="4" w:space="0" w:color="CCCCCC"/>
+              <w:left w:val="single" w:sz="4" w:space="0" w:color="CCCCCC"/>
+              <w:bottom w:val="single" w:sz="4" w:space="0" w:color="CCCCCC"/>
+              <w:right w:val="single" w:sz="4" w:space="0" w:color="CCCCCC"/>
+            </w:tcBorders>
+          </w:tcPr>
+          <w:p>
+            <w:r>
+              <w:rPr>
+                <w:sz w:val="20"/>
+              </w:rPr>
+              <w:t>1</w:t>
+            </w:r>
+          </w:p>
+        </w:tc>
+      </w:tr>
+      <w:tr>
+        <w:tc>
+          <w:tcPr>
+            <w:tcW w:type="dxa" w:w="2592"/>
+            <w:shd w:val="clear" w:color="auto" w:fill="F9FAFB"/>
+            <w:tcBorders>
+              <w:top w:val="single" w:sz="4" w:space="0" w:color="CCCCCC"/>
+              <w:left w:val="single" w:sz="4" w:space="0" w:color="CCCCCC"/>
+              <w:bottom w:val="single" w:sz="4" w:space="0" w:color="CCCCCC"/>
+              <w:right w:val="single" w:sz="4" w:space="0" w:color="CCCCCC"/>
+            </w:tcBorders>
+          </w:tcPr>
+          <w:p>
+            <w:r>
+              <w:rPr>
+                <w:b/>
+                <w:color w:val="1F2937"/>
+                <w:sz w:val="20"/>
+              </w:rPr>
+              <w:t>Approvals</w:t>
+            </w:r>
+          </w:p>
+        </w:tc>
+        <w:tc>
+          <w:tcPr>
+            <w:tcW w:type="dxa" w:w="8208"/>
+            <w:tcBorders>
+              <w:top w:val="single" w:sz="4" w:space="0" w:color="CCCCCC"/>
+              <w:left w:val="single" w:sz="4" w:space="0" w:color="CCCCCC"/>
+              <w:bottom w:val="single" w:sz="4" w:space="0" w:color="CCCCCC"/>
+              <w:right w:val="single" w:sz="4" w:space="0" w:color="CCCCCC"/>
+            </w:tcBorders>
+          </w:tcPr>
+          <w:p>
+            <w:r>
+              <w:rPr>
+                <w:sz w:val="20"/>
+              </w:rPr>
+              <w:t>None</w:t>
+            </w:r>
+          </w:p>
+        </w:tc>
+      </w:tr>
+      <w:tr>
+        <w:tc>
+          <w:tcPr>
+            <w:tcW w:type="dxa" w:w="2592"/>
+            <w:shd w:val="clear" w:color="auto" w:fill="F9FAFB"/>
+            <w:tcBorders>
+              <w:top w:val="single" w:sz="4" w:space="0" w:color="CCCCCC"/>
+              <w:left w:val="single" w:sz="4" w:space="0" w:color="CCCCCC"/>
+              <w:bottom w:val="single" w:sz="4" w:space="0" w:color="CCCCCC"/>
+              <w:right w:val="single" w:sz="4" w:space="0" w:color="CCCCCC"/>
+            </w:tcBorders>
+          </w:tcPr>
+          <w:p>
+            <w:r>
+              <w:rPr>
+                <w:b/>
+                <w:color w:val="1F2937"/>
+                <w:sz w:val="20"/>
+              </w:rPr>
+              <w:t>Changes Requested</w:t>
+            </w:r>
+          </w:p>
+        </w:tc>
+        <w:tc>
+          <w:tcPr>
+            <w:tcW w:type="dxa" w:w="8208"/>
+            <w:tcBorders>
+              <w:top w:val="single" w:sz="4" w:space="0" w:color="CCCCCC"/>
+              <w:left w:val="single" w:sz="4" w:space="0" w:color="CCCCCC"/>
+              <w:bottom w:val="single" w:sz="4" w:space="0" w:color="CCCCCC"/>
+              <w:right w:val="single" w:sz="4" w:space="0" w:color="CCCCCC"/>
+            </w:tcBorders>
+          </w:tcPr>
+          <w:p>
+            <w:r>
+              <w:rPr>
+                <w:sz w:val="20"/>
+              </w:rPr>
+              <w:t>None</w:t>
+            </w:r>
+          </w:p>
+        </w:tc>
+      </w:tr>
+      <w:tr>
+        <w:tc>
+          <w:tcPr>
+            <w:tcW w:type="dxa" w:w="2592"/>
+            <w:shd w:val="clear" w:color="auto" w:fill="F9FAFB"/>
+            <w:tcBorders>
+              <w:top w:val="single" w:sz="4" w:space="0" w:color="CCCCCC"/>
+              <w:left w:val="single" w:sz="4" w:space="0" w:color="CCCCCC"/>
+              <w:bottom w:val="single" w:sz="4" w:space="0" w:color="CCCCCC"/>
+              <w:right w:val="single" w:sz="4" w:space="0" w:color="CCCCCC"/>
+            </w:tcBorders>
+          </w:tcPr>
+          <w:p>
+            <w:r>
+              <w:rPr>
+                <w:b/>
+                <w:color w:val="1F2937"/>
+                <w:sz w:val="20"/>
+              </w:rPr>
+              <w:t>Comments</w:t>
+            </w:r>
+          </w:p>
+        </w:tc>
+        <w:tc>
+          <w:tcPr>
+            <w:tcW w:type="dxa" w:w="8208"/>
+            <w:tcBorders>
+              <w:top w:val="single" w:sz="4" w:space="0" w:color="CCCCCC"/>
+              <w:left w:val="single" w:sz="4" w:space="0" w:color="CCCCCC"/>
+              <w:bottom w:val="single" w:sz="4" w:space="0" w:color="CCCCCC"/>
+              <w:right w:val="single" w:sz="4" w:space="0" w:color="CCCCCC"/>
+            </w:tcBorders>
+          </w:tcPr>
+          <w:p>
+            <w:r>
+              <w:rPr>
+                <w:sz w:val="20"/>
+              </w:rPr>
+              <w:t>0 general  |  0 review</w:t>
+            </w:r>
+          </w:p>
+        </w:tc>
+      </w:tr>
+      <w:tr>
+        <w:tc>
+          <w:tcPr>
+            <w:tcW w:type="dxa" w:w="2592"/>
+            <w:shd w:val="clear" w:color="auto" w:fill="F9FAFB"/>
+            <w:tcBorders>
+              <w:top w:val="single" w:sz="4" w:space="0" w:color="CCCCCC"/>
+              <w:left w:val="single" w:sz="4" w:space="0" w:color="CCCCCC"/>
+              <w:bottom w:val="single" w:sz="4" w:space="0" w:color="CCCCCC"/>
+              <w:right w:val="single" w:sz="4" w:space="0" w:color="CCCCCC"/>
+            </w:tcBorders>
+          </w:tcPr>
+          <w:p>
+            <w:r>
+              <w:rPr>
+                <w:b/>
+                <w:color w:val="1F2937"/>
+                <w:sz w:val="20"/>
+              </w:rPr>
+              <w:t>Linked Issues</w:t>
+            </w:r>
+          </w:p>
+        </w:tc>
+        <w:tc>
+          <w:tcPr>
+            <w:tcW w:type="dxa" w:w="8208"/>
+            <w:tcBorders>
+              <w:top w:val="single" w:sz="4" w:space="0" w:color="CCCCCC"/>
+              <w:left w:val="single" w:sz="4" w:space="0" w:color="CCCCCC"/>
+              <w:bottom w:val="single" w:sz="4" w:space="0" w:color="CCCCCC"/>
+              <w:right w:val="single" w:sz="4" w:space="0" w:color="CCCCCC"/>
+            </w:tcBorders>
+          </w:tcPr>
+          <w:p>
+            <w:r>
+              <w:rPr>
+                <w:sz w:val="20"/>
+              </w:rPr>
+              <w:t>0</w:t>
+            </w:r>
+          </w:p>
+        </w:tc>
+      </w:tr>
+      <w:tr>
+        <w:tc>
+          <w:tcPr>
+            <w:tcW w:type="dxa" w:w="2592"/>
+            <w:shd w:val="clear" w:color="auto" w:fill="F9FAFB"/>
+            <w:tcBorders>
+              <w:top w:val="single" w:sz="4" w:space="0" w:color="CCCCCC"/>
+              <w:left w:val="single" w:sz="4" w:space="0" w:color="CCCCCC"/>
+              <w:bottom w:val="single" w:sz="4" w:space="0" w:color="CCCCCC"/>
+              <w:right w:val="single" w:sz="4" w:space="0" w:color="CCCCCC"/>
+            </w:tcBorders>
+          </w:tcPr>
+          <w:p>
+            <w:r>
+              <w:rPr>
+                <w:b/>
+                <w:color w:val="1F2937"/>
+                <w:sz w:val="20"/>
+              </w:rPr>
+              <w:t>PR URL</w:t>
+            </w:r>
+          </w:p>
+        </w:tc>
+        <w:tc>
+          <w:tcPr>
+            <w:tcW w:type="dxa" w:w="8208"/>
+            <w:tcBorders>
+              <w:top w:val="single" w:sz="4" w:space="0" w:color="CCCCCC"/>
+              <w:left w:val="single" w:sz="4" w:space="0" w:color="CCCCCC"/>
+              <w:bottom w:val="single" w:sz="4" w:space="0" w:color="CCCCCC"/>
+              <w:right w:val="single" w:sz="4" w:space="0" w:color="CCCCCC"/>
+            </w:tcBorders>
+          </w:tcPr>
+          <w:p>
+            <w:r>
+              <w:rPr>
+                <w:sz w:val="20"/>
+              </w:rPr>
+              <w:t>https://github.com/Janiyamt/PR-AGENT/pull/7</w:t>
+            </w:r>
+          </w:p>
+        </w:tc>
+      </w:tr>
+    </w:tbl>
+    <w:p>
+      <w:pPr>
+        <w:spacing w:before="160" w:after="40"/>
+      </w:pPr>
+      <w:r>
+        <w:rPr>
+          <w:b/>
+          <w:i w:val="0"/>
+          <w:color w:val="1F2937"/>
+          <w:sz w:val="20"/>
+        </w:rPr>
+        <w:t>Commit Messages:</w:t>
+      </w:r>
+    </w:p>
+    <w:p>
+      <w:pPr>
+        <w:spacing w:before="0" w:after="40"/>
+      </w:pPr>
+      <w:r>
+        <w:rPr>
+          <w:b w:val="0"/>
+          <w:i w:val="0"/>
+          <w:color w:val="6B7280"/>
+          <w:sz w:val="18"/>
+        </w:rPr>
+        <w:t xml:space="preserve">  • Update comment in .gitignore for clarity</w:t>
+      </w:r>
+    </w:p>
+    <w:p>
+      <w:pPr>
+        <w:spacing w:before="160" w:after="40"/>
+      </w:pPr>
+      <w:r>
+        <w:rPr>
+          <w:b/>
+          <w:i w:val="0"/>
+          <w:color w:val="1F2937"/>
+          <w:sz w:val="20"/>
+        </w:rPr>
+        <w:t>Before → After:</w:t>
+      </w:r>
+    </w:p>
+    <w:p>
+      <w:pPr>
+        <w:spacing w:before="80" w:after="200"/>
+        <w:ind w:left="432"/>
+        <w:pBdr>
+          <w:left w:val="single" w:sz="12" w:space="10" w:color="3B82F6"/>
+        </w:pBdr>
+      </w:pPr>
+      <w:r>
+        <w:rPr>
+          <w:i/>
+          <w:color w:val="1F2937"/>
+          <w:sz w:val="21"/>
+        </w:rPr>
+        <w:t>AI analysis unavailable - check OCI credentials in GitHub Secrets.</w:t>
+      </w:r>
+    </w:p>
+    <w:p>
+      <w:pPr>
+        <w:spacing w:before="120" w:after="40"/>
+      </w:pPr>
+      <w:r>
+        <w:rPr>
+          <w:b/>
+          <w:i w:val="0"/>
+          <w:color w:val="1F2937"/>
+          <w:sz w:val="20"/>
+        </w:rPr>
+        <w:t>Key Impacts:</w:t>
+      </w:r>
+    </w:p>
+    <w:p>
+      <w:pPr>
+        <w:spacing w:before="0" w:after="40"/>
+      </w:pPr>
+      <w:r>
+        <w:rPr>
+          <w:b w:val="0"/>
+          <w:i w:val="0"/>
+          <w:color w:val="6B7280"/>
+          <w:sz w:val="18"/>
+        </w:rPr>
+        <w:t xml:space="preserve">  • Changed 1 file(s)</w:t>
+      </w:r>
+    </w:p>
+    <w:p>
+      <w:pPr>
+        <w:spacing w:before="120" w:after="40"/>
+      </w:pPr>
+      <w:r>
+        <w:rPr>
+          <w:b/>
+          <w:i w:val="0"/>
+          <w:color w:val="1F2937"/>
+          <w:sz w:val="20"/>
+        </w:rPr>
+        <w:t>Review Notes:</w:t>
+      </w:r>
+    </w:p>
+    <w:p>
+      <w:pPr>
+        <w:spacing w:before="0" w:after="80"/>
+      </w:pPr>
+      <w:r>
+        <w:rPr>
+          <w:b w:val="0"/>
+          <w:i w:val="0"/>
+          <w:color w:val="6B7280"/>
+          <w:sz w:val="18"/>
+        </w:rPr>
+        <w:t>Approved by: No approvals recorded.</w:t>
+      </w:r>
+    </w:p>
+    <w:p>
+      <w:pPr>
+        <w:spacing w:before="120" w:after="40"/>
+      </w:pPr>
+      <w:r>
+        <w:rPr>
+          <w:b/>
+          <w:i w:val="0"/>
+          <w:color w:val="1F2937"/>
+          <w:sz w:val="20"/>
+        </w:rPr>
+        <w:t>Files Changed:</w:t>
+      </w:r>
+    </w:p>
+    <w:p>
+      <w:pPr>
+        <w:spacing w:before="0" w:after="20"/>
+      </w:pPr>
+      <w:r>
+        <w:rPr>
+          <w:b w:val="0"/>
+          <w:i w:val="0"/>
+          <w:color w:val="6B7280"/>
+          <w:sz w:val="16"/>
+        </w:rPr>
+        <w:t xml:space="preserve">  .gitignore</w:t>
+      </w:r>
+    </w:p>
+    <w:p>
+      <w:pPr>
+        <w:spacing w:before="120" w:after="40"/>
+      </w:pPr>
+      <w:r>
+        <w:rPr>
+          <w:b/>
+          <w:i w:val="0"/>
+          <w:color w:val="1F2937"/>
+          <w:sz w:val="20"/>
+        </w:rPr>
+        <w:t>Code Diffs (sample):</w:t>
+      </w:r>
+    </w:p>
+    <w:p>
+      <w:pPr>
+        <w:spacing w:before="80" w:after="40"/>
+      </w:pPr>
+      <w:r>
+        <w:rPr>
+          <w:b/>
+          <w:i w:val="0"/>
+          <w:color w:val="1E3A5F"/>
+          <w:sz w:val="18"/>
+        </w:rPr>
+        <w:t>MODIFIED: .gitignore  (+1 / -1)</w:t>
+      </w:r>
+    </w:p>
+    <w:p>
+      <w:pPr>
+        <w:spacing w:before="0" w:after="80"/>
+      </w:pPr>
+      <w:r>
+        <w:rPr>
+          <w:b w:val="0"/>
+          <w:i w:val="0"/>
+          <w:color w:val="6B7280"/>
+          <w:sz w:val="16"/>
+        </w:rPr>
+        <w:t>@@ -4,4 +4,4 @@ pr_report.docx</w:t>
+        <w:br/>
+        <w:t xml:space="preserve"> venv/</w:t>
+        <w:br/>
+        <w:t xml:space="preserve"> .venv/</w:t>
+        <w:br/>
+        <w:t xml:space="preserve"> config.py</w:t>
+        <w:br/>
+        <w:t>-# this is the last comment to check the bot with all oci services</w:t>
+        <w:br/>
+        <w:t>+# i hope everything works well with oci services</w:t>
+      </w:r>
+    </w:p>
+    <w:p>
+      <w:pPr>
+        <w:spacing w:before="80" w:after="80"/>
+        <w:pBdr>
+          <w:bottom w:val="single" w:sz="4" w:space="1" w:color="E5E7EB"/>
+        </w:pBdr>
+      </w:pPr>
     </w:p>
     <w:p>
       <w:pPr>
@@ -3121,7 +4006,7 @@
           <w:color w:val="9CA3AF"/>
           <w:sz w:val="18"/>
         </w:rPr>
-        <w:t>Merge Events Report  •  Generated by PR-Agent v2  •  March 03, 2026 at 11:21 UTC</w:t>
+        <w:t>Merge Events Report  •  Generated by PR-Agent v2  •  March 04, 2026 at 05:56 UTC</w:t>
       </w:r>
     </w:p>
     <w:sectPr>

</xml_diff>

<commit_message>
chore: log merge event for e052d7586c3bb1e24af4d01315e4d58ce7f8c72e
</commit_message>
<xml_diff>
--- a/merge_agent/logs/merge-events-report.docx
+++ b/merge_agent/logs/merge-events-report.docx
@@ -44,7 +44,7 @@
           <w:color w:val="9CA3AF"/>
           <w:sz w:val="20"/>
         </w:rPr>
-        <w:t>Generated: March 04, 2026 at 05:56 UTC  •  4 merge events on record</w:t>
+        <w:t>Generated: March 04, 2026 at 06:06 UTC  •  5 merge events on record</w:t>
       </w:r>
     </w:p>
     <w:p>
@@ -104,7 +104,7 @@
                 <w:color w:val="1E3A5F"/>
                 <w:sz w:val="36"/>
               </w:rPr>
-              <w:t>4</w:t>
+              <w:t>5</w:t>
             </w:r>
           </w:p>
         </w:tc>
@@ -179,7 +179,7 @@
                 <w:color w:val="D97706"/>
                 <w:sz w:val="36"/>
               </w:rPr>
-              <w:t>+7/5</w:t>
+              <w:t>+9/6</w:t>
             </w:r>
           </w:p>
         </w:tc>
@@ -308,6 +308,37 @@
           <w:sz w:val="32"/>
         </w:rPr>
         <w:t>AI Summaries</w:t>
+      </w:r>
+    </w:p>
+    <w:p>
+      <w:pPr>
+        <w:spacing w:before="0" w:after="40"/>
+      </w:pPr>
+      <w:r>
+        <w:rPr>
+          <w:b/>
+          <w:i w:val="0"/>
+          <w:color w:val="1F2937"/>
+          <w:sz w:val="20"/>
+        </w:rPr>
+        <w:t>PR #8 — Update comment in .gitignore for clarity</w:t>
+      </w:r>
+    </w:p>
+    <w:p>
+      <w:pPr>
+        <w:spacing w:before="80" w:after="200"/>
+        <w:ind w:left="432"/>
+        <w:pBdr>
+          <w:left w:val="single" w:sz="12" w:space="10" w:color="3B82F6"/>
+        </w:pBdr>
+      </w:pPr>
+      <w:r>
+        <w:rPr>
+          <w:i/>
+          <w:color w:val="1F2937"/>
+          <w:sz w:val="21"/>
+        </w:rPr>
+        <w:t>This pull request updated a comment in the .gitignore file to correct a grammatical error, changing 'insatlled' to 'installed' for better clarity. The change ensures the documentation accurately reflects that OCI services are now installed and functional. It also included a merge commit from the master branch into the test branch.</w:t>
       </w:r>
     </w:p>
     <w:p>
@@ -455,6 +486,932 @@
         </w:rPr>
         <w:t>Merge Event Details</w:t>
       </w:r>
+    </w:p>
+    <w:p>
+      <w:pPr>
+        <w:spacing w:before="280" w:after="80"/>
+      </w:pPr>
+      <w:r>
+        <w:rPr>
+          <w:b/>
+          <w:color w:val="6B7280"/>
+          <w:sz w:val="26"/>
+        </w:rPr>
+        <w:t xml:space="preserve">PR #8 — </w:t>
+      </w:r>
+      <w:r>
+        <w:rPr>
+          <w:b/>
+          <w:color w:val="1F2937"/>
+          <w:sz w:val="26"/>
+        </w:rPr>
+        <w:t>Update comment in .gitignore for clarity</w:t>
+      </w:r>
+    </w:p>
+    <w:p>
+      <w:pPr>
+        <w:spacing w:before="80" w:after="200"/>
+        <w:ind w:left="432"/>
+        <w:pBdr>
+          <w:left w:val="single" w:sz="12" w:space="10" w:color="10B981"/>
+        </w:pBdr>
+      </w:pPr>
+      <w:r>
+        <w:rPr>
+          <w:i/>
+          <w:color w:val="1F2937"/>
+          <w:sz w:val="21"/>
+        </w:rPr>
+        <w:t>💡 This pull request updated a comment in the .gitignore file to correct a grammatical error, changing 'insatlled' to 'installed' for better clarity. The change ensures the documentation accurately reflects that OCI services are now installed and functional. It also included a merge commit from the master branch into the test branch.</w:t>
+      </w:r>
+    </w:p>
+    <w:tbl>
+      <w:tblPr>
+        <w:tblStyle w:val="TableGrid"/>
+        <w:tblW w:type="auto" w:w="0"/>
+        <w:tblLook w:firstColumn="1" w:firstRow="1" w:lastColumn="0" w:lastRow="0" w:noHBand="0" w:noVBand="1" w:val="04A0"/>
+      </w:tblPr>
+      <w:tblGrid>
+        <w:gridCol w:w="4680"/>
+        <w:gridCol w:w="4680"/>
+      </w:tblGrid>
+      <w:tr>
+        <w:tc>
+          <w:tcPr>
+            <w:tcW w:type="dxa" w:w="2592"/>
+            <w:shd w:val="clear" w:color="auto" w:fill="F9FAFB"/>
+            <w:tcBorders>
+              <w:top w:val="single" w:sz="4" w:space="0" w:color="CCCCCC"/>
+              <w:left w:val="single" w:sz="4" w:space="0" w:color="CCCCCC"/>
+              <w:bottom w:val="single" w:sz="4" w:space="0" w:color="CCCCCC"/>
+              <w:right w:val="single" w:sz="4" w:space="0" w:color="CCCCCC"/>
+            </w:tcBorders>
+          </w:tcPr>
+          <w:p>
+            <w:r>
+              <w:rPr>
+                <w:b/>
+                <w:color w:val="1F2937"/>
+                <w:sz w:val="20"/>
+              </w:rPr>
+              <w:t>PR Author</w:t>
+            </w:r>
+          </w:p>
+        </w:tc>
+        <w:tc>
+          <w:tcPr>
+            <w:tcW w:type="dxa" w:w="8208"/>
+            <w:tcBorders>
+              <w:top w:val="single" w:sz="4" w:space="0" w:color="CCCCCC"/>
+              <w:left w:val="single" w:sz="4" w:space="0" w:color="CCCCCC"/>
+              <w:bottom w:val="single" w:sz="4" w:space="0" w:color="CCCCCC"/>
+              <w:right w:val="single" w:sz="4" w:space="0" w:color="CCCCCC"/>
+            </w:tcBorders>
+          </w:tcPr>
+          <w:p>
+            <w:r>
+              <w:rPr>
+                <w:sz w:val="20"/>
+              </w:rPr>
+              <w:t>likiita</w:t>
+            </w:r>
+          </w:p>
+        </w:tc>
+      </w:tr>
+      <w:tr>
+        <w:tc>
+          <w:tcPr>
+            <w:tcW w:type="dxa" w:w="2592"/>
+            <w:shd w:val="clear" w:color="auto" w:fill="F9FAFB"/>
+            <w:tcBorders>
+              <w:top w:val="single" w:sz="4" w:space="0" w:color="CCCCCC"/>
+              <w:left w:val="single" w:sz="4" w:space="0" w:color="CCCCCC"/>
+              <w:bottom w:val="single" w:sz="4" w:space="0" w:color="CCCCCC"/>
+              <w:right w:val="single" w:sz="4" w:space="0" w:color="CCCCCC"/>
+            </w:tcBorders>
+          </w:tcPr>
+          <w:p>
+            <w:r>
+              <w:rPr>
+                <w:b/>
+                <w:color w:val="1F2937"/>
+                <w:sz w:val="20"/>
+              </w:rPr>
+              <w:t>Merged By</w:t>
+            </w:r>
+          </w:p>
+        </w:tc>
+        <w:tc>
+          <w:tcPr>
+            <w:tcW w:type="dxa" w:w="8208"/>
+            <w:tcBorders>
+              <w:top w:val="single" w:sz="4" w:space="0" w:color="CCCCCC"/>
+              <w:left w:val="single" w:sz="4" w:space="0" w:color="CCCCCC"/>
+              <w:bottom w:val="single" w:sz="4" w:space="0" w:color="CCCCCC"/>
+              <w:right w:val="single" w:sz="4" w:space="0" w:color="CCCCCC"/>
+            </w:tcBorders>
+          </w:tcPr>
+          <w:p>
+            <w:r>
+              <w:rPr>
+                <w:sz w:val="20"/>
+              </w:rPr>
+              <w:t>likiita</w:t>
+            </w:r>
+          </w:p>
+        </w:tc>
+      </w:tr>
+      <w:tr>
+        <w:tc>
+          <w:tcPr>
+            <w:tcW w:type="dxa" w:w="2592"/>
+            <w:shd w:val="clear" w:color="auto" w:fill="F9FAFB"/>
+            <w:tcBorders>
+              <w:top w:val="single" w:sz="4" w:space="0" w:color="CCCCCC"/>
+              <w:left w:val="single" w:sz="4" w:space="0" w:color="CCCCCC"/>
+              <w:bottom w:val="single" w:sz="4" w:space="0" w:color="CCCCCC"/>
+              <w:right w:val="single" w:sz="4" w:space="0" w:color="CCCCCC"/>
+            </w:tcBorders>
+          </w:tcPr>
+          <w:p>
+            <w:r>
+              <w:rPr>
+                <w:b/>
+                <w:color w:val="1F2937"/>
+                <w:sz w:val="20"/>
+              </w:rPr>
+              <w:t>Merged At</w:t>
+            </w:r>
+          </w:p>
+        </w:tc>
+        <w:tc>
+          <w:tcPr>
+            <w:tcW w:type="dxa" w:w="8208"/>
+            <w:tcBorders>
+              <w:top w:val="single" w:sz="4" w:space="0" w:color="CCCCCC"/>
+              <w:left w:val="single" w:sz="4" w:space="0" w:color="CCCCCC"/>
+              <w:bottom w:val="single" w:sz="4" w:space="0" w:color="CCCCCC"/>
+              <w:right w:val="single" w:sz="4" w:space="0" w:color="CCCCCC"/>
+            </w:tcBorders>
+          </w:tcPr>
+          <w:p>
+            <w:r>
+              <w:rPr>
+                <w:sz w:val="20"/>
+              </w:rPr>
+              <w:t>2026-03-04 06:05:46</w:t>
+            </w:r>
+          </w:p>
+        </w:tc>
+      </w:tr>
+      <w:tr>
+        <w:tc>
+          <w:tcPr>
+            <w:tcW w:type="dxa" w:w="2592"/>
+            <w:shd w:val="clear" w:color="auto" w:fill="F9FAFB"/>
+            <w:tcBorders>
+              <w:top w:val="single" w:sz="4" w:space="0" w:color="CCCCCC"/>
+              <w:left w:val="single" w:sz="4" w:space="0" w:color="CCCCCC"/>
+              <w:bottom w:val="single" w:sz="4" w:space="0" w:color="CCCCCC"/>
+              <w:right w:val="single" w:sz="4" w:space="0" w:color="CCCCCC"/>
+            </w:tcBorders>
+          </w:tcPr>
+          <w:p>
+            <w:r>
+              <w:rPr>
+                <w:b/>
+                <w:color w:val="1F2937"/>
+                <w:sz w:val="20"/>
+              </w:rPr>
+              <w:t>Merge Commit</w:t>
+            </w:r>
+          </w:p>
+        </w:tc>
+        <w:tc>
+          <w:tcPr>
+            <w:tcW w:type="dxa" w:w="8208"/>
+            <w:tcBorders>
+              <w:top w:val="single" w:sz="4" w:space="0" w:color="CCCCCC"/>
+              <w:left w:val="single" w:sz="4" w:space="0" w:color="CCCCCC"/>
+              <w:bottom w:val="single" w:sz="4" w:space="0" w:color="CCCCCC"/>
+              <w:right w:val="single" w:sz="4" w:space="0" w:color="CCCCCC"/>
+            </w:tcBorders>
+          </w:tcPr>
+          <w:p>
+            <w:r>
+              <w:rPr>
+                <w:sz w:val="20"/>
+              </w:rPr>
+              <w:t>e052d7586c3b...</w:t>
+            </w:r>
+          </w:p>
+        </w:tc>
+      </w:tr>
+      <w:tr>
+        <w:tc>
+          <w:tcPr>
+            <w:tcW w:type="dxa" w:w="2592"/>
+            <w:shd w:val="clear" w:color="auto" w:fill="F9FAFB"/>
+            <w:tcBorders>
+              <w:top w:val="single" w:sz="4" w:space="0" w:color="CCCCCC"/>
+              <w:left w:val="single" w:sz="4" w:space="0" w:color="CCCCCC"/>
+              <w:bottom w:val="single" w:sz="4" w:space="0" w:color="CCCCCC"/>
+              <w:right w:val="single" w:sz="4" w:space="0" w:color="CCCCCC"/>
+            </w:tcBorders>
+          </w:tcPr>
+          <w:p>
+            <w:r>
+              <w:rPr>
+                <w:b/>
+                <w:color w:val="1F2937"/>
+                <w:sz w:val="20"/>
+              </w:rPr>
+              <w:t>Branch</w:t>
+            </w:r>
+          </w:p>
+        </w:tc>
+        <w:tc>
+          <w:tcPr>
+            <w:tcW w:type="dxa" w:w="8208"/>
+            <w:tcBorders>
+              <w:top w:val="single" w:sz="4" w:space="0" w:color="CCCCCC"/>
+              <w:left w:val="single" w:sz="4" w:space="0" w:color="CCCCCC"/>
+              <w:bottom w:val="single" w:sz="4" w:space="0" w:color="CCCCCC"/>
+              <w:right w:val="single" w:sz="4" w:space="0" w:color="CCCCCC"/>
+            </w:tcBorders>
+          </w:tcPr>
+          <w:p>
+            <w:r>
+              <w:rPr>
+                <w:sz w:val="20"/>
+              </w:rPr>
+              <w:t>bot_test → master</w:t>
+            </w:r>
+          </w:p>
+        </w:tc>
+      </w:tr>
+      <w:tr>
+        <w:tc>
+          <w:tcPr>
+            <w:tcW w:type="dxa" w:w="2592"/>
+            <w:shd w:val="clear" w:color="auto" w:fill="F9FAFB"/>
+            <w:tcBorders>
+              <w:top w:val="single" w:sz="4" w:space="0" w:color="CCCCCC"/>
+              <w:left w:val="single" w:sz="4" w:space="0" w:color="CCCCCC"/>
+              <w:bottom w:val="single" w:sz="4" w:space="0" w:color="CCCCCC"/>
+              <w:right w:val="single" w:sz="4" w:space="0" w:color="CCCCCC"/>
+            </w:tcBorders>
+          </w:tcPr>
+          <w:p>
+            <w:r>
+              <w:rPr>
+                <w:b/>
+                <w:color w:val="1F2937"/>
+                <w:sz w:val="20"/>
+              </w:rPr>
+              <w:t>Labels</w:t>
+            </w:r>
+          </w:p>
+        </w:tc>
+        <w:tc>
+          <w:tcPr>
+            <w:tcW w:type="dxa" w:w="8208"/>
+            <w:tcBorders>
+              <w:top w:val="single" w:sz="4" w:space="0" w:color="CCCCCC"/>
+              <w:left w:val="single" w:sz="4" w:space="0" w:color="CCCCCC"/>
+              <w:bottom w:val="single" w:sz="4" w:space="0" w:color="CCCCCC"/>
+              <w:right w:val="single" w:sz="4" w:space="0" w:color="CCCCCC"/>
+            </w:tcBorders>
+          </w:tcPr>
+          <w:p>
+            <w:r>
+              <w:rPr>
+                <w:sz w:val="20"/>
+              </w:rPr>
+              <w:t>None</w:t>
+            </w:r>
+          </w:p>
+        </w:tc>
+      </w:tr>
+      <w:tr>
+        <w:tc>
+          <w:tcPr>
+            <w:tcW w:type="dxa" w:w="2592"/>
+            <w:shd w:val="clear" w:color="auto" w:fill="F9FAFB"/>
+            <w:tcBorders>
+              <w:top w:val="single" w:sz="4" w:space="0" w:color="CCCCCC"/>
+              <w:left w:val="single" w:sz="4" w:space="0" w:color="CCCCCC"/>
+              <w:bottom w:val="single" w:sz="4" w:space="0" w:color="CCCCCC"/>
+              <w:right w:val="single" w:sz="4" w:space="0" w:color="CCCCCC"/>
+            </w:tcBorders>
+          </w:tcPr>
+          <w:p>
+            <w:r>
+              <w:rPr>
+                <w:b/>
+                <w:color w:val="1F2937"/>
+                <w:sz w:val="20"/>
+              </w:rPr>
+              <w:t>Code Delta</w:t>
+            </w:r>
+          </w:p>
+        </w:tc>
+        <w:tc>
+          <w:tcPr>
+            <w:tcW w:type="dxa" w:w="8208"/>
+            <w:tcBorders>
+              <w:top w:val="single" w:sz="4" w:space="0" w:color="CCCCCC"/>
+              <w:left w:val="single" w:sz="4" w:space="0" w:color="CCCCCC"/>
+              <w:bottom w:val="single" w:sz="4" w:space="0" w:color="CCCCCC"/>
+              <w:right w:val="single" w:sz="4" w:space="0" w:color="CCCCCC"/>
+            </w:tcBorders>
+          </w:tcPr>
+          <w:p>
+            <w:r>
+              <w:rPr>
+                <w:sz w:val="20"/>
+              </w:rPr>
+              <w:t>+2 / -1 lines</w:t>
+            </w:r>
+          </w:p>
+        </w:tc>
+      </w:tr>
+      <w:tr>
+        <w:tc>
+          <w:tcPr>
+            <w:tcW w:type="dxa" w:w="2592"/>
+            <w:shd w:val="clear" w:color="auto" w:fill="F9FAFB"/>
+            <w:tcBorders>
+              <w:top w:val="single" w:sz="4" w:space="0" w:color="CCCCCC"/>
+              <w:left w:val="single" w:sz="4" w:space="0" w:color="CCCCCC"/>
+              <w:bottom w:val="single" w:sz="4" w:space="0" w:color="CCCCCC"/>
+              <w:right w:val="single" w:sz="4" w:space="0" w:color="CCCCCC"/>
+            </w:tcBorders>
+          </w:tcPr>
+          <w:p>
+            <w:r>
+              <w:rPr>
+                <w:b/>
+                <w:color w:val="1F2937"/>
+                <w:sz w:val="20"/>
+              </w:rPr>
+              <w:t>Commits</w:t>
+            </w:r>
+          </w:p>
+        </w:tc>
+        <w:tc>
+          <w:tcPr>
+            <w:tcW w:type="dxa" w:w="8208"/>
+            <w:tcBorders>
+              <w:top w:val="single" w:sz="4" w:space="0" w:color="CCCCCC"/>
+              <w:left w:val="single" w:sz="4" w:space="0" w:color="CCCCCC"/>
+              <w:bottom w:val="single" w:sz="4" w:space="0" w:color="CCCCCC"/>
+              <w:right w:val="single" w:sz="4" w:space="0" w:color="CCCCCC"/>
+            </w:tcBorders>
+          </w:tcPr>
+          <w:p>
+            <w:r>
+              <w:rPr>
+                <w:sz w:val="20"/>
+              </w:rPr>
+              <w:t>2</w:t>
+            </w:r>
+          </w:p>
+        </w:tc>
+      </w:tr>
+      <w:tr>
+        <w:tc>
+          <w:tcPr>
+            <w:tcW w:type="dxa" w:w="2592"/>
+            <w:shd w:val="clear" w:color="auto" w:fill="F9FAFB"/>
+            <w:tcBorders>
+              <w:top w:val="single" w:sz="4" w:space="0" w:color="CCCCCC"/>
+              <w:left w:val="single" w:sz="4" w:space="0" w:color="CCCCCC"/>
+              <w:bottom w:val="single" w:sz="4" w:space="0" w:color="CCCCCC"/>
+              <w:right w:val="single" w:sz="4" w:space="0" w:color="CCCCCC"/>
+            </w:tcBorders>
+          </w:tcPr>
+          <w:p>
+            <w:r>
+              <w:rPr>
+                <w:b/>
+                <w:color w:val="1F2937"/>
+                <w:sz w:val="20"/>
+              </w:rPr>
+              <w:t>Files Changed</w:t>
+            </w:r>
+          </w:p>
+        </w:tc>
+        <w:tc>
+          <w:tcPr>
+            <w:tcW w:type="dxa" w:w="8208"/>
+            <w:tcBorders>
+              <w:top w:val="single" w:sz="4" w:space="0" w:color="CCCCCC"/>
+              <w:left w:val="single" w:sz="4" w:space="0" w:color="CCCCCC"/>
+              <w:bottom w:val="single" w:sz="4" w:space="0" w:color="CCCCCC"/>
+              <w:right w:val="single" w:sz="4" w:space="0" w:color="CCCCCC"/>
+            </w:tcBorders>
+          </w:tcPr>
+          <w:p>
+            <w:r>
+              <w:rPr>
+                <w:sz w:val="20"/>
+              </w:rPr>
+              <w:t>1</w:t>
+            </w:r>
+          </w:p>
+        </w:tc>
+      </w:tr>
+      <w:tr>
+        <w:tc>
+          <w:tcPr>
+            <w:tcW w:type="dxa" w:w="2592"/>
+            <w:shd w:val="clear" w:color="auto" w:fill="F9FAFB"/>
+            <w:tcBorders>
+              <w:top w:val="single" w:sz="4" w:space="0" w:color="CCCCCC"/>
+              <w:left w:val="single" w:sz="4" w:space="0" w:color="CCCCCC"/>
+              <w:bottom w:val="single" w:sz="4" w:space="0" w:color="CCCCCC"/>
+              <w:right w:val="single" w:sz="4" w:space="0" w:color="CCCCCC"/>
+            </w:tcBorders>
+          </w:tcPr>
+          <w:p>
+            <w:r>
+              <w:rPr>
+                <w:b/>
+                <w:color w:val="1F2937"/>
+                <w:sz w:val="20"/>
+              </w:rPr>
+              <w:t>Approvals</w:t>
+            </w:r>
+          </w:p>
+        </w:tc>
+        <w:tc>
+          <w:tcPr>
+            <w:tcW w:type="dxa" w:w="8208"/>
+            <w:tcBorders>
+              <w:top w:val="single" w:sz="4" w:space="0" w:color="CCCCCC"/>
+              <w:left w:val="single" w:sz="4" w:space="0" w:color="CCCCCC"/>
+              <w:bottom w:val="single" w:sz="4" w:space="0" w:color="CCCCCC"/>
+              <w:right w:val="single" w:sz="4" w:space="0" w:color="CCCCCC"/>
+            </w:tcBorders>
+          </w:tcPr>
+          <w:p>
+            <w:r>
+              <w:rPr>
+                <w:sz w:val="20"/>
+              </w:rPr>
+              <w:t>None</w:t>
+            </w:r>
+          </w:p>
+        </w:tc>
+      </w:tr>
+      <w:tr>
+        <w:tc>
+          <w:tcPr>
+            <w:tcW w:type="dxa" w:w="2592"/>
+            <w:shd w:val="clear" w:color="auto" w:fill="F9FAFB"/>
+            <w:tcBorders>
+              <w:top w:val="single" w:sz="4" w:space="0" w:color="CCCCCC"/>
+              <w:left w:val="single" w:sz="4" w:space="0" w:color="CCCCCC"/>
+              <w:bottom w:val="single" w:sz="4" w:space="0" w:color="CCCCCC"/>
+              <w:right w:val="single" w:sz="4" w:space="0" w:color="CCCCCC"/>
+            </w:tcBorders>
+          </w:tcPr>
+          <w:p>
+            <w:r>
+              <w:rPr>
+                <w:b/>
+                <w:color w:val="1F2937"/>
+                <w:sz w:val="20"/>
+              </w:rPr>
+              <w:t>Changes Requested</w:t>
+            </w:r>
+          </w:p>
+        </w:tc>
+        <w:tc>
+          <w:tcPr>
+            <w:tcW w:type="dxa" w:w="8208"/>
+            <w:tcBorders>
+              <w:top w:val="single" w:sz="4" w:space="0" w:color="CCCCCC"/>
+              <w:left w:val="single" w:sz="4" w:space="0" w:color="CCCCCC"/>
+              <w:bottom w:val="single" w:sz="4" w:space="0" w:color="CCCCCC"/>
+              <w:right w:val="single" w:sz="4" w:space="0" w:color="CCCCCC"/>
+            </w:tcBorders>
+          </w:tcPr>
+          <w:p>
+            <w:r>
+              <w:rPr>
+                <w:sz w:val="20"/>
+              </w:rPr>
+              <w:t>None</w:t>
+            </w:r>
+          </w:p>
+        </w:tc>
+      </w:tr>
+      <w:tr>
+        <w:tc>
+          <w:tcPr>
+            <w:tcW w:type="dxa" w:w="2592"/>
+            <w:shd w:val="clear" w:color="auto" w:fill="F9FAFB"/>
+            <w:tcBorders>
+              <w:top w:val="single" w:sz="4" w:space="0" w:color="CCCCCC"/>
+              <w:left w:val="single" w:sz="4" w:space="0" w:color="CCCCCC"/>
+              <w:bottom w:val="single" w:sz="4" w:space="0" w:color="CCCCCC"/>
+              <w:right w:val="single" w:sz="4" w:space="0" w:color="CCCCCC"/>
+            </w:tcBorders>
+          </w:tcPr>
+          <w:p>
+            <w:r>
+              <w:rPr>
+                <w:b/>
+                <w:color w:val="1F2937"/>
+                <w:sz w:val="20"/>
+              </w:rPr>
+              <w:t>Comments</w:t>
+            </w:r>
+          </w:p>
+        </w:tc>
+        <w:tc>
+          <w:tcPr>
+            <w:tcW w:type="dxa" w:w="8208"/>
+            <w:tcBorders>
+              <w:top w:val="single" w:sz="4" w:space="0" w:color="CCCCCC"/>
+              <w:left w:val="single" w:sz="4" w:space="0" w:color="CCCCCC"/>
+              <w:bottom w:val="single" w:sz="4" w:space="0" w:color="CCCCCC"/>
+              <w:right w:val="single" w:sz="4" w:space="0" w:color="CCCCCC"/>
+            </w:tcBorders>
+          </w:tcPr>
+          <w:p>
+            <w:r>
+              <w:rPr>
+                <w:sz w:val="20"/>
+              </w:rPr>
+              <w:t>0 general  |  0 review</w:t>
+            </w:r>
+          </w:p>
+        </w:tc>
+      </w:tr>
+      <w:tr>
+        <w:tc>
+          <w:tcPr>
+            <w:tcW w:type="dxa" w:w="2592"/>
+            <w:shd w:val="clear" w:color="auto" w:fill="F9FAFB"/>
+            <w:tcBorders>
+              <w:top w:val="single" w:sz="4" w:space="0" w:color="CCCCCC"/>
+              <w:left w:val="single" w:sz="4" w:space="0" w:color="CCCCCC"/>
+              <w:bottom w:val="single" w:sz="4" w:space="0" w:color="CCCCCC"/>
+              <w:right w:val="single" w:sz="4" w:space="0" w:color="CCCCCC"/>
+            </w:tcBorders>
+          </w:tcPr>
+          <w:p>
+            <w:r>
+              <w:rPr>
+                <w:b/>
+                <w:color w:val="1F2937"/>
+                <w:sz w:val="20"/>
+              </w:rPr>
+              <w:t>Linked Issues</w:t>
+            </w:r>
+          </w:p>
+        </w:tc>
+        <w:tc>
+          <w:tcPr>
+            <w:tcW w:type="dxa" w:w="8208"/>
+            <w:tcBorders>
+              <w:top w:val="single" w:sz="4" w:space="0" w:color="CCCCCC"/>
+              <w:left w:val="single" w:sz="4" w:space="0" w:color="CCCCCC"/>
+              <w:bottom w:val="single" w:sz="4" w:space="0" w:color="CCCCCC"/>
+              <w:right w:val="single" w:sz="4" w:space="0" w:color="CCCCCC"/>
+            </w:tcBorders>
+          </w:tcPr>
+          <w:p>
+            <w:r>
+              <w:rPr>
+                <w:sz w:val="20"/>
+              </w:rPr>
+              <w:t>0</w:t>
+            </w:r>
+          </w:p>
+        </w:tc>
+      </w:tr>
+      <w:tr>
+        <w:tc>
+          <w:tcPr>
+            <w:tcW w:type="dxa" w:w="2592"/>
+            <w:shd w:val="clear" w:color="auto" w:fill="F9FAFB"/>
+            <w:tcBorders>
+              <w:top w:val="single" w:sz="4" w:space="0" w:color="CCCCCC"/>
+              <w:left w:val="single" w:sz="4" w:space="0" w:color="CCCCCC"/>
+              <w:bottom w:val="single" w:sz="4" w:space="0" w:color="CCCCCC"/>
+              <w:right w:val="single" w:sz="4" w:space="0" w:color="CCCCCC"/>
+            </w:tcBorders>
+          </w:tcPr>
+          <w:p>
+            <w:r>
+              <w:rPr>
+                <w:b/>
+                <w:color w:val="1F2937"/>
+                <w:sz w:val="20"/>
+              </w:rPr>
+              <w:t>PR URL</w:t>
+            </w:r>
+          </w:p>
+        </w:tc>
+        <w:tc>
+          <w:tcPr>
+            <w:tcW w:type="dxa" w:w="8208"/>
+            <w:tcBorders>
+              <w:top w:val="single" w:sz="4" w:space="0" w:color="CCCCCC"/>
+              <w:left w:val="single" w:sz="4" w:space="0" w:color="CCCCCC"/>
+              <w:bottom w:val="single" w:sz="4" w:space="0" w:color="CCCCCC"/>
+              <w:right w:val="single" w:sz="4" w:space="0" w:color="CCCCCC"/>
+            </w:tcBorders>
+          </w:tcPr>
+          <w:p>
+            <w:r>
+              <w:rPr>
+                <w:sz w:val="20"/>
+              </w:rPr>
+              <w:t>https://github.com/Janiyamt/PR-AGENT/pull/8</w:t>
+            </w:r>
+          </w:p>
+        </w:tc>
+      </w:tr>
+    </w:tbl>
+    <w:p>
+      <w:pPr>
+        <w:spacing w:before="160" w:after="40"/>
+      </w:pPr>
+      <w:r>
+        <w:rPr>
+          <w:b/>
+          <w:i w:val="0"/>
+          <w:color w:val="1F2937"/>
+          <w:sz w:val="20"/>
+        </w:rPr>
+        <w:t>Commit Messages:</w:t>
+      </w:r>
+    </w:p>
+    <w:p>
+      <w:pPr>
+        <w:spacing w:before="0" w:after="40"/>
+      </w:pPr>
+      <w:r>
+        <w:rPr>
+          <w:b w:val="0"/>
+          <w:i w:val="0"/>
+          <w:color w:val="6B7280"/>
+          <w:sz w:val="18"/>
+        </w:rPr>
+        <w:t xml:space="preserve">  • Update comment in .gitignore for clarity</w:t>
+      </w:r>
+    </w:p>
+    <w:p>
+      <w:pPr>
+        <w:spacing w:before="0" w:after="40"/>
+      </w:pPr>
+      <w:r>
+        <w:rPr>
+          <w:b w:val="0"/>
+          <w:i w:val="0"/>
+          <w:color w:val="6B7280"/>
+          <w:sz w:val="18"/>
+        </w:rPr>
+        <w:t xml:space="preserve">  • Merge branch 'master' into bot_test</w:t>
+      </w:r>
+    </w:p>
+    <w:p>
+      <w:pPr>
+        <w:spacing w:before="160" w:after="40"/>
+      </w:pPr>
+      <w:r>
+        <w:rPr>
+          <w:b/>
+          <w:i w:val="0"/>
+          <w:color w:val="1F2937"/>
+          <w:sz w:val="20"/>
+        </w:rPr>
+        <w:t>Before → After:</w:t>
+      </w:r>
+    </w:p>
+    <w:p>
+      <w:pPr>
+        <w:spacing w:before="80" w:after="200"/>
+        <w:ind w:left="432"/>
+        <w:pBdr>
+          <w:left w:val="single" w:sz="12" w:space="10" w:color="3B82F6"/>
+        </w:pBdr>
+      </w:pPr>
+      <w:r>
+        <w:rPr>
+          <w:i/>
+          <w:color w:val="1F2937"/>
+          <w:sz w:val="21"/>
+        </w:rPr>
+        <w:t>Before the merge, the comment contained a spelling error ('insatlled'), potentially causing minor confusion for developers reviewing the file. After the merge, the comment is grammatically correct ('installed'), improving readability and clarity without altering any ignored file patterns or project behavior.</w:t>
+      </w:r>
+    </w:p>
+    <w:p>
+      <w:pPr>
+        <w:spacing w:before="120" w:after="40"/>
+      </w:pPr>
+      <w:r>
+        <w:rPr>
+          <w:b/>
+          <w:i w:val="0"/>
+          <w:color w:val="1F2937"/>
+          <w:sz w:val="20"/>
+        </w:rPr>
+        <w:t>Key Impacts:</w:t>
+      </w:r>
+    </w:p>
+    <w:p>
+      <w:pPr>
+        <w:spacing w:before="0" w:after="40"/>
+      </w:pPr>
+      <w:r>
+        <w:rPr>
+          <w:b w:val="0"/>
+          <w:i w:val="0"/>
+          <w:color w:val="6B7280"/>
+          <w:sz w:val="18"/>
+        </w:rPr>
+        <w:t xml:space="preserve">  • No functional impact as it only modifies a comment in .gitignore, not affecting code or build processes.</w:t>
+      </w:r>
+    </w:p>
+    <w:p>
+      <w:pPr>
+        <w:spacing w:before="0" w:after="40"/>
+      </w:pPr>
+      <w:r>
+        <w:rPr>
+          <w:b w:val="0"/>
+          <w:i w:val="0"/>
+          <w:color w:val="6B7280"/>
+          <w:sz w:val="18"/>
+        </w:rPr>
+        <w:t xml:space="preserve">  • Minimal risk since .gitignore comments are non-executable and do not introduce edge cases.</w:t>
+      </w:r>
+    </w:p>
+    <w:p>
+      <w:pPr>
+        <w:spacing w:before="0" w:after="40"/>
+      </w:pPr>
+      <w:r>
+        <w:rPr>
+          <w:b w:val="0"/>
+          <w:i w:val="0"/>
+          <w:color w:val="6B7280"/>
+          <w:sz w:val="18"/>
+        </w:rPr>
+        <w:t xml:space="preserve">  • No performance or security implications from a simple text correction.</w:t>
+      </w:r>
+    </w:p>
+    <w:p>
+      <w:pPr>
+        <w:spacing w:before="120" w:after="40"/>
+      </w:pPr>
+      <w:r>
+        <w:rPr>
+          <w:b/>
+          <w:i w:val="0"/>
+          <w:color w:val="1F2937"/>
+          <w:sz w:val="20"/>
+        </w:rPr>
+        <w:t>Review Notes:</w:t>
+      </w:r>
+    </w:p>
+    <w:p>
+      <w:pPr>
+        <w:spacing w:before="0" w:after="80"/>
+      </w:pPr>
+      <w:r>
+        <w:rPr>
+          <w:b w:val="0"/>
+          <w:i w:val="0"/>
+          <w:color w:val="6B7280"/>
+          <w:sz w:val="18"/>
+        </w:rPr>
+        <w:t>The PR was authored and merged by the same individual without any external approvals or requested changes, indicating a straightforward internal update. No labels were applied, suggesting it was a minor, non-controversial edit.</w:t>
+      </w:r>
+    </w:p>
+    <w:p>
+      <w:pPr>
+        <w:spacing w:before="120" w:after="40"/>
+      </w:pPr>
+      <w:r>
+        <w:rPr>
+          <w:b/>
+          <w:i w:val="0"/>
+          <w:color w:val="1F2937"/>
+          <w:sz w:val="20"/>
+        </w:rPr>
+        <w:t>PR Description:</w:t>
+      </w:r>
+    </w:p>
+    <w:p>
+      <w:pPr>
+        <w:spacing w:before="0" w:after="120"/>
+      </w:pPr>
+      <w:r>
+        <w:rPr>
+          <w:b w:val="0"/>
+          <w:i w:val="0"/>
+          <w:color w:val="6B7280"/>
+          <w:sz w:val="18"/>
+        </w:rPr>
+        <w:t>now it installs the oci and can use oci services</w:t>
+      </w:r>
+    </w:p>
+    <w:p>
+      <w:pPr>
+        <w:spacing w:before="120" w:after="40"/>
+      </w:pPr>
+      <w:r>
+        <w:rPr>
+          <w:b/>
+          <w:i w:val="0"/>
+          <w:color w:val="1F2937"/>
+          <w:sz w:val="20"/>
+        </w:rPr>
+        <w:t>Files Changed:</w:t>
+      </w:r>
+    </w:p>
+    <w:p>
+      <w:pPr>
+        <w:spacing w:before="0" w:after="20"/>
+      </w:pPr>
+      <w:r>
+        <w:rPr>
+          <w:b w:val="0"/>
+          <w:i w:val="0"/>
+          <w:color w:val="6B7280"/>
+          <w:sz w:val="16"/>
+        </w:rPr>
+        <w:t xml:space="preserve">  .gitignore</w:t>
+      </w:r>
+    </w:p>
+    <w:p>
+      <w:pPr>
+        <w:spacing w:before="120" w:after="40"/>
+      </w:pPr>
+      <w:r>
+        <w:rPr>
+          <w:b/>
+          <w:i w:val="0"/>
+          <w:color w:val="1F2937"/>
+          <w:sz w:val="20"/>
+        </w:rPr>
+        <w:t>Code Diffs (sample):</w:t>
+      </w:r>
+    </w:p>
+    <w:p>
+      <w:pPr>
+        <w:spacing w:before="80" w:after="40"/>
+      </w:pPr>
+      <w:r>
+        <w:rPr>
+          <w:b/>
+          <w:i w:val="0"/>
+          <w:color w:val="1E3A5F"/>
+          <w:sz w:val="18"/>
+        </w:rPr>
+        <w:t>MODIFIED: .gitignore  (+2 / -1)</w:t>
+      </w:r>
+    </w:p>
+    <w:p>
+      <w:pPr>
+        <w:spacing w:before="0" w:after="80"/>
+      </w:pPr>
+      <w:r>
+        <w:rPr>
+          <w:b w:val="0"/>
+          <w:i w:val="0"/>
+          <w:color w:val="6B7280"/>
+          <w:sz w:val="16"/>
+        </w:rPr>
+        <w:t>@@ -4,4 +4,5 @@ pr_report.docx</w:t>
+        <w:br/>
+        <w:t xml:space="preserve"> venv/</w:t>
+        <w:br/>
+        <w:t xml:space="preserve"> .venv/</w:t>
+        <w:br/>
+        <w:t xml:space="preserve"> config.py</w:t>
+        <w:br/>
+        <w:t>-# everything works well with oci services as it will be insatlled now</w:t>
+        <w:br/>
+        <w:t>+#everything works well with oci services as it is installed now</w:t>
+        <w:br/>
+        <w:t xml:space="preserve">+# </w:t>
+      </w:r>
+    </w:p>
+    <w:p>
+      <w:pPr>
+        <w:spacing w:before="80" w:after="80"/>
+        <w:pBdr>
+          <w:bottom w:val="single" w:sz="4" w:space="1" w:color="E5E7EB"/>
+        </w:pBdr>
+      </w:pPr>
     </w:p>
     <w:p>
       <w:pPr>
@@ -4006,7 +4963,7 @@
           <w:color w:val="9CA3AF"/>
           <w:sz w:val="18"/>
         </w:rPr>
-        <w:t>Merge Events Report  •  Generated by PR-Agent v2  •  March 04, 2026 at 05:56 UTC</w:t>
+        <w:t>Merge Events Report  •  Generated by PR-Agent v2  •  March 04, 2026 at 06:06 UTC</w:t>
       </w:r>
     </w:p>
     <w:sectPr>

</xml_diff>

<commit_message>
chore: log merge event for 01ce25728395d068874099e904c1db787bc3bf6c
</commit_message>
<xml_diff>
--- a/merge_agent/logs/merge-events-report.docx
+++ b/merge_agent/logs/merge-events-report.docx
@@ -44,7 +44,7 @@
           <w:color w:val="9CA3AF"/>
           <w:sz w:val="20"/>
         </w:rPr>
-        <w:t>Generated: March 04, 2026 at 06:06 UTC  •  5 merge events on record</w:t>
+        <w:t>Generated: March 04, 2026 at 10:53 UTC  •  6 merge events on record</w:t>
       </w:r>
     </w:p>
     <w:p>
@@ -104,7 +104,7 @@
                 <w:color w:val="1E3A5F"/>
                 <w:sz w:val="36"/>
               </w:rPr>
-              <w:t>5</w:t>
+              <w:t>6</w:t>
             </w:r>
           </w:p>
         </w:tc>
@@ -129,7 +129,7 @@
                 <w:color w:val="059669"/>
                 <w:sz w:val="36"/>
               </w:rPr>
-              <w:t>1</w:t>
+              <w:t>2</w:t>
             </w:r>
           </w:p>
         </w:tc>
@@ -154,7 +154,7 @@
                 <w:color w:val="7C3AED"/>
                 <w:sz w:val="36"/>
               </w:rPr>
-              <w:t>1</w:t>
+              <w:t>2</w:t>
             </w:r>
           </w:p>
         </w:tc>
@@ -179,7 +179,7 @@
                 <w:color w:val="D97706"/>
                 <w:sz w:val="36"/>
               </w:rPr>
-              <w:t>+9/6</w:t>
+              <w:t>+10/7</w:t>
             </w:r>
           </w:p>
         </w:tc>
@@ -308,6 +308,37 @@
           <w:sz w:val="32"/>
         </w:rPr>
         <w:t>AI Summaries</w:t>
+      </w:r>
+    </w:p>
+    <w:p>
+      <w:pPr>
+        <w:spacing w:before="0" w:after="40"/>
+      </w:pPr>
+      <w:r>
+        <w:rPr>
+          <w:b/>
+          <w:i w:val="0"/>
+          <w:color w:val="1F2937"/>
+          <w:sz w:val="20"/>
+        </w:rPr>
+        <w:t>PR #11 — Update .gitignore with testing comment</w:t>
+      </w:r>
+    </w:p>
+    <w:p>
+      <w:pPr>
+        <w:spacing w:before="80" w:after="200"/>
+        <w:ind w:left="432"/>
+        <w:pBdr>
+          <w:left w:val="single" w:sz="12" w:space="10" w:color="3B82F6"/>
+        </w:pBdr>
+      </w:pPr>
+      <w:r>
+        <w:rPr>
+          <w:i/>
+          <w:color w:val="1F2937"/>
+          <w:sz w:val="21"/>
+        </w:rPr>
+        <w:t>This pull request updated the .gitignore file by modifying a comment related to testing and OCI services. The change replaced a blank comment line with a new note instructing not to add comments simply, likely to maintain a cleaner or more standardized ignore file. The purpose appears to be improving documentation clarity in the project's configuration without altering functionality.</w:t>
       </w:r>
     </w:p>
     <w:p>
@@ -486,6 +517,902 @@
         </w:rPr>
         <w:t>Merge Event Details</w:t>
       </w:r>
+    </w:p>
+    <w:p>
+      <w:pPr>
+        <w:spacing w:before="280" w:after="80"/>
+      </w:pPr>
+      <w:r>
+        <w:rPr>
+          <w:b/>
+          <w:color w:val="6B7280"/>
+          <w:sz w:val="26"/>
+        </w:rPr>
+        <w:t xml:space="preserve">PR #11 — </w:t>
+      </w:r>
+      <w:r>
+        <w:rPr>
+          <w:b/>
+          <w:color w:val="1F2937"/>
+          <w:sz w:val="26"/>
+        </w:rPr>
+        <w:t>Update .gitignore with testing comment</w:t>
+      </w:r>
+    </w:p>
+    <w:p>
+      <w:pPr>
+        <w:spacing w:before="80" w:after="200"/>
+        <w:ind w:left="432"/>
+        <w:pBdr>
+          <w:left w:val="single" w:sz="12" w:space="10" w:color="10B981"/>
+        </w:pBdr>
+      </w:pPr>
+      <w:r>
+        <w:rPr>
+          <w:i/>
+          <w:color w:val="1F2937"/>
+          <w:sz w:val="21"/>
+        </w:rPr>
+        <w:t>💡 This pull request updated the .gitignore file by modifying a comment related to testing and OCI services. The change replaced a blank comment line with a new note instructing not to add comments simply, likely to maintain a cleaner or more standardized ignore file. The purpose appears to be improving documentation clarity in the project's configuration without altering functionality.</w:t>
+      </w:r>
+    </w:p>
+    <w:tbl>
+      <w:tblPr>
+        <w:tblStyle w:val="TableGrid"/>
+        <w:tblW w:type="auto" w:w="0"/>
+        <w:tblLook w:firstColumn="1" w:firstRow="1" w:lastColumn="0" w:lastRow="0" w:noHBand="0" w:noVBand="1" w:val="04A0"/>
+      </w:tblPr>
+      <w:tblGrid>
+        <w:gridCol w:w="4680"/>
+        <w:gridCol w:w="4680"/>
+      </w:tblGrid>
+      <w:tr>
+        <w:tc>
+          <w:tcPr>
+            <w:tcW w:type="dxa" w:w="2592"/>
+            <w:shd w:val="clear" w:color="auto" w:fill="F9FAFB"/>
+            <w:tcBorders>
+              <w:top w:val="single" w:sz="4" w:space="0" w:color="CCCCCC"/>
+              <w:left w:val="single" w:sz="4" w:space="0" w:color="CCCCCC"/>
+              <w:bottom w:val="single" w:sz="4" w:space="0" w:color="CCCCCC"/>
+              <w:right w:val="single" w:sz="4" w:space="0" w:color="CCCCCC"/>
+            </w:tcBorders>
+          </w:tcPr>
+          <w:p>
+            <w:r>
+              <w:rPr>
+                <w:b/>
+                <w:color w:val="1F2937"/>
+                <w:sz w:val="20"/>
+              </w:rPr>
+              <w:t>PR Author</w:t>
+            </w:r>
+          </w:p>
+        </w:tc>
+        <w:tc>
+          <w:tcPr>
+            <w:tcW w:type="dxa" w:w="8208"/>
+            <w:tcBorders>
+              <w:top w:val="single" w:sz="4" w:space="0" w:color="CCCCCC"/>
+              <w:left w:val="single" w:sz="4" w:space="0" w:color="CCCCCC"/>
+              <w:bottom w:val="single" w:sz="4" w:space="0" w:color="CCCCCC"/>
+              <w:right w:val="single" w:sz="4" w:space="0" w:color="CCCCCC"/>
+            </w:tcBorders>
+          </w:tcPr>
+          <w:p>
+            <w:r>
+              <w:rPr>
+                <w:sz w:val="20"/>
+              </w:rPr>
+              <w:t>Janiyamt</w:t>
+            </w:r>
+          </w:p>
+        </w:tc>
+      </w:tr>
+      <w:tr>
+        <w:tc>
+          <w:tcPr>
+            <w:tcW w:type="dxa" w:w="2592"/>
+            <w:shd w:val="clear" w:color="auto" w:fill="F9FAFB"/>
+            <w:tcBorders>
+              <w:top w:val="single" w:sz="4" w:space="0" w:color="CCCCCC"/>
+              <w:left w:val="single" w:sz="4" w:space="0" w:color="CCCCCC"/>
+              <w:bottom w:val="single" w:sz="4" w:space="0" w:color="CCCCCC"/>
+              <w:right w:val="single" w:sz="4" w:space="0" w:color="CCCCCC"/>
+            </w:tcBorders>
+          </w:tcPr>
+          <w:p>
+            <w:r>
+              <w:rPr>
+                <w:b/>
+                <w:color w:val="1F2937"/>
+                <w:sz w:val="20"/>
+              </w:rPr>
+              <w:t>Merged By</w:t>
+            </w:r>
+          </w:p>
+        </w:tc>
+        <w:tc>
+          <w:tcPr>
+            <w:tcW w:type="dxa" w:w="8208"/>
+            <w:tcBorders>
+              <w:top w:val="single" w:sz="4" w:space="0" w:color="CCCCCC"/>
+              <w:left w:val="single" w:sz="4" w:space="0" w:color="CCCCCC"/>
+              <w:bottom w:val="single" w:sz="4" w:space="0" w:color="CCCCCC"/>
+              <w:right w:val="single" w:sz="4" w:space="0" w:color="CCCCCC"/>
+            </w:tcBorders>
+          </w:tcPr>
+          <w:p>
+            <w:r>
+              <w:rPr>
+                <w:sz w:val="20"/>
+              </w:rPr>
+              <w:t>Janiyamt</w:t>
+            </w:r>
+          </w:p>
+        </w:tc>
+      </w:tr>
+      <w:tr>
+        <w:tc>
+          <w:tcPr>
+            <w:tcW w:type="dxa" w:w="2592"/>
+            <w:shd w:val="clear" w:color="auto" w:fill="F9FAFB"/>
+            <w:tcBorders>
+              <w:top w:val="single" w:sz="4" w:space="0" w:color="CCCCCC"/>
+              <w:left w:val="single" w:sz="4" w:space="0" w:color="CCCCCC"/>
+              <w:bottom w:val="single" w:sz="4" w:space="0" w:color="CCCCCC"/>
+              <w:right w:val="single" w:sz="4" w:space="0" w:color="CCCCCC"/>
+            </w:tcBorders>
+          </w:tcPr>
+          <w:p>
+            <w:r>
+              <w:rPr>
+                <w:b/>
+                <w:color w:val="1F2937"/>
+                <w:sz w:val="20"/>
+              </w:rPr>
+              <w:t>Merged At</w:t>
+            </w:r>
+          </w:p>
+        </w:tc>
+        <w:tc>
+          <w:tcPr>
+            <w:tcW w:type="dxa" w:w="8208"/>
+            <w:tcBorders>
+              <w:top w:val="single" w:sz="4" w:space="0" w:color="CCCCCC"/>
+              <w:left w:val="single" w:sz="4" w:space="0" w:color="CCCCCC"/>
+              <w:bottom w:val="single" w:sz="4" w:space="0" w:color="CCCCCC"/>
+              <w:right w:val="single" w:sz="4" w:space="0" w:color="CCCCCC"/>
+            </w:tcBorders>
+          </w:tcPr>
+          <w:p>
+            <w:r>
+              <w:rPr>
+                <w:sz w:val="20"/>
+              </w:rPr>
+              <w:t>2026-03-04 10:52:56</w:t>
+            </w:r>
+          </w:p>
+        </w:tc>
+      </w:tr>
+      <w:tr>
+        <w:tc>
+          <w:tcPr>
+            <w:tcW w:type="dxa" w:w="2592"/>
+            <w:shd w:val="clear" w:color="auto" w:fill="F9FAFB"/>
+            <w:tcBorders>
+              <w:top w:val="single" w:sz="4" w:space="0" w:color="CCCCCC"/>
+              <w:left w:val="single" w:sz="4" w:space="0" w:color="CCCCCC"/>
+              <w:bottom w:val="single" w:sz="4" w:space="0" w:color="CCCCCC"/>
+              <w:right w:val="single" w:sz="4" w:space="0" w:color="CCCCCC"/>
+            </w:tcBorders>
+          </w:tcPr>
+          <w:p>
+            <w:r>
+              <w:rPr>
+                <w:b/>
+                <w:color w:val="1F2937"/>
+                <w:sz w:val="20"/>
+              </w:rPr>
+              <w:t>Merge Commit</w:t>
+            </w:r>
+          </w:p>
+        </w:tc>
+        <w:tc>
+          <w:tcPr>
+            <w:tcW w:type="dxa" w:w="8208"/>
+            <w:tcBorders>
+              <w:top w:val="single" w:sz="4" w:space="0" w:color="CCCCCC"/>
+              <w:left w:val="single" w:sz="4" w:space="0" w:color="CCCCCC"/>
+              <w:bottom w:val="single" w:sz="4" w:space="0" w:color="CCCCCC"/>
+              <w:right w:val="single" w:sz="4" w:space="0" w:color="CCCCCC"/>
+            </w:tcBorders>
+          </w:tcPr>
+          <w:p>
+            <w:r>
+              <w:rPr>
+                <w:sz w:val="20"/>
+              </w:rPr>
+              <w:t>01ce25728395...</w:t>
+            </w:r>
+          </w:p>
+        </w:tc>
+      </w:tr>
+      <w:tr>
+        <w:tc>
+          <w:tcPr>
+            <w:tcW w:type="dxa" w:w="2592"/>
+            <w:shd w:val="clear" w:color="auto" w:fill="F9FAFB"/>
+            <w:tcBorders>
+              <w:top w:val="single" w:sz="4" w:space="0" w:color="CCCCCC"/>
+              <w:left w:val="single" w:sz="4" w:space="0" w:color="CCCCCC"/>
+              <w:bottom w:val="single" w:sz="4" w:space="0" w:color="CCCCCC"/>
+              <w:right w:val="single" w:sz="4" w:space="0" w:color="CCCCCC"/>
+            </w:tcBorders>
+          </w:tcPr>
+          <w:p>
+            <w:r>
+              <w:rPr>
+                <w:b/>
+                <w:color w:val="1F2937"/>
+                <w:sz w:val="20"/>
+              </w:rPr>
+              <w:t>Branch</w:t>
+            </w:r>
+          </w:p>
+        </w:tc>
+        <w:tc>
+          <w:tcPr>
+            <w:tcW w:type="dxa" w:w="8208"/>
+            <w:tcBorders>
+              <w:top w:val="single" w:sz="4" w:space="0" w:color="CCCCCC"/>
+              <w:left w:val="single" w:sz="4" w:space="0" w:color="CCCCCC"/>
+              <w:bottom w:val="single" w:sz="4" w:space="0" w:color="CCCCCC"/>
+              <w:right w:val="single" w:sz="4" w:space="0" w:color="CCCCCC"/>
+            </w:tcBorders>
+          </w:tcPr>
+          <w:p>
+            <w:r>
+              <w:rPr>
+                <w:sz w:val="20"/>
+              </w:rPr>
+              <w:t>bot_test → master</w:t>
+            </w:r>
+          </w:p>
+        </w:tc>
+      </w:tr>
+      <w:tr>
+        <w:tc>
+          <w:tcPr>
+            <w:tcW w:type="dxa" w:w="2592"/>
+            <w:shd w:val="clear" w:color="auto" w:fill="F9FAFB"/>
+            <w:tcBorders>
+              <w:top w:val="single" w:sz="4" w:space="0" w:color="CCCCCC"/>
+              <w:left w:val="single" w:sz="4" w:space="0" w:color="CCCCCC"/>
+              <w:bottom w:val="single" w:sz="4" w:space="0" w:color="CCCCCC"/>
+              <w:right w:val="single" w:sz="4" w:space="0" w:color="CCCCCC"/>
+            </w:tcBorders>
+          </w:tcPr>
+          <w:p>
+            <w:r>
+              <w:rPr>
+                <w:b/>
+                <w:color w:val="1F2937"/>
+                <w:sz w:val="20"/>
+              </w:rPr>
+              <w:t>Labels</w:t>
+            </w:r>
+          </w:p>
+        </w:tc>
+        <w:tc>
+          <w:tcPr>
+            <w:tcW w:type="dxa" w:w="8208"/>
+            <w:tcBorders>
+              <w:top w:val="single" w:sz="4" w:space="0" w:color="CCCCCC"/>
+              <w:left w:val="single" w:sz="4" w:space="0" w:color="CCCCCC"/>
+              <w:bottom w:val="single" w:sz="4" w:space="0" w:color="CCCCCC"/>
+              <w:right w:val="single" w:sz="4" w:space="0" w:color="CCCCCC"/>
+            </w:tcBorders>
+          </w:tcPr>
+          <w:p>
+            <w:r>
+              <w:rPr>
+                <w:sz w:val="20"/>
+              </w:rPr>
+              <w:t>None</w:t>
+            </w:r>
+          </w:p>
+        </w:tc>
+      </w:tr>
+      <w:tr>
+        <w:tc>
+          <w:tcPr>
+            <w:tcW w:type="dxa" w:w="2592"/>
+            <w:shd w:val="clear" w:color="auto" w:fill="F9FAFB"/>
+            <w:tcBorders>
+              <w:top w:val="single" w:sz="4" w:space="0" w:color="CCCCCC"/>
+              <w:left w:val="single" w:sz="4" w:space="0" w:color="CCCCCC"/>
+              <w:bottom w:val="single" w:sz="4" w:space="0" w:color="CCCCCC"/>
+              <w:right w:val="single" w:sz="4" w:space="0" w:color="CCCCCC"/>
+            </w:tcBorders>
+          </w:tcPr>
+          <w:p>
+            <w:r>
+              <w:rPr>
+                <w:b/>
+                <w:color w:val="1F2937"/>
+                <w:sz w:val="20"/>
+              </w:rPr>
+              <w:t>Code Delta</w:t>
+            </w:r>
+          </w:p>
+        </w:tc>
+        <w:tc>
+          <w:tcPr>
+            <w:tcW w:type="dxa" w:w="8208"/>
+            <w:tcBorders>
+              <w:top w:val="single" w:sz="4" w:space="0" w:color="CCCCCC"/>
+              <w:left w:val="single" w:sz="4" w:space="0" w:color="CCCCCC"/>
+              <w:bottom w:val="single" w:sz="4" w:space="0" w:color="CCCCCC"/>
+              <w:right w:val="single" w:sz="4" w:space="0" w:color="CCCCCC"/>
+            </w:tcBorders>
+          </w:tcPr>
+          <w:p>
+            <w:r>
+              <w:rPr>
+                <w:sz w:val="20"/>
+              </w:rPr>
+              <w:t>+1 / -1 lines</w:t>
+            </w:r>
+          </w:p>
+        </w:tc>
+      </w:tr>
+      <w:tr>
+        <w:tc>
+          <w:tcPr>
+            <w:tcW w:type="dxa" w:w="2592"/>
+            <w:shd w:val="clear" w:color="auto" w:fill="F9FAFB"/>
+            <w:tcBorders>
+              <w:top w:val="single" w:sz="4" w:space="0" w:color="CCCCCC"/>
+              <w:left w:val="single" w:sz="4" w:space="0" w:color="CCCCCC"/>
+              <w:bottom w:val="single" w:sz="4" w:space="0" w:color="CCCCCC"/>
+              <w:right w:val="single" w:sz="4" w:space="0" w:color="CCCCCC"/>
+            </w:tcBorders>
+          </w:tcPr>
+          <w:p>
+            <w:r>
+              <w:rPr>
+                <w:b/>
+                <w:color w:val="1F2937"/>
+                <w:sz w:val="20"/>
+              </w:rPr>
+              <w:t>Commits</w:t>
+            </w:r>
+          </w:p>
+        </w:tc>
+        <w:tc>
+          <w:tcPr>
+            <w:tcW w:type="dxa" w:w="8208"/>
+            <w:tcBorders>
+              <w:top w:val="single" w:sz="4" w:space="0" w:color="CCCCCC"/>
+              <w:left w:val="single" w:sz="4" w:space="0" w:color="CCCCCC"/>
+              <w:bottom w:val="single" w:sz="4" w:space="0" w:color="CCCCCC"/>
+              <w:right w:val="single" w:sz="4" w:space="0" w:color="CCCCCC"/>
+            </w:tcBorders>
+          </w:tcPr>
+          <w:p>
+            <w:r>
+              <w:rPr>
+                <w:sz w:val="20"/>
+              </w:rPr>
+              <w:t>2</w:t>
+            </w:r>
+          </w:p>
+        </w:tc>
+      </w:tr>
+      <w:tr>
+        <w:tc>
+          <w:tcPr>
+            <w:tcW w:type="dxa" w:w="2592"/>
+            <w:shd w:val="clear" w:color="auto" w:fill="F9FAFB"/>
+            <w:tcBorders>
+              <w:top w:val="single" w:sz="4" w:space="0" w:color="CCCCCC"/>
+              <w:left w:val="single" w:sz="4" w:space="0" w:color="CCCCCC"/>
+              <w:bottom w:val="single" w:sz="4" w:space="0" w:color="CCCCCC"/>
+              <w:right w:val="single" w:sz="4" w:space="0" w:color="CCCCCC"/>
+            </w:tcBorders>
+          </w:tcPr>
+          <w:p>
+            <w:r>
+              <w:rPr>
+                <w:b/>
+                <w:color w:val="1F2937"/>
+                <w:sz w:val="20"/>
+              </w:rPr>
+              <w:t>Files Changed</w:t>
+            </w:r>
+          </w:p>
+        </w:tc>
+        <w:tc>
+          <w:tcPr>
+            <w:tcW w:type="dxa" w:w="8208"/>
+            <w:tcBorders>
+              <w:top w:val="single" w:sz="4" w:space="0" w:color="CCCCCC"/>
+              <w:left w:val="single" w:sz="4" w:space="0" w:color="CCCCCC"/>
+              <w:bottom w:val="single" w:sz="4" w:space="0" w:color="CCCCCC"/>
+              <w:right w:val="single" w:sz="4" w:space="0" w:color="CCCCCC"/>
+            </w:tcBorders>
+          </w:tcPr>
+          <w:p>
+            <w:r>
+              <w:rPr>
+                <w:sz w:val="20"/>
+              </w:rPr>
+              <w:t>1</w:t>
+            </w:r>
+          </w:p>
+        </w:tc>
+      </w:tr>
+      <w:tr>
+        <w:tc>
+          <w:tcPr>
+            <w:tcW w:type="dxa" w:w="2592"/>
+            <w:shd w:val="clear" w:color="auto" w:fill="F9FAFB"/>
+            <w:tcBorders>
+              <w:top w:val="single" w:sz="4" w:space="0" w:color="CCCCCC"/>
+              <w:left w:val="single" w:sz="4" w:space="0" w:color="CCCCCC"/>
+              <w:bottom w:val="single" w:sz="4" w:space="0" w:color="CCCCCC"/>
+              <w:right w:val="single" w:sz="4" w:space="0" w:color="CCCCCC"/>
+            </w:tcBorders>
+          </w:tcPr>
+          <w:p>
+            <w:r>
+              <w:rPr>
+                <w:b/>
+                <w:color w:val="1F2937"/>
+                <w:sz w:val="20"/>
+              </w:rPr>
+              <w:t>Approvals</w:t>
+            </w:r>
+          </w:p>
+        </w:tc>
+        <w:tc>
+          <w:tcPr>
+            <w:tcW w:type="dxa" w:w="8208"/>
+            <w:tcBorders>
+              <w:top w:val="single" w:sz="4" w:space="0" w:color="CCCCCC"/>
+              <w:left w:val="single" w:sz="4" w:space="0" w:color="CCCCCC"/>
+              <w:bottom w:val="single" w:sz="4" w:space="0" w:color="CCCCCC"/>
+              <w:right w:val="single" w:sz="4" w:space="0" w:color="CCCCCC"/>
+            </w:tcBorders>
+          </w:tcPr>
+          <w:p>
+            <w:r>
+              <w:rPr>
+                <w:sz w:val="20"/>
+              </w:rPr>
+              <w:t>None</w:t>
+            </w:r>
+          </w:p>
+        </w:tc>
+      </w:tr>
+      <w:tr>
+        <w:tc>
+          <w:tcPr>
+            <w:tcW w:type="dxa" w:w="2592"/>
+            <w:shd w:val="clear" w:color="auto" w:fill="F9FAFB"/>
+            <w:tcBorders>
+              <w:top w:val="single" w:sz="4" w:space="0" w:color="CCCCCC"/>
+              <w:left w:val="single" w:sz="4" w:space="0" w:color="CCCCCC"/>
+              <w:bottom w:val="single" w:sz="4" w:space="0" w:color="CCCCCC"/>
+              <w:right w:val="single" w:sz="4" w:space="0" w:color="CCCCCC"/>
+            </w:tcBorders>
+          </w:tcPr>
+          <w:p>
+            <w:r>
+              <w:rPr>
+                <w:b/>
+                <w:color w:val="1F2937"/>
+                <w:sz w:val="20"/>
+              </w:rPr>
+              <w:t>Changes Requested</w:t>
+            </w:r>
+          </w:p>
+        </w:tc>
+        <w:tc>
+          <w:tcPr>
+            <w:tcW w:type="dxa" w:w="8208"/>
+            <w:tcBorders>
+              <w:top w:val="single" w:sz="4" w:space="0" w:color="CCCCCC"/>
+              <w:left w:val="single" w:sz="4" w:space="0" w:color="CCCCCC"/>
+              <w:bottom w:val="single" w:sz="4" w:space="0" w:color="CCCCCC"/>
+              <w:right w:val="single" w:sz="4" w:space="0" w:color="CCCCCC"/>
+            </w:tcBorders>
+          </w:tcPr>
+          <w:p>
+            <w:r>
+              <w:rPr>
+                <w:sz w:val="20"/>
+              </w:rPr>
+              <w:t>None</w:t>
+            </w:r>
+          </w:p>
+        </w:tc>
+      </w:tr>
+      <w:tr>
+        <w:tc>
+          <w:tcPr>
+            <w:tcW w:type="dxa" w:w="2592"/>
+            <w:shd w:val="clear" w:color="auto" w:fill="F9FAFB"/>
+            <w:tcBorders>
+              <w:top w:val="single" w:sz="4" w:space="0" w:color="CCCCCC"/>
+              <w:left w:val="single" w:sz="4" w:space="0" w:color="CCCCCC"/>
+              <w:bottom w:val="single" w:sz="4" w:space="0" w:color="CCCCCC"/>
+              <w:right w:val="single" w:sz="4" w:space="0" w:color="CCCCCC"/>
+            </w:tcBorders>
+          </w:tcPr>
+          <w:p>
+            <w:r>
+              <w:rPr>
+                <w:b/>
+                <w:color w:val="1F2937"/>
+                <w:sz w:val="20"/>
+              </w:rPr>
+              <w:t>Comments</w:t>
+            </w:r>
+          </w:p>
+        </w:tc>
+        <w:tc>
+          <w:tcPr>
+            <w:tcW w:type="dxa" w:w="8208"/>
+            <w:tcBorders>
+              <w:top w:val="single" w:sz="4" w:space="0" w:color="CCCCCC"/>
+              <w:left w:val="single" w:sz="4" w:space="0" w:color="CCCCCC"/>
+              <w:bottom w:val="single" w:sz="4" w:space="0" w:color="CCCCCC"/>
+              <w:right w:val="single" w:sz="4" w:space="0" w:color="CCCCCC"/>
+            </w:tcBorders>
+          </w:tcPr>
+          <w:p>
+            <w:r>
+              <w:rPr>
+                <w:sz w:val="20"/>
+              </w:rPr>
+              <w:t>0 general  |  0 review</w:t>
+            </w:r>
+          </w:p>
+        </w:tc>
+      </w:tr>
+      <w:tr>
+        <w:tc>
+          <w:tcPr>
+            <w:tcW w:type="dxa" w:w="2592"/>
+            <w:shd w:val="clear" w:color="auto" w:fill="F9FAFB"/>
+            <w:tcBorders>
+              <w:top w:val="single" w:sz="4" w:space="0" w:color="CCCCCC"/>
+              <w:left w:val="single" w:sz="4" w:space="0" w:color="CCCCCC"/>
+              <w:bottom w:val="single" w:sz="4" w:space="0" w:color="CCCCCC"/>
+              <w:right w:val="single" w:sz="4" w:space="0" w:color="CCCCCC"/>
+            </w:tcBorders>
+          </w:tcPr>
+          <w:p>
+            <w:r>
+              <w:rPr>
+                <w:b/>
+                <w:color w:val="1F2937"/>
+                <w:sz w:val="20"/>
+              </w:rPr>
+              <w:t>Linked Issues</w:t>
+            </w:r>
+          </w:p>
+        </w:tc>
+        <w:tc>
+          <w:tcPr>
+            <w:tcW w:type="dxa" w:w="8208"/>
+            <w:tcBorders>
+              <w:top w:val="single" w:sz="4" w:space="0" w:color="CCCCCC"/>
+              <w:left w:val="single" w:sz="4" w:space="0" w:color="CCCCCC"/>
+              <w:bottom w:val="single" w:sz="4" w:space="0" w:color="CCCCCC"/>
+              <w:right w:val="single" w:sz="4" w:space="0" w:color="CCCCCC"/>
+            </w:tcBorders>
+          </w:tcPr>
+          <w:p>
+            <w:r>
+              <w:rPr>
+                <w:sz w:val="20"/>
+              </w:rPr>
+              <w:t>0</w:t>
+            </w:r>
+          </w:p>
+        </w:tc>
+      </w:tr>
+      <w:tr>
+        <w:tc>
+          <w:tcPr>
+            <w:tcW w:type="dxa" w:w="2592"/>
+            <w:shd w:val="clear" w:color="auto" w:fill="F9FAFB"/>
+            <w:tcBorders>
+              <w:top w:val="single" w:sz="4" w:space="0" w:color="CCCCCC"/>
+              <w:left w:val="single" w:sz="4" w:space="0" w:color="CCCCCC"/>
+              <w:bottom w:val="single" w:sz="4" w:space="0" w:color="CCCCCC"/>
+              <w:right w:val="single" w:sz="4" w:space="0" w:color="CCCCCC"/>
+            </w:tcBorders>
+          </w:tcPr>
+          <w:p>
+            <w:r>
+              <w:rPr>
+                <w:b/>
+                <w:color w:val="1F2937"/>
+                <w:sz w:val="20"/>
+              </w:rPr>
+              <w:t>PR URL</w:t>
+            </w:r>
+          </w:p>
+        </w:tc>
+        <w:tc>
+          <w:tcPr>
+            <w:tcW w:type="dxa" w:w="8208"/>
+            <w:tcBorders>
+              <w:top w:val="single" w:sz="4" w:space="0" w:color="CCCCCC"/>
+              <w:left w:val="single" w:sz="4" w:space="0" w:color="CCCCCC"/>
+              <w:bottom w:val="single" w:sz="4" w:space="0" w:color="CCCCCC"/>
+              <w:right w:val="single" w:sz="4" w:space="0" w:color="CCCCCC"/>
+            </w:tcBorders>
+          </w:tcPr>
+          <w:p>
+            <w:r>
+              <w:rPr>
+                <w:sz w:val="20"/>
+              </w:rPr>
+              <w:t>https://github.com/Janiyamt/PR-AGENT/pull/11</w:t>
+            </w:r>
+          </w:p>
+        </w:tc>
+      </w:tr>
+    </w:tbl>
+    <w:p>
+      <w:pPr>
+        <w:spacing w:before="160" w:after="40"/>
+      </w:pPr>
+      <w:r>
+        <w:rPr>
+          <w:b/>
+          <w:i w:val="0"/>
+          <w:color w:val="1F2937"/>
+          <w:sz w:val="20"/>
+        </w:rPr>
+        <w:t>Commit Messages:</w:t>
+      </w:r>
+    </w:p>
+    <w:p>
+      <w:pPr>
+        <w:spacing w:before="0" w:after="40"/>
+      </w:pPr>
+      <w:r>
+        <w:rPr>
+          <w:b w:val="0"/>
+          <w:i w:val="0"/>
+          <w:color w:val="6B7280"/>
+          <w:sz w:val="18"/>
+        </w:rPr>
+        <w:t xml:space="preserve">  • Update .gitignore with testing comment</w:t>
+      </w:r>
+    </w:p>
+    <w:p>
+      <w:pPr>
+        <w:spacing w:before="0" w:after="40"/>
+      </w:pPr>
+      <w:r>
+        <w:rPr>
+          <w:b w:val="0"/>
+          <w:i w:val="0"/>
+          <w:color w:val="6B7280"/>
+          <w:sz w:val="18"/>
+        </w:rPr>
+        <w:t xml:space="preserve">  • Update comment in .gitignore</w:t>
+      </w:r>
+    </w:p>
+    <w:p>
+      <w:pPr>
+        <w:spacing w:before="160" w:after="40"/>
+      </w:pPr>
+      <w:r>
+        <w:rPr>
+          <w:b/>
+          <w:i w:val="0"/>
+          <w:color w:val="1F2937"/>
+          <w:sz w:val="20"/>
+        </w:rPr>
+        <w:t>Before → After:</w:t>
+      </w:r>
+    </w:p>
+    <w:p>
+      <w:pPr>
+        <w:spacing w:before="80" w:after="200"/>
+        <w:ind w:left="432"/>
+        <w:pBdr>
+          <w:left w:val="single" w:sz="12" w:space="10" w:color="3B82F6"/>
+        </w:pBdr>
+      </w:pPr>
+      <w:r>
+        <w:rPr>
+          <w:i/>
+          <w:color w:val="1F2937"/>
+          <w:sz w:val="21"/>
+        </w:rPr>
+        <w:t>Before the merge, the .gitignore included a blank comment line after the OCI services note. After the merge, this was replaced with a directive comment to avoid adding simple comments, resulting in a slightly refined file structure with no change to ignored files or project behavior.</w:t>
+      </w:r>
+    </w:p>
+    <w:p>
+      <w:pPr>
+        <w:spacing w:before="120" w:after="40"/>
+      </w:pPr>
+      <w:r>
+        <w:rPr>
+          <w:b/>
+          <w:i w:val="0"/>
+          <w:color w:val="1F2937"/>
+          <w:sz w:val="20"/>
+        </w:rPr>
+        <w:t>Key Impacts:</w:t>
+      </w:r>
+    </w:p>
+    <w:p>
+      <w:pPr>
+        <w:spacing w:before="0" w:after="40"/>
+      </w:pPr>
+      <w:r>
+        <w:rPr>
+          <w:b w:val="0"/>
+          <w:i w:val="0"/>
+          <w:color w:val="6B7280"/>
+          <w:sz w:val="18"/>
+        </w:rPr>
+        <w:t xml:space="preserve">  • No functional impact, as .gitignore only affects file tracking in version control.</w:t>
+      </w:r>
+    </w:p>
+    <w:p>
+      <w:pPr>
+        <w:spacing w:before="0" w:after="40"/>
+      </w:pPr>
+      <w:r>
+        <w:rPr>
+          <w:b w:val="0"/>
+          <w:i w:val="0"/>
+          <w:color w:val="6B7280"/>
+          <w:sz w:val="18"/>
+        </w:rPr>
+        <w:t xml:space="preserve">  • Low risk; minor comment change unlikely to introduce edge cases or errors.</w:t>
+      </w:r>
+    </w:p>
+    <w:p>
+      <w:pPr>
+        <w:spacing w:before="0" w:after="40"/>
+      </w:pPr>
+      <w:r>
+        <w:rPr>
+          <w:b w:val="0"/>
+          <w:i w:val="0"/>
+          <w:color w:val="6B7280"/>
+          <w:sz w:val="18"/>
+        </w:rPr>
+        <w:t xml:space="preserve">  • No performance or security implications from this non-code documentation tweak.</w:t>
+      </w:r>
+    </w:p>
+    <w:p>
+      <w:pPr>
+        <w:spacing w:before="120" w:after="40"/>
+      </w:pPr>
+      <w:r>
+        <w:rPr>
+          <w:b/>
+          <w:i w:val="0"/>
+          <w:color w:val="1F2937"/>
+          <w:sz w:val="20"/>
+        </w:rPr>
+        <w:t>Review Notes:</w:t>
+      </w:r>
+    </w:p>
+    <w:p>
+      <w:pPr>
+        <w:spacing w:before="0" w:after="80"/>
+      </w:pPr>
+      <w:r>
+        <w:rPr>
+          <w:b w:val="0"/>
+          <w:i w:val="0"/>
+          <w:color w:val="6B7280"/>
+          <w:sz w:val="18"/>
+        </w:rPr>
+        <w:t>The PR was merged by the author without any external approvals or requested changes, indicating a self-reviewed update. No labels or description were provided, suggesting a minor, internal adjustment.</w:t>
+      </w:r>
+    </w:p>
+    <w:p>
+      <w:pPr>
+        <w:spacing w:before="120" w:after="40"/>
+      </w:pPr>
+      <w:r>
+        <w:rPr>
+          <w:b/>
+          <w:i w:val="0"/>
+          <w:color w:val="1F2937"/>
+          <w:sz w:val="20"/>
+        </w:rPr>
+        <w:t>Files Changed:</w:t>
+      </w:r>
+    </w:p>
+    <w:p>
+      <w:pPr>
+        <w:spacing w:before="0" w:after="20"/>
+      </w:pPr>
+      <w:r>
+        <w:rPr>
+          <w:b w:val="0"/>
+          <w:i w:val="0"/>
+          <w:color w:val="6B7280"/>
+          <w:sz w:val="16"/>
+        </w:rPr>
+        <w:t xml:space="preserve">  .gitignore</w:t>
+      </w:r>
+    </w:p>
+    <w:p>
+      <w:pPr>
+        <w:spacing w:before="120" w:after="40"/>
+      </w:pPr>
+      <w:r>
+        <w:rPr>
+          <w:b/>
+          <w:i w:val="0"/>
+          <w:color w:val="1F2937"/>
+          <w:sz w:val="20"/>
+        </w:rPr>
+        <w:t>Code Diffs (sample):</w:t>
+      </w:r>
+    </w:p>
+    <w:p>
+      <w:pPr>
+        <w:spacing w:before="80" w:after="40"/>
+      </w:pPr>
+      <w:r>
+        <w:rPr>
+          <w:b/>
+          <w:i w:val="0"/>
+          <w:color w:val="1E3A5F"/>
+          <w:sz w:val="18"/>
+        </w:rPr>
+        <w:t>MODIFIED: .gitignore  (+1 / -1)</w:t>
+      </w:r>
+    </w:p>
+    <w:p>
+      <w:pPr>
+        <w:spacing w:before="0" w:after="80"/>
+      </w:pPr>
+      <w:r>
+        <w:rPr>
+          <w:b w:val="0"/>
+          <w:i w:val="0"/>
+          <w:color w:val="6B7280"/>
+          <w:sz w:val="16"/>
+        </w:rPr>
+        <w:t>@@ -5,4 +5,4 @@ venv/</w:t>
+        <w:br/>
+        <w:t xml:space="preserve"> .venv/</w:t>
+        <w:br/>
+        <w:t xml:space="preserve"> config.py</w:t>
+        <w:br/>
+        <w:t xml:space="preserve"> #everything works well with oci services as it is installed now</w:t>
+        <w:br/>
+        <w:t xml:space="preserve">-# </w:t>
+        <w:br/>
+        <w:t>+# not to add comments simply</w:t>
+      </w:r>
+    </w:p>
+    <w:p>
+      <w:pPr>
+        <w:spacing w:before="80" w:after="80"/>
+        <w:pBdr>
+          <w:bottom w:val="single" w:sz="4" w:space="1" w:color="E5E7EB"/>
+        </w:pBdr>
+      </w:pPr>
     </w:p>
     <w:p>
       <w:pPr>
@@ -4963,7 +5890,7 @@
           <w:color w:val="9CA3AF"/>
           <w:sz w:val="18"/>
         </w:rPr>
-        <w:t>Merge Events Report  •  Generated by PR-Agent v2  •  March 04, 2026 at 06:06 UTC</w:t>
+        <w:t>Merge Events Report  •  Generated by PR-Agent v2  •  March 04, 2026 at 10:53 UTC</w:t>
       </w:r>
     </w:p>
     <w:sectPr>

</xml_diff>

<commit_message>
chore: log merge event for 31fb8f0a14947c4a63a90f290d1b6dbdbd84c22c
</commit_message>
<xml_diff>
--- a/merge_agent/logs/merge-events-report.docx
+++ b/merge_agent/logs/merge-events-report.docx
@@ -44,7 +44,7 @@
           <w:color w:val="9CA3AF"/>
           <w:sz w:val="20"/>
         </w:rPr>
-        <w:t>Generated: March 04, 2026 at 10:53 UTC  •  6 merge events on record</w:t>
+        <w:t>Generated: March 04, 2026 at 11:52 UTC  •  7 merge events on record</w:t>
       </w:r>
     </w:p>
     <w:p>
@@ -104,7 +104,7 @@
                 <w:color w:val="1E3A5F"/>
                 <w:sz w:val="36"/>
               </w:rPr>
-              <w:t>6</w:t>
+              <w:t>7</w:t>
             </w:r>
           </w:p>
         </w:tc>
@@ -179,7 +179,7 @@
                 <w:color w:val="D97706"/>
                 <w:sz w:val="36"/>
               </w:rPr>
-              <w:t>+10/7</w:t>
+              <w:t>+13/8</w:t>
             </w:r>
           </w:p>
         </w:tc>
@@ -308,6 +308,37 @@
           <w:sz w:val="32"/>
         </w:rPr>
         <w:t>AI Summaries</w:t>
+      </w:r>
+    </w:p>
+    <w:p>
+      <w:pPr>
+        <w:spacing w:before="0" w:after="40"/>
+      </w:pPr>
+      <w:r>
+        <w:rPr>
+          <w:b/>
+          <w:i w:val="0"/>
+          <w:color w:val="1F2937"/>
+          <w:sz w:val="20"/>
+        </w:rPr>
+        <w:t>PR #13 — Bot test</w:t>
+      </w:r>
+    </w:p>
+    <w:p>
+      <w:pPr>
+        <w:spacing w:before="80" w:after="200"/>
+        <w:ind w:left="432"/>
+        <w:pBdr>
+          <w:left w:val="single" w:sz="12" w:space="10" w:color="3B82F6"/>
+        </w:pBdr>
+      </w:pPr>
+      <w:r>
+        <w:rPr>
+          <w:i/>
+          <w:color w:val="1F2937"/>
+          <w:sz w:val="21"/>
+        </w:rPr>
+        <w:t>This pull request updated the .gitignore file by adding and modifying comments for clarity and testing purposes. The changes primarily involved removing an old comment and adding new ones to note the functionality of OCI services and to test the bot's behavior. It appears to be a test submission to verify the PR process without introducing significant code changes.</w:t>
       </w:r>
     </w:p>
     <w:p>
@@ -517,6 +548,934 @@
         </w:rPr>
         <w:t>Merge Event Details</w:t>
       </w:r>
+    </w:p>
+    <w:p>
+      <w:pPr>
+        <w:spacing w:before="280" w:after="80"/>
+      </w:pPr>
+      <w:r>
+        <w:rPr>
+          <w:b/>
+          <w:color w:val="6B7280"/>
+          <w:sz w:val="26"/>
+        </w:rPr>
+        <w:t xml:space="preserve">PR #13 — </w:t>
+      </w:r>
+      <w:r>
+        <w:rPr>
+          <w:b/>
+          <w:color w:val="1F2937"/>
+          <w:sz w:val="26"/>
+        </w:rPr>
+        <w:t>Bot test</w:t>
+      </w:r>
+    </w:p>
+    <w:p>
+      <w:pPr>
+        <w:spacing w:before="80" w:after="200"/>
+        <w:ind w:left="432"/>
+        <w:pBdr>
+          <w:left w:val="single" w:sz="12" w:space="10" w:color="10B981"/>
+        </w:pBdr>
+      </w:pPr>
+      <w:r>
+        <w:rPr>
+          <w:i/>
+          <w:color w:val="1F2937"/>
+          <w:sz w:val="21"/>
+        </w:rPr>
+        <w:t>💡 This pull request updated the .gitignore file by adding and modifying comments for clarity and testing purposes. The changes primarily involved removing an old comment and adding new ones to note the functionality of OCI services and to test the bot's behavior. It appears to be a test submission to verify the PR process without introducing significant code changes.</w:t>
+      </w:r>
+    </w:p>
+    <w:tbl>
+      <w:tblPr>
+        <w:tblStyle w:val="TableGrid"/>
+        <w:tblW w:type="auto" w:w="0"/>
+        <w:tblLook w:firstColumn="1" w:firstRow="1" w:lastColumn="0" w:lastRow="0" w:noHBand="0" w:noVBand="1" w:val="04A0"/>
+      </w:tblPr>
+      <w:tblGrid>
+        <w:gridCol w:w="4680"/>
+        <w:gridCol w:w="4680"/>
+      </w:tblGrid>
+      <w:tr>
+        <w:tc>
+          <w:tcPr>
+            <w:tcW w:type="dxa" w:w="2592"/>
+            <w:shd w:val="clear" w:color="auto" w:fill="F9FAFB"/>
+            <w:tcBorders>
+              <w:top w:val="single" w:sz="4" w:space="0" w:color="CCCCCC"/>
+              <w:left w:val="single" w:sz="4" w:space="0" w:color="CCCCCC"/>
+              <w:bottom w:val="single" w:sz="4" w:space="0" w:color="CCCCCC"/>
+              <w:right w:val="single" w:sz="4" w:space="0" w:color="CCCCCC"/>
+            </w:tcBorders>
+          </w:tcPr>
+          <w:p>
+            <w:r>
+              <w:rPr>
+                <w:b/>
+                <w:color w:val="1F2937"/>
+                <w:sz w:val="20"/>
+              </w:rPr>
+              <w:t>PR Author</w:t>
+            </w:r>
+          </w:p>
+        </w:tc>
+        <w:tc>
+          <w:tcPr>
+            <w:tcW w:type="dxa" w:w="8208"/>
+            <w:tcBorders>
+              <w:top w:val="single" w:sz="4" w:space="0" w:color="CCCCCC"/>
+              <w:left w:val="single" w:sz="4" w:space="0" w:color="CCCCCC"/>
+              <w:bottom w:val="single" w:sz="4" w:space="0" w:color="CCCCCC"/>
+              <w:right w:val="single" w:sz="4" w:space="0" w:color="CCCCCC"/>
+            </w:tcBorders>
+          </w:tcPr>
+          <w:p>
+            <w:r>
+              <w:rPr>
+                <w:sz w:val="20"/>
+              </w:rPr>
+              <w:t>Janiyamt</w:t>
+            </w:r>
+          </w:p>
+        </w:tc>
+      </w:tr>
+      <w:tr>
+        <w:tc>
+          <w:tcPr>
+            <w:tcW w:type="dxa" w:w="2592"/>
+            <w:shd w:val="clear" w:color="auto" w:fill="F9FAFB"/>
+            <w:tcBorders>
+              <w:top w:val="single" w:sz="4" w:space="0" w:color="CCCCCC"/>
+              <w:left w:val="single" w:sz="4" w:space="0" w:color="CCCCCC"/>
+              <w:bottom w:val="single" w:sz="4" w:space="0" w:color="CCCCCC"/>
+              <w:right w:val="single" w:sz="4" w:space="0" w:color="CCCCCC"/>
+            </w:tcBorders>
+          </w:tcPr>
+          <w:p>
+            <w:r>
+              <w:rPr>
+                <w:b/>
+                <w:color w:val="1F2937"/>
+                <w:sz w:val="20"/>
+              </w:rPr>
+              <w:t>Merged By</w:t>
+            </w:r>
+          </w:p>
+        </w:tc>
+        <w:tc>
+          <w:tcPr>
+            <w:tcW w:type="dxa" w:w="8208"/>
+            <w:tcBorders>
+              <w:top w:val="single" w:sz="4" w:space="0" w:color="CCCCCC"/>
+              <w:left w:val="single" w:sz="4" w:space="0" w:color="CCCCCC"/>
+              <w:bottom w:val="single" w:sz="4" w:space="0" w:color="CCCCCC"/>
+              <w:right w:val="single" w:sz="4" w:space="0" w:color="CCCCCC"/>
+            </w:tcBorders>
+          </w:tcPr>
+          <w:p>
+            <w:r>
+              <w:rPr>
+                <w:sz w:val="20"/>
+              </w:rPr>
+              <w:t>Janiyamt</w:t>
+            </w:r>
+          </w:p>
+        </w:tc>
+      </w:tr>
+      <w:tr>
+        <w:tc>
+          <w:tcPr>
+            <w:tcW w:type="dxa" w:w="2592"/>
+            <w:shd w:val="clear" w:color="auto" w:fill="F9FAFB"/>
+            <w:tcBorders>
+              <w:top w:val="single" w:sz="4" w:space="0" w:color="CCCCCC"/>
+              <w:left w:val="single" w:sz="4" w:space="0" w:color="CCCCCC"/>
+              <w:bottom w:val="single" w:sz="4" w:space="0" w:color="CCCCCC"/>
+              <w:right w:val="single" w:sz="4" w:space="0" w:color="CCCCCC"/>
+            </w:tcBorders>
+          </w:tcPr>
+          <w:p>
+            <w:r>
+              <w:rPr>
+                <w:b/>
+                <w:color w:val="1F2937"/>
+                <w:sz w:val="20"/>
+              </w:rPr>
+              <w:t>Merged At</w:t>
+            </w:r>
+          </w:p>
+        </w:tc>
+        <w:tc>
+          <w:tcPr>
+            <w:tcW w:type="dxa" w:w="8208"/>
+            <w:tcBorders>
+              <w:top w:val="single" w:sz="4" w:space="0" w:color="CCCCCC"/>
+              <w:left w:val="single" w:sz="4" w:space="0" w:color="CCCCCC"/>
+              <w:bottom w:val="single" w:sz="4" w:space="0" w:color="CCCCCC"/>
+              <w:right w:val="single" w:sz="4" w:space="0" w:color="CCCCCC"/>
+            </w:tcBorders>
+          </w:tcPr>
+          <w:p>
+            <w:r>
+              <w:rPr>
+                <w:sz w:val="20"/>
+              </w:rPr>
+              <w:t>2026-03-04 11:52:09</w:t>
+            </w:r>
+          </w:p>
+        </w:tc>
+      </w:tr>
+      <w:tr>
+        <w:tc>
+          <w:tcPr>
+            <w:tcW w:type="dxa" w:w="2592"/>
+            <w:shd w:val="clear" w:color="auto" w:fill="F9FAFB"/>
+            <w:tcBorders>
+              <w:top w:val="single" w:sz="4" w:space="0" w:color="CCCCCC"/>
+              <w:left w:val="single" w:sz="4" w:space="0" w:color="CCCCCC"/>
+              <w:bottom w:val="single" w:sz="4" w:space="0" w:color="CCCCCC"/>
+              <w:right w:val="single" w:sz="4" w:space="0" w:color="CCCCCC"/>
+            </w:tcBorders>
+          </w:tcPr>
+          <w:p>
+            <w:r>
+              <w:rPr>
+                <w:b/>
+                <w:color w:val="1F2937"/>
+                <w:sz w:val="20"/>
+              </w:rPr>
+              <w:t>Merge Commit</w:t>
+            </w:r>
+          </w:p>
+        </w:tc>
+        <w:tc>
+          <w:tcPr>
+            <w:tcW w:type="dxa" w:w="8208"/>
+            <w:tcBorders>
+              <w:top w:val="single" w:sz="4" w:space="0" w:color="CCCCCC"/>
+              <w:left w:val="single" w:sz="4" w:space="0" w:color="CCCCCC"/>
+              <w:bottom w:val="single" w:sz="4" w:space="0" w:color="CCCCCC"/>
+              <w:right w:val="single" w:sz="4" w:space="0" w:color="CCCCCC"/>
+            </w:tcBorders>
+          </w:tcPr>
+          <w:p>
+            <w:r>
+              <w:rPr>
+                <w:sz w:val="20"/>
+              </w:rPr>
+              <w:t>31fb8f0a1494...</w:t>
+            </w:r>
+          </w:p>
+        </w:tc>
+      </w:tr>
+      <w:tr>
+        <w:tc>
+          <w:tcPr>
+            <w:tcW w:type="dxa" w:w="2592"/>
+            <w:shd w:val="clear" w:color="auto" w:fill="F9FAFB"/>
+            <w:tcBorders>
+              <w:top w:val="single" w:sz="4" w:space="0" w:color="CCCCCC"/>
+              <w:left w:val="single" w:sz="4" w:space="0" w:color="CCCCCC"/>
+              <w:bottom w:val="single" w:sz="4" w:space="0" w:color="CCCCCC"/>
+              <w:right w:val="single" w:sz="4" w:space="0" w:color="CCCCCC"/>
+            </w:tcBorders>
+          </w:tcPr>
+          <w:p>
+            <w:r>
+              <w:rPr>
+                <w:b/>
+                <w:color w:val="1F2937"/>
+                <w:sz w:val="20"/>
+              </w:rPr>
+              <w:t>Branch</w:t>
+            </w:r>
+          </w:p>
+        </w:tc>
+        <w:tc>
+          <w:tcPr>
+            <w:tcW w:type="dxa" w:w="8208"/>
+            <w:tcBorders>
+              <w:top w:val="single" w:sz="4" w:space="0" w:color="CCCCCC"/>
+              <w:left w:val="single" w:sz="4" w:space="0" w:color="CCCCCC"/>
+              <w:bottom w:val="single" w:sz="4" w:space="0" w:color="CCCCCC"/>
+              <w:right w:val="single" w:sz="4" w:space="0" w:color="CCCCCC"/>
+            </w:tcBorders>
+          </w:tcPr>
+          <w:p>
+            <w:r>
+              <w:rPr>
+                <w:sz w:val="20"/>
+              </w:rPr>
+              <w:t>bot_test → master</w:t>
+            </w:r>
+          </w:p>
+        </w:tc>
+      </w:tr>
+      <w:tr>
+        <w:tc>
+          <w:tcPr>
+            <w:tcW w:type="dxa" w:w="2592"/>
+            <w:shd w:val="clear" w:color="auto" w:fill="F9FAFB"/>
+            <w:tcBorders>
+              <w:top w:val="single" w:sz="4" w:space="0" w:color="CCCCCC"/>
+              <w:left w:val="single" w:sz="4" w:space="0" w:color="CCCCCC"/>
+              <w:bottom w:val="single" w:sz="4" w:space="0" w:color="CCCCCC"/>
+              <w:right w:val="single" w:sz="4" w:space="0" w:color="CCCCCC"/>
+            </w:tcBorders>
+          </w:tcPr>
+          <w:p>
+            <w:r>
+              <w:rPr>
+                <w:b/>
+                <w:color w:val="1F2937"/>
+                <w:sz w:val="20"/>
+              </w:rPr>
+              <w:t>Labels</w:t>
+            </w:r>
+          </w:p>
+        </w:tc>
+        <w:tc>
+          <w:tcPr>
+            <w:tcW w:type="dxa" w:w="8208"/>
+            <w:tcBorders>
+              <w:top w:val="single" w:sz="4" w:space="0" w:color="CCCCCC"/>
+              <w:left w:val="single" w:sz="4" w:space="0" w:color="CCCCCC"/>
+              <w:bottom w:val="single" w:sz="4" w:space="0" w:color="CCCCCC"/>
+              <w:right w:val="single" w:sz="4" w:space="0" w:color="CCCCCC"/>
+            </w:tcBorders>
+          </w:tcPr>
+          <w:p>
+            <w:r>
+              <w:rPr>
+                <w:sz w:val="20"/>
+              </w:rPr>
+              <w:t>None</w:t>
+            </w:r>
+          </w:p>
+        </w:tc>
+      </w:tr>
+      <w:tr>
+        <w:tc>
+          <w:tcPr>
+            <w:tcW w:type="dxa" w:w="2592"/>
+            <w:shd w:val="clear" w:color="auto" w:fill="F9FAFB"/>
+            <w:tcBorders>
+              <w:top w:val="single" w:sz="4" w:space="0" w:color="CCCCCC"/>
+              <w:left w:val="single" w:sz="4" w:space="0" w:color="CCCCCC"/>
+              <w:bottom w:val="single" w:sz="4" w:space="0" w:color="CCCCCC"/>
+              <w:right w:val="single" w:sz="4" w:space="0" w:color="CCCCCC"/>
+            </w:tcBorders>
+          </w:tcPr>
+          <w:p>
+            <w:r>
+              <w:rPr>
+                <w:b/>
+                <w:color w:val="1F2937"/>
+                <w:sz w:val="20"/>
+              </w:rPr>
+              <w:t>Code Delta</w:t>
+            </w:r>
+          </w:p>
+        </w:tc>
+        <w:tc>
+          <w:tcPr>
+            <w:tcW w:type="dxa" w:w="8208"/>
+            <w:tcBorders>
+              <w:top w:val="single" w:sz="4" w:space="0" w:color="CCCCCC"/>
+              <w:left w:val="single" w:sz="4" w:space="0" w:color="CCCCCC"/>
+              <w:bottom w:val="single" w:sz="4" w:space="0" w:color="CCCCCC"/>
+              <w:right w:val="single" w:sz="4" w:space="0" w:color="CCCCCC"/>
+            </w:tcBorders>
+          </w:tcPr>
+          <w:p>
+            <w:r>
+              <w:rPr>
+                <w:sz w:val="20"/>
+              </w:rPr>
+              <w:t>+3 / -1 lines</w:t>
+            </w:r>
+          </w:p>
+        </w:tc>
+      </w:tr>
+      <w:tr>
+        <w:tc>
+          <w:tcPr>
+            <w:tcW w:type="dxa" w:w="2592"/>
+            <w:shd w:val="clear" w:color="auto" w:fill="F9FAFB"/>
+            <w:tcBorders>
+              <w:top w:val="single" w:sz="4" w:space="0" w:color="CCCCCC"/>
+              <w:left w:val="single" w:sz="4" w:space="0" w:color="CCCCCC"/>
+              <w:bottom w:val="single" w:sz="4" w:space="0" w:color="CCCCCC"/>
+              <w:right w:val="single" w:sz="4" w:space="0" w:color="CCCCCC"/>
+            </w:tcBorders>
+          </w:tcPr>
+          <w:p>
+            <w:r>
+              <w:rPr>
+                <w:b/>
+                <w:color w:val="1F2937"/>
+                <w:sz w:val="20"/>
+              </w:rPr>
+              <w:t>Commits</w:t>
+            </w:r>
+          </w:p>
+        </w:tc>
+        <w:tc>
+          <w:tcPr>
+            <w:tcW w:type="dxa" w:w="8208"/>
+            <w:tcBorders>
+              <w:top w:val="single" w:sz="4" w:space="0" w:color="CCCCCC"/>
+              <w:left w:val="single" w:sz="4" w:space="0" w:color="CCCCCC"/>
+              <w:bottom w:val="single" w:sz="4" w:space="0" w:color="CCCCCC"/>
+              <w:right w:val="single" w:sz="4" w:space="0" w:color="CCCCCC"/>
+            </w:tcBorders>
+          </w:tcPr>
+          <w:p>
+            <w:r>
+              <w:rPr>
+                <w:sz w:val="20"/>
+              </w:rPr>
+              <w:t>4</w:t>
+            </w:r>
+          </w:p>
+        </w:tc>
+      </w:tr>
+      <w:tr>
+        <w:tc>
+          <w:tcPr>
+            <w:tcW w:type="dxa" w:w="2592"/>
+            <w:shd w:val="clear" w:color="auto" w:fill="F9FAFB"/>
+            <w:tcBorders>
+              <w:top w:val="single" w:sz="4" w:space="0" w:color="CCCCCC"/>
+              <w:left w:val="single" w:sz="4" w:space="0" w:color="CCCCCC"/>
+              <w:bottom w:val="single" w:sz="4" w:space="0" w:color="CCCCCC"/>
+              <w:right w:val="single" w:sz="4" w:space="0" w:color="CCCCCC"/>
+            </w:tcBorders>
+          </w:tcPr>
+          <w:p>
+            <w:r>
+              <w:rPr>
+                <w:b/>
+                <w:color w:val="1F2937"/>
+                <w:sz w:val="20"/>
+              </w:rPr>
+              <w:t>Files Changed</w:t>
+            </w:r>
+          </w:p>
+        </w:tc>
+        <w:tc>
+          <w:tcPr>
+            <w:tcW w:type="dxa" w:w="8208"/>
+            <w:tcBorders>
+              <w:top w:val="single" w:sz="4" w:space="0" w:color="CCCCCC"/>
+              <w:left w:val="single" w:sz="4" w:space="0" w:color="CCCCCC"/>
+              <w:bottom w:val="single" w:sz="4" w:space="0" w:color="CCCCCC"/>
+              <w:right w:val="single" w:sz="4" w:space="0" w:color="CCCCCC"/>
+            </w:tcBorders>
+          </w:tcPr>
+          <w:p>
+            <w:r>
+              <w:rPr>
+                <w:sz w:val="20"/>
+              </w:rPr>
+              <w:t>1</w:t>
+            </w:r>
+          </w:p>
+        </w:tc>
+      </w:tr>
+      <w:tr>
+        <w:tc>
+          <w:tcPr>
+            <w:tcW w:type="dxa" w:w="2592"/>
+            <w:shd w:val="clear" w:color="auto" w:fill="F9FAFB"/>
+            <w:tcBorders>
+              <w:top w:val="single" w:sz="4" w:space="0" w:color="CCCCCC"/>
+              <w:left w:val="single" w:sz="4" w:space="0" w:color="CCCCCC"/>
+              <w:bottom w:val="single" w:sz="4" w:space="0" w:color="CCCCCC"/>
+              <w:right w:val="single" w:sz="4" w:space="0" w:color="CCCCCC"/>
+            </w:tcBorders>
+          </w:tcPr>
+          <w:p>
+            <w:r>
+              <w:rPr>
+                <w:b/>
+                <w:color w:val="1F2937"/>
+                <w:sz w:val="20"/>
+              </w:rPr>
+              <w:t>Approvals</w:t>
+            </w:r>
+          </w:p>
+        </w:tc>
+        <w:tc>
+          <w:tcPr>
+            <w:tcW w:type="dxa" w:w="8208"/>
+            <w:tcBorders>
+              <w:top w:val="single" w:sz="4" w:space="0" w:color="CCCCCC"/>
+              <w:left w:val="single" w:sz="4" w:space="0" w:color="CCCCCC"/>
+              <w:bottom w:val="single" w:sz="4" w:space="0" w:color="CCCCCC"/>
+              <w:right w:val="single" w:sz="4" w:space="0" w:color="CCCCCC"/>
+            </w:tcBorders>
+          </w:tcPr>
+          <w:p>
+            <w:r>
+              <w:rPr>
+                <w:sz w:val="20"/>
+              </w:rPr>
+              <w:t>None</w:t>
+            </w:r>
+          </w:p>
+        </w:tc>
+      </w:tr>
+      <w:tr>
+        <w:tc>
+          <w:tcPr>
+            <w:tcW w:type="dxa" w:w="2592"/>
+            <w:shd w:val="clear" w:color="auto" w:fill="F9FAFB"/>
+            <w:tcBorders>
+              <w:top w:val="single" w:sz="4" w:space="0" w:color="CCCCCC"/>
+              <w:left w:val="single" w:sz="4" w:space="0" w:color="CCCCCC"/>
+              <w:bottom w:val="single" w:sz="4" w:space="0" w:color="CCCCCC"/>
+              <w:right w:val="single" w:sz="4" w:space="0" w:color="CCCCCC"/>
+            </w:tcBorders>
+          </w:tcPr>
+          <w:p>
+            <w:r>
+              <w:rPr>
+                <w:b/>
+                <w:color w:val="1F2937"/>
+                <w:sz w:val="20"/>
+              </w:rPr>
+              <w:t>Changes Requested</w:t>
+            </w:r>
+          </w:p>
+        </w:tc>
+        <w:tc>
+          <w:tcPr>
+            <w:tcW w:type="dxa" w:w="8208"/>
+            <w:tcBorders>
+              <w:top w:val="single" w:sz="4" w:space="0" w:color="CCCCCC"/>
+              <w:left w:val="single" w:sz="4" w:space="0" w:color="CCCCCC"/>
+              <w:bottom w:val="single" w:sz="4" w:space="0" w:color="CCCCCC"/>
+              <w:right w:val="single" w:sz="4" w:space="0" w:color="CCCCCC"/>
+            </w:tcBorders>
+          </w:tcPr>
+          <w:p>
+            <w:r>
+              <w:rPr>
+                <w:sz w:val="20"/>
+              </w:rPr>
+              <w:t>None</w:t>
+            </w:r>
+          </w:p>
+        </w:tc>
+      </w:tr>
+      <w:tr>
+        <w:tc>
+          <w:tcPr>
+            <w:tcW w:type="dxa" w:w="2592"/>
+            <w:shd w:val="clear" w:color="auto" w:fill="F9FAFB"/>
+            <w:tcBorders>
+              <w:top w:val="single" w:sz="4" w:space="0" w:color="CCCCCC"/>
+              <w:left w:val="single" w:sz="4" w:space="0" w:color="CCCCCC"/>
+              <w:bottom w:val="single" w:sz="4" w:space="0" w:color="CCCCCC"/>
+              <w:right w:val="single" w:sz="4" w:space="0" w:color="CCCCCC"/>
+            </w:tcBorders>
+          </w:tcPr>
+          <w:p>
+            <w:r>
+              <w:rPr>
+                <w:b/>
+                <w:color w:val="1F2937"/>
+                <w:sz w:val="20"/>
+              </w:rPr>
+              <w:t>Comments</w:t>
+            </w:r>
+          </w:p>
+        </w:tc>
+        <w:tc>
+          <w:tcPr>
+            <w:tcW w:type="dxa" w:w="8208"/>
+            <w:tcBorders>
+              <w:top w:val="single" w:sz="4" w:space="0" w:color="CCCCCC"/>
+              <w:left w:val="single" w:sz="4" w:space="0" w:color="CCCCCC"/>
+              <w:bottom w:val="single" w:sz="4" w:space="0" w:color="CCCCCC"/>
+              <w:right w:val="single" w:sz="4" w:space="0" w:color="CCCCCC"/>
+            </w:tcBorders>
+          </w:tcPr>
+          <w:p>
+            <w:r>
+              <w:rPr>
+                <w:sz w:val="20"/>
+              </w:rPr>
+              <w:t>0 general  |  0 review</w:t>
+            </w:r>
+          </w:p>
+        </w:tc>
+      </w:tr>
+      <w:tr>
+        <w:tc>
+          <w:tcPr>
+            <w:tcW w:type="dxa" w:w="2592"/>
+            <w:shd w:val="clear" w:color="auto" w:fill="F9FAFB"/>
+            <w:tcBorders>
+              <w:top w:val="single" w:sz="4" w:space="0" w:color="CCCCCC"/>
+              <w:left w:val="single" w:sz="4" w:space="0" w:color="CCCCCC"/>
+              <w:bottom w:val="single" w:sz="4" w:space="0" w:color="CCCCCC"/>
+              <w:right w:val="single" w:sz="4" w:space="0" w:color="CCCCCC"/>
+            </w:tcBorders>
+          </w:tcPr>
+          <w:p>
+            <w:r>
+              <w:rPr>
+                <w:b/>
+                <w:color w:val="1F2937"/>
+                <w:sz w:val="20"/>
+              </w:rPr>
+              <w:t>Linked Issues</w:t>
+            </w:r>
+          </w:p>
+        </w:tc>
+        <w:tc>
+          <w:tcPr>
+            <w:tcW w:type="dxa" w:w="8208"/>
+            <w:tcBorders>
+              <w:top w:val="single" w:sz="4" w:space="0" w:color="CCCCCC"/>
+              <w:left w:val="single" w:sz="4" w:space="0" w:color="CCCCCC"/>
+              <w:bottom w:val="single" w:sz="4" w:space="0" w:color="CCCCCC"/>
+              <w:right w:val="single" w:sz="4" w:space="0" w:color="CCCCCC"/>
+            </w:tcBorders>
+          </w:tcPr>
+          <w:p>
+            <w:r>
+              <w:rPr>
+                <w:sz w:val="20"/>
+              </w:rPr>
+              <w:t>0</w:t>
+            </w:r>
+          </w:p>
+        </w:tc>
+      </w:tr>
+      <w:tr>
+        <w:tc>
+          <w:tcPr>
+            <w:tcW w:type="dxa" w:w="2592"/>
+            <w:shd w:val="clear" w:color="auto" w:fill="F9FAFB"/>
+            <w:tcBorders>
+              <w:top w:val="single" w:sz="4" w:space="0" w:color="CCCCCC"/>
+              <w:left w:val="single" w:sz="4" w:space="0" w:color="CCCCCC"/>
+              <w:bottom w:val="single" w:sz="4" w:space="0" w:color="CCCCCC"/>
+              <w:right w:val="single" w:sz="4" w:space="0" w:color="CCCCCC"/>
+            </w:tcBorders>
+          </w:tcPr>
+          <w:p>
+            <w:r>
+              <w:rPr>
+                <w:b/>
+                <w:color w:val="1F2937"/>
+                <w:sz w:val="20"/>
+              </w:rPr>
+              <w:t>PR URL</w:t>
+            </w:r>
+          </w:p>
+        </w:tc>
+        <w:tc>
+          <w:tcPr>
+            <w:tcW w:type="dxa" w:w="8208"/>
+            <w:tcBorders>
+              <w:top w:val="single" w:sz="4" w:space="0" w:color="CCCCCC"/>
+              <w:left w:val="single" w:sz="4" w:space="0" w:color="CCCCCC"/>
+              <w:bottom w:val="single" w:sz="4" w:space="0" w:color="CCCCCC"/>
+              <w:right w:val="single" w:sz="4" w:space="0" w:color="CCCCCC"/>
+            </w:tcBorders>
+          </w:tcPr>
+          <w:p>
+            <w:r>
+              <w:rPr>
+                <w:sz w:val="20"/>
+              </w:rPr>
+              <w:t>https://github.com/Janiyamt/PR-AGENT/pull/13</w:t>
+            </w:r>
+          </w:p>
+        </w:tc>
+      </w:tr>
+    </w:tbl>
+    <w:p>
+      <w:pPr>
+        <w:spacing w:before="160" w:after="40"/>
+      </w:pPr>
+      <w:r>
+        <w:rPr>
+          <w:b/>
+          <w:i w:val="0"/>
+          <w:color w:val="1F2937"/>
+          <w:sz w:val="20"/>
+        </w:rPr>
+        <w:t>Commit Messages:</w:t>
+      </w:r>
+    </w:p>
+    <w:p>
+      <w:pPr>
+        <w:spacing w:before="0" w:after="40"/>
+      </w:pPr>
+      <w:r>
+        <w:rPr>
+          <w:b w:val="0"/>
+          <w:i w:val="0"/>
+          <w:color w:val="6B7280"/>
+          <w:sz w:val="18"/>
+        </w:rPr>
+        <w:t xml:space="preserve">  • Add comment to .gitignore for clarity</w:t>
+      </w:r>
+    </w:p>
+    <w:p>
+      <w:pPr>
+        <w:spacing w:before="0" w:after="40"/>
+      </w:pPr>
+      <w:r>
+        <w:rPr>
+          <w:b w:val="0"/>
+          <w:i w:val="0"/>
+          <w:color w:val="6B7280"/>
+          <w:sz w:val="18"/>
+        </w:rPr>
+        <w:t xml:space="preserve">  • Merge branch 'master' into bot_test</w:t>
+      </w:r>
+    </w:p>
+    <w:p>
+      <w:pPr>
+        <w:spacing w:before="0" w:after="40"/>
+      </w:pPr>
+      <w:r>
+        <w:rPr>
+          <w:b w:val="0"/>
+          <w:i w:val="0"/>
+          <w:color w:val="6B7280"/>
+          <w:sz w:val="18"/>
+        </w:rPr>
+        <w:t xml:space="preserve">  • Add comment to .gitignore</w:t>
+      </w:r>
+    </w:p>
+    <w:p>
+      <w:pPr>
+        <w:spacing w:before="0" w:after="40"/>
+      </w:pPr>
+      <w:r>
+        <w:rPr>
+          <w:b w:val="0"/>
+          <w:i w:val="0"/>
+          <w:color w:val="6B7280"/>
+          <w:sz w:val="18"/>
+        </w:rPr>
+        <w:t xml:space="preserve">  • Add final testing comment to .gitignore</w:t>
+      </w:r>
+    </w:p>
+    <w:p>
+      <w:pPr>
+        <w:spacing w:before="160" w:after="40"/>
+      </w:pPr>
+      <w:r>
+        <w:rPr>
+          <w:b/>
+          <w:i w:val="0"/>
+          <w:color w:val="1F2937"/>
+          <w:sz w:val="20"/>
+        </w:rPr>
+        <w:t>Before → After:</w:t>
+      </w:r>
+    </w:p>
+    <w:p>
+      <w:pPr>
+        <w:spacing w:before="80" w:after="200"/>
+        <w:ind w:left="432"/>
+        <w:pBdr>
+          <w:left w:val="single" w:sz="12" w:space="10" w:color="3B82F6"/>
+        </w:pBdr>
+      </w:pPr>
+      <w:r>
+        <w:rPr>
+          <w:i/>
+          <w:color w:val="1F2937"/>
+          <w:sz w:val="21"/>
+        </w:rPr>
+        <w:t>Before the merge, the .gitignore file contained a placeholder comment like '#helloo pls can u work properly'. After the merge, this was replaced with updated comments such as '#plss work properly', '#will u work this timee?', and '#FINAL TESTING', along with a note on OCI services, resulting in no change to ignored files but improved comment clarity for testing.</w:t>
+      </w:r>
+    </w:p>
+    <w:p>
+      <w:pPr>
+        <w:spacing w:before="120" w:after="40"/>
+      </w:pPr>
+      <w:r>
+        <w:rPr>
+          <w:b/>
+          <w:i w:val="0"/>
+          <w:color w:val="1F2937"/>
+          <w:sz w:val="20"/>
+        </w:rPr>
+        <w:t>Key Impacts:</w:t>
+      </w:r>
+    </w:p>
+    <w:p>
+      <w:pPr>
+        <w:spacing w:before="0" w:after="40"/>
+      </w:pPr>
+      <w:r>
+        <w:rPr>
+          <w:b w:val="0"/>
+          <w:i w:val="0"/>
+          <w:color w:val="6B7280"/>
+          <w:sz w:val="18"/>
+        </w:rPr>
+        <w:t xml:space="preserve">  • No functional impact, as .gitignore only affects file tracking in version control and does not alter application behavior.</w:t>
+      </w:r>
+    </w:p>
+    <w:p>
+      <w:pPr>
+        <w:spacing w:before="0" w:after="40"/>
+      </w:pPr>
+      <w:r>
+        <w:rPr>
+          <w:b w:val="0"/>
+          <w:i w:val="0"/>
+          <w:color w:val="6B7280"/>
+          <w:sz w:val="18"/>
+        </w:rPr>
+        <w:t xml:space="preserve">  • Low risk, but multiple commits suggest iterative testing; no edge cases introduced since changes are confined to comments.</w:t>
+      </w:r>
+    </w:p>
+    <w:p>
+      <w:pPr>
+        <w:spacing w:before="0" w:after="40"/>
+      </w:pPr>
+      <w:r>
+        <w:rPr>
+          <w:b w:val="0"/>
+          <w:i w:val="0"/>
+          <w:color w:val="6B7280"/>
+          <w:sz w:val="18"/>
+        </w:rPr>
+        <w:t xml:space="preserve">  • No performance or security implications, as the file is non-executable and comments are inert.</w:t>
+      </w:r>
+    </w:p>
+    <w:p>
+      <w:pPr>
+        <w:spacing w:before="120" w:after="40"/>
+      </w:pPr>
+      <w:r>
+        <w:rPr>
+          <w:b/>
+          <w:i w:val="0"/>
+          <w:color w:val="1F2937"/>
+          <w:sz w:val="20"/>
+        </w:rPr>
+        <w:t>Review Notes:</w:t>
+      </w:r>
+    </w:p>
+    <w:p>
+      <w:pPr>
+        <w:spacing w:before="0" w:after="80"/>
+      </w:pPr>
+      <w:r>
+        <w:rPr>
+          <w:b w:val="0"/>
+          <w:i w:val="0"/>
+          <w:color w:val="6B7280"/>
+          <w:sz w:val="18"/>
+        </w:rPr>
+        <w:t>The PR was merged by the author without any external approvals or requested changes, indicating a self-reviewed test submission. Lack of description and labels highlights it as an informal bot test rather than a formal code review process.</w:t>
+      </w:r>
+    </w:p>
+    <w:p>
+      <w:pPr>
+        <w:spacing w:before="120" w:after="40"/>
+      </w:pPr>
+      <w:r>
+        <w:rPr>
+          <w:b/>
+          <w:i w:val="0"/>
+          <w:color w:val="1F2937"/>
+          <w:sz w:val="20"/>
+        </w:rPr>
+        <w:t>Files Changed:</w:t>
+      </w:r>
+    </w:p>
+    <w:p>
+      <w:pPr>
+        <w:spacing w:before="0" w:after="20"/>
+      </w:pPr>
+      <w:r>
+        <w:rPr>
+          <w:b w:val="0"/>
+          <w:i w:val="0"/>
+          <w:color w:val="6B7280"/>
+          <w:sz w:val="16"/>
+        </w:rPr>
+        <w:t xml:space="preserve">  .gitignore</w:t>
+      </w:r>
+    </w:p>
+    <w:p>
+      <w:pPr>
+        <w:spacing w:before="120" w:after="40"/>
+      </w:pPr>
+      <w:r>
+        <w:rPr>
+          <w:b/>
+          <w:i w:val="0"/>
+          <w:color w:val="1F2937"/>
+          <w:sz w:val="20"/>
+        </w:rPr>
+        <w:t>Code Diffs (sample):</w:t>
+      </w:r>
+    </w:p>
+    <w:p>
+      <w:pPr>
+        <w:spacing w:before="80" w:after="40"/>
+      </w:pPr>
+      <w:r>
+        <w:rPr>
+          <w:b/>
+          <w:i w:val="0"/>
+          <w:color w:val="1E3A5F"/>
+          <w:sz w:val="18"/>
+        </w:rPr>
+        <w:t>MODIFIED: .gitignore  (+3 / -1)</w:t>
+      </w:r>
+    </w:p>
+    <w:p>
+      <w:pPr>
+        <w:spacing w:before="0" w:after="80"/>
+      </w:pPr>
+      <w:r>
+        <w:rPr>
+          <w:b w:val="0"/>
+          <w:i w:val="0"/>
+          <w:color w:val="6B7280"/>
+          <w:sz w:val="16"/>
+        </w:rPr>
+        <w:t>@@ -5,4 +5,6 @@ venv/</w:t>
+        <w:br/>
+        <w:t xml:space="preserve"> config.py</w:t>
+        <w:br/>
+        <w:t xml:space="preserve"> #everything works well with oci services as it is installed now</w:t>
+        <w:br/>
+        <w:t xml:space="preserve"> # not to add comments simply</w:t>
+        <w:br/>
+        <w:t>-#helloo pls can u work properly</w:t>
+        <w:br/>
+        <w:t>+#plss work properly</w:t>
+        <w:br/>
+        <w:t>+#will u work this timee?</w:t>
+        <w:br/>
+        <w:t xml:space="preserve">+#FINAL TESTING </w:t>
+      </w:r>
+    </w:p>
+    <w:p>
+      <w:pPr>
+        <w:spacing w:before="80" w:after="80"/>
+        <w:pBdr>
+          <w:bottom w:val="single" w:sz="4" w:space="1" w:color="E5E7EB"/>
+        </w:pBdr>
+      </w:pPr>
     </w:p>
     <w:p>
       <w:pPr>
@@ -5890,7 +6849,7 @@
           <w:color w:val="9CA3AF"/>
           <w:sz w:val="18"/>
         </w:rPr>
-        <w:t>Merge Events Report  •  Generated by PR-Agent v2  •  March 04, 2026 at 10:53 UTC</w:t>
+        <w:t>Merge Events Report  •  Generated by PR-Agent v2  •  March 04, 2026 at 11:52 UTC</w:t>
       </w:r>
     </w:p>
     <w:sectPr>

</xml_diff>

<commit_message>
chore: log merge event for 5530353c08edd5ead174e0ad08ab1b6abcde765d
</commit_message>
<xml_diff>
--- a/merge_agent/logs/merge-events-report.docx
+++ b/merge_agent/logs/merge-events-report.docx
@@ -44,7 +44,7 @@
           <w:color w:val="9CA3AF"/>
           <w:sz w:val="20"/>
         </w:rPr>
-        <w:t>Generated: March 04, 2026 at 11:52 UTC  •  7 merge events on record</w:t>
+        <w:t>Generated: April 28, 2026 at 06:09 UTC  •  8 merge events on record</w:t>
       </w:r>
     </w:p>
     <w:p>
@@ -104,7 +104,7 @@
                 <w:color w:val="1E3A5F"/>
                 <w:sz w:val="36"/>
               </w:rPr>
-              <w:t>7</w:t>
+              <w:t>8</w:t>
             </w:r>
           </w:p>
         </w:tc>
@@ -321,6 +321,37 @@
           <w:color w:val="1F2937"/>
           <w:sz w:val="20"/>
         </w:rPr>
+        <w:t>PR #19 — Add initial README with test description</w:t>
+      </w:r>
+    </w:p>
+    <w:p>
+      <w:pPr>
+        <w:spacing w:before="80" w:after="200"/>
+        <w:ind w:left="432"/>
+        <w:pBdr>
+          <w:left w:val="single" w:sz="12" w:space="10" w:color="3B82F6"/>
+        </w:pBdr>
+      </w:pPr>
+      <w:r>
+        <w:rPr>
+          <w:i/>
+          <w:color w:val="1F2937"/>
+          <w:sz w:val="21"/>
+        </w:rPr>
+        <w:t>This pull request added an initial README file containing a description of tests to the repository. It aimed to provide essential documentation for the project's testing setup, improving onboarding for contributors. The changes were merged without any code modifications, focusing solely on documentation.</w:t>
+      </w:r>
+    </w:p>
+    <w:p>
+      <w:pPr>
+        <w:spacing w:before="0" w:after="40"/>
+      </w:pPr>
+      <w:r>
+        <w:rPr>
+          <w:b/>
+          <w:i w:val="0"/>
+          <w:color w:val="1F2937"/>
+          <w:sz w:val="20"/>
+        </w:rPr>
         <w:t>PR #13 — Bot test</w:t>
       </w:r>
     </w:p>
@@ -548,6 +579,822 @@
         </w:rPr>
         <w:t>Merge Event Details</w:t>
       </w:r>
+    </w:p>
+    <w:p>
+      <w:pPr>
+        <w:spacing w:before="280" w:after="80"/>
+      </w:pPr>
+      <w:r>
+        <w:rPr>
+          <w:b/>
+          <w:color w:val="6B7280"/>
+          <w:sz w:val="26"/>
+        </w:rPr>
+        <w:t xml:space="preserve">PR #19 — </w:t>
+      </w:r>
+      <w:r>
+        <w:rPr>
+          <w:b/>
+          <w:color w:val="1F2937"/>
+          <w:sz w:val="26"/>
+        </w:rPr>
+        <w:t>Add initial README with test description</w:t>
+      </w:r>
+    </w:p>
+    <w:p>
+      <w:pPr>
+        <w:spacing w:before="80" w:after="200"/>
+        <w:ind w:left="432"/>
+        <w:pBdr>
+          <w:left w:val="single" w:sz="12" w:space="10" w:color="10B981"/>
+        </w:pBdr>
+      </w:pPr>
+      <w:r>
+        <w:rPr>
+          <w:i/>
+          <w:color w:val="1F2937"/>
+          <w:sz w:val="21"/>
+        </w:rPr>
+        <w:t>💡 This pull request added an initial README file containing a description of tests to the repository. It aimed to provide essential documentation for the project's testing setup, improving onboarding for contributors. The changes were merged without any code modifications, focusing solely on documentation.</w:t>
+      </w:r>
+    </w:p>
+    <w:tbl>
+      <w:tblPr>
+        <w:tblStyle w:val="TableGrid"/>
+        <w:tblW w:type="auto" w:w="0"/>
+        <w:tblLook w:firstColumn="1" w:firstRow="1" w:lastColumn="0" w:lastRow="0" w:noHBand="0" w:noVBand="1" w:val="04A0"/>
+      </w:tblPr>
+      <w:tblGrid>
+        <w:gridCol w:w="4680"/>
+        <w:gridCol w:w="4680"/>
+      </w:tblGrid>
+      <w:tr>
+        <w:tc>
+          <w:tcPr>
+            <w:tcW w:type="dxa" w:w="2592"/>
+            <w:shd w:val="clear" w:color="auto" w:fill="F9FAFB"/>
+            <w:tcBorders>
+              <w:top w:val="single" w:sz="4" w:space="0" w:color="CCCCCC"/>
+              <w:left w:val="single" w:sz="4" w:space="0" w:color="CCCCCC"/>
+              <w:bottom w:val="single" w:sz="4" w:space="0" w:color="CCCCCC"/>
+              <w:right w:val="single" w:sz="4" w:space="0" w:color="CCCCCC"/>
+            </w:tcBorders>
+          </w:tcPr>
+          <w:p>
+            <w:r>
+              <w:rPr>
+                <w:b/>
+                <w:color w:val="1F2937"/>
+                <w:sz w:val="20"/>
+              </w:rPr>
+              <w:t>PR Author</w:t>
+            </w:r>
+          </w:p>
+        </w:tc>
+        <w:tc>
+          <w:tcPr>
+            <w:tcW w:type="dxa" w:w="8208"/>
+            <w:tcBorders>
+              <w:top w:val="single" w:sz="4" w:space="0" w:color="CCCCCC"/>
+              <w:left w:val="single" w:sz="4" w:space="0" w:color="CCCCCC"/>
+              <w:bottom w:val="single" w:sz="4" w:space="0" w:color="CCCCCC"/>
+              <w:right w:val="single" w:sz="4" w:space="0" w:color="CCCCCC"/>
+            </w:tcBorders>
+          </w:tcPr>
+          <w:p>
+            <w:r>
+              <w:rPr>
+                <w:sz w:val="20"/>
+              </w:rPr>
+              <w:t>likiita</w:t>
+            </w:r>
+          </w:p>
+        </w:tc>
+      </w:tr>
+      <w:tr>
+        <w:tc>
+          <w:tcPr>
+            <w:tcW w:type="dxa" w:w="2592"/>
+            <w:shd w:val="clear" w:color="auto" w:fill="F9FAFB"/>
+            <w:tcBorders>
+              <w:top w:val="single" w:sz="4" w:space="0" w:color="CCCCCC"/>
+              <w:left w:val="single" w:sz="4" w:space="0" w:color="CCCCCC"/>
+              <w:bottom w:val="single" w:sz="4" w:space="0" w:color="CCCCCC"/>
+              <w:right w:val="single" w:sz="4" w:space="0" w:color="CCCCCC"/>
+            </w:tcBorders>
+          </w:tcPr>
+          <w:p>
+            <w:r>
+              <w:rPr>
+                <w:b/>
+                <w:color w:val="1F2937"/>
+                <w:sz w:val="20"/>
+              </w:rPr>
+              <w:t>Merged By</w:t>
+            </w:r>
+          </w:p>
+        </w:tc>
+        <w:tc>
+          <w:tcPr>
+            <w:tcW w:type="dxa" w:w="8208"/>
+            <w:tcBorders>
+              <w:top w:val="single" w:sz="4" w:space="0" w:color="CCCCCC"/>
+              <w:left w:val="single" w:sz="4" w:space="0" w:color="CCCCCC"/>
+              <w:bottom w:val="single" w:sz="4" w:space="0" w:color="CCCCCC"/>
+              <w:right w:val="single" w:sz="4" w:space="0" w:color="CCCCCC"/>
+            </w:tcBorders>
+          </w:tcPr>
+          <w:p>
+            <w:r>
+              <w:rPr>
+                <w:sz w:val="20"/>
+              </w:rPr>
+              <w:t>likiita</w:t>
+            </w:r>
+          </w:p>
+        </w:tc>
+      </w:tr>
+      <w:tr>
+        <w:tc>
+          <w:tcPr>
+            <w:tcW w:type="dxa" w:w="2592"/>
+            <w:shd w:val="clear" w:color="auto" w:fill="F9FAFB"/>
+            <w:tcBorders>
+              <w:top w:val="single" w:sz="4" w:space="0" w:color="CCCCCC"/>
+              <w:left w:val="single" w:sz="4" w:space="0" w:color="CCCCCC"/>
+              <w:bottom w:val="single" w:sz="4" w:space="0" w:color="CCCCCC"/>
+              <w:right w:val="single" w:sz="4" w:space="0" w:color="CCCCCC"/>
+            </w:tcBorders>
+          </w:tcPr>
+          <w:p>
+            <w:r>
+              <w:rPr>
+                <w:b/>
+                <w:color w:val="1F2937"/>
+                <w:sz w:val="20"/>
+              </w:rPr>
+              <w:t>Merged At</w:t>
+            </w:r>
+          </w:p>
+        </w:tc>
+        <w:tc>
+          <w:tcPr>
+            <w:tcW w:type="dxa" w:w="8208"/>
+            <w:tcBorders>
+              <w:top w:val="single" w:sz="4" w:space="0" w:color="CCCCCC"/>
+              <w:left w:val="single" w:sz="4" w:space="0" w:color="CCCCCC"/>
+              <w:bottom w:val="single" w:sz="4" w:space="0" w:color="CCCCCC"/>
+              <w:right w:val="single" w:sz="4" w:space="0" w:color="CCCCCC"/>
+            </w:tcBorders>
+          </w:tcPr>
+          <w:p>
+            <w:r>
+              <w:rPr>
+                <w:sz w:val="20"/>
+              </w:rPr>
+              <w:t>2026-04-28 06:09:14</w:t>
+            </w:r>
+          </w:p>
+        </w:tc>
+      </w:tr>
+      <w:tr>
+        <w:tc>
+          <w:tcPr>
+            <w:tcW w:type="dxa" w:w="2592"/>
+            <w:shd w:val="clear" w:color="auto" w:fill="F9FAFB"/>
+            <w:tcBorders>
+              <w:top w:val="single" w:sz="4" w:space="0" w:color="CCCCCC"/>
+              <w:left w:val="single" w:sz="4" w:space="0" w:color="CCCCCC"/>
+              <w:bottom w:val="single" w:sz="4" w:space="0" w:color="CCCCCC"/>
+              <w:right w:val="single" w:sz="4" w:space="0" w:color="CCCCCC"/>
+            </w:tcBorders>
+          </w:tcPr>
+          <w:p>
+            <w:r>
+              <w:rPr>
+                <w:b/>
+                <w:color w:val="1F2937"/>
+                <w:sz w:val="20"/>
+              </w:rPr>
+              <w:t>Merge Commit</w:t>
+            </w:r>
+          </w:p>
+        </w:tc>
+        <w:tc>
+          <w:tcPr>
+            <w:tcW w:type="dxa" w:w="8208"/>
+            <w:tcBorders>
+              <w:top w:val="single" w:sz="4" w:space="0" w:color="CCCCCC"/>
+              <w:left w:val="single" w:sz="4" w:space="0" w:color="CCCCCC"/>
+              <w:bottom w:val="single" w:sz="4" w:space="0" w:color="CCCCCC"/>
+              <w:right w:val="single" w:sz="4" w:space="0" w:color="CCCCCC"/>
+            </w:tcBorders>
+          </w:tcPr>
+          <w:p>
+            <w:r>
+              <w:rPr>
+                <w:sz w:val="20"/>
+              </w:rPr>
+              <w:t>5530353c08ed...</w:t>
+            </w:r>
+          </w:p>
+        </w:tc>
+      </w:tr>
+      <w:tr>
+        <w:tc>
+          <w:tcPr>
+            <w:tcW w:type="dxa" w:w="2592"/>
+            <w:shd w:val="clear" w:color="auto" w:fill="F9FAFB"/>
+            <w:tcBorders>
+              <w:top w:val="single" w:sz="4" w:space="0" w:color="CCCCCC"/>
+              <w:left w:val="single" w:sz="4" w:space="0" w:color="CCCCCC"/>
+              <w:bottom w:val="single" w:sz="4" w:space="0" w:color="CCCCCC"/>
+              <w:right w:val="single" w:sz="4" w:space="0" w:color="CCCCCC"/>
+            </w:tcBorders>
+          </w:tcPr>
+          <w:p>
+            <w:r>
+              <w:rPr>
+                <w:b/>
+                <w:color w:val="1F2937"/>
+                <w:sz w:val="20"/>
+              </w:rPr>
+              <w:t>Branch</w:t>
+            </w:r>
+          </w:p>
+        </w:tc>
+        <w:tc>
+          <w:tcPr>
+            <w:tcW w:type="dxa" w:w="8208"/>
+            <w:tcBorders>
+              <w:top w:val="single" w:sz="4" w:space="0" w:color="CCCCCC"/>
+              <w:left w:val="single" w:sz="4" w:space="0" w:color="CCCCCC"/>
+              <w:bottom w:val="single" w:sz="4" w:space="0" w:color="CCCCCC"/>
+              <w:right w:val="single" w:sz="4" w:space="0" w:color="CCCCCC"/>
+            </w:tcBorders>
+          </w:tcPr>
+          <w:p>
+            <w:r>
+              <w:rPr>
+                <w:sz w:val="20"/>
+              </w:rPr>
+              <w:t>bot_test → master</w:t>
+            </w:r>
+          </w:p>
+        </w:tc>
+      </w:tr>
+      <w:tr>
+        <w:tc>
+          <w:tcPr>
+            <w:tcW w:type="dxa" w:w="2592"/>
+            <w:shd w:val="clear" w:color="auto" w:fill="F9FAFB"/>
+            <w:tcBorders>
+              <w:top w:val="single" w:sz="4" w:space="0" w:color="CCCCCC"/>
+              <w:left w:val="single" w:sz="4" w:space="0" w:color="CCCCCC"/>
+              <w:bottom w:val="single" w:sz="4" w:space="0" w:color="CCCCCC"/>
+              <w:right w:val="single" w:sz="4" w:space="0" w:color="CCCCCC"/>
+            </w:tcBorders>
+          </w:tcPr>
+          <w:p>
+            <w:r>
+              <w:rPr>
+                <w:b/>
+                <w:color w:val="1F2937"/>
+                <w:sz w:val="20"/>
+              </w:rPr>
+              <w:t>Labels</w:t>
+            </w:r>
+          </w:p>
+        </w:tc>
+        <w:tc>
+          <w:tcPr>
+            <w:tcW w:type="dxa" w:w="8208"/>
+            <w:tcBorders>
+              <w:top w:val="single" w:sz="4" w:space="0" w:color="CCCCCC"/>
+              <w:left w:val="single" w:sz="4" w:space="0" w:color="CCCCCC"/>
+              <w:bottom w:val="single" w:sz="4" w:space="0" w:color="CCCCCC"/>
+              <w:right w:val="single" w:sz="4" w:space="0" w:color="CCCCCC"/>
+            </w:tcBorders>
+          </w:tcPr>
+          <w:p>
+            <w:r>
+              <w:rPr>
+                <w:sz w:val="20"/>
+              </w:rPr>
+              <w:t>None</w:t>
+            </w:r>
+          </w:p>
+        </w:tc>
+      </w:tr>
+      <w:tr>
+        <w:tc>
+          <w:tcPr>
+            <w:tcW w:type="dxa" w:w="2592"/>
+            <w:shd w:val="clear" w:color="auto" w:fill="F9FAFB"/>
+            <w:tcBorders>
+              <w:top w:val="single" w:sz="4" w:space="0" w:color="CCCCCC"/>
+              <w:left w:val="single" w:sz="4" w:space="0" w:color="CCCCCC"/>
+              <w:bottom w:val="single" w:sz="4" w:space="0" w:color="CCCCCC"/>
+              <w:right w:val="single" w:sz="4" w:space="0" w:color="CCCCCC"/>
+            </w:tcBorders>
+          </w:tcPr>
+          <w:p>
+            <w:r>
+              <w:rPr>
+                <w:b/>
+                <w:color w:val="1F2937"/>
+                <w:sz w:val="20"/>
+              </w:rPr>
+              <w:t>Code Delta</w:t>
+            </w:r>
+          </w:p>
+        </w:tc>
+        <w:tc>
+          <w:tcPr>
+            <w:tcW w:type="dxa" w:w="8208"/>
+            <w:tcBorders>
+              <w:top w:val="single" w:sz="4" w:space="0" w:color="CCCCCC"/>
+              <w:left w:val="single" w:sz="4" w:space="0" w:color="CCCCCC"/>
+              <w:bottom w:val="single" w:sz="4" w:space="0" w:color="CCCCCC"/>
+              <w:right w:val="single" w:sz="4" w:space="0" w:color="CCCCCC"/>
+            </w:tcBorders>
+          </w:tcPr>
+          <w:p>
+            <w:r>
+              <w:rPr>
+                <w:sz w:val="20"/>
+              </w:rPr>
+              <w:t>+0 / -0 lines</w:t>
+            </w:r>
+          </w:p>
+        </w:tc>
+      </w:tr>
+      <w:tr>
+        <w:tc>
+          <w:tcPr>
+            <w:tcW w:type="dxa" w:w="2592"/>
+            <w:shd w:val="clear" w:color="auto" w:fill="F9FAFB"/>
+            <w:tcBorders>
+              <w:top w:val="single" w:sz="4" w:space="0" w:color="CCCCCC"/>
+              <w:left w:val="single" w:sz="4" w:space="0" w:color="CCCCCC"/>
+              <w:bottom w:val="single" w:sz="4" w:space="0" w:color="CCCCCC"/>
+              <w:right w:val="single" w:sz="4" w:space="0" w:color="CCCCCC"/>
+            </w:tcBorders>
+          </w:tcPr>
+          <w:p>
+            <w:r>
+              <w:rPr>
+                <w:b/>
+                <w:color w:val="1F2937"/>
+                <w:sz w:val="20"/>
+              </w:rPr>
+              <w:t>Commits</w:t>
+            </w:r>
+          </w:p>
+        </w:tc>
+        <w:tc>
+          <w:tcPr>
+            <w:tcW w:type="dxa" w:w="8208"/>
+            <w:tcBorders>
+              <w:top w:val="single" w:sz="4" w:space="0" w:color="CCCCCC"/>
+              <w:left w:val="single" w:sz="4" w:space="0" w:color="CCCCCC"/>
+              <w:bottom w:val="single" w:sz="4" w:space="0" w:color="CCCCCC"/>
+              <w:right w:val="single" w:sz="4" w:space="0" w:color="CCCCCC"/>
+            </w:tcBorders>
+          </w:tcPr>
+          <w:p>
+            <w:r>
+              <w:rPr>
+                <w:sz w:val="20"/>
+              </w:rPr>
+              <w:t>2</w:t>
+            </w:r>
+          </w:p>
+        </w:tc>
+      </w:tr>
+      <w:tr>
+        <w:tc>
+          <w:tcPr>
+            <w:tcW w:type="dxa" w:w="2592"/>
+            <w:shd w:val="clear" w:color="auto" w:fill="F9FAFB"/>
+            <w:tcBorders>
+              <w:top w:val="single" w:sz="4" w:space="0" w:color="CCCCCC"/>
+              <w:left w:val="single" w:sz="4" w:space="0" w:color="CCCCCC"/>
+              <w:bottom w:val="single" w:sz="4" w:space="0" w:color="CCCCCC"/>
+              <w:right w:val="single" w:sz="4" w:space="0" w:color="CCCCCC"/>
+            </w:tcBorders>
+          </w:tcPr>
+          <w:p>
+            <w:r>
+              <w:rPr>
+                <w:b/>
+                <w:color w:val="1F2937"/>
+                <w:sz w:val="20"/>
+              </w:rPr>
+              <w:t>Files Changed</w:t>
+            </w:r>
+          </w:p>
+        </w:tc>
+        <w:tc>
+          <w:tcPr>
+            <w:tcW w:type="dxa" w:w="8208"/>
+            <w:tcBorders>
+              <w:top w:val="single" w:sz="4" w:space="0" w:color="CCCCCC"/>
+              <w:left w:val="single" w:sz="4" w:space="0" w:color="CCCCCC"/>
+              <w:bottom w:val="single" w:sz="4" w:space="0" w:color="CCCCCC"/>
+              <w:right w:val="single" w:sz="4" w:space="0" w:color="CCCCCC"/>
+            </w:tcBorders>
+          </w:tcPr>
+          <w:p>
+            <w:r>
+              <w:rPr>
+                <w:sz w:val="20"/>
+              </w:rPr>
+              <w:t>0</w:t>
+            </w:r>
+          </w:p>
+        </w:tc>
+      </w:tr>
+      <w:tr>
+        <w:tc>
+          <w:tcPr>
+            <w:tcW w:type="dxa" w:w="2592"/>
+            <w:shd w:val="clear" w:color="auto" w:fill="F9FAFB"/>
+            <w:tcBorders>
+              <w:top w:val="single" w:sz="4" w:space="0" w:color="CCCCCC"/>
+              <w:left w:val="single" w:sz="4" w:space="0" w:color="CCCCCC"/>
+              <w:bottom w:val="single" w:sz="4" w:space="0" w:color="CCCCCC"/>
+              <w:right w:val="single" w:sz="4" w:space="0" w:color="CCCCCC"/>
+            </w:tcBorders>
+          </w:tcPr>
+          <w:p>
+            <w:r>
+              <w:rPr>
+                <w:b/>
+                <w:color w:val="1F2937"/>
+                <w:sz w:val="20"/>
+              </w:rPr>
+              <w:t>Approvals</w:t>
+            </w:r>
+          </w:p>
+        </w:tc>
+        <w:tc>
+          <w:tcPr>
+            <w:tcW w:type="dxa" w:w="8208"/>
+            <w:tcBorders>
+              <w:top w:val="single" w:sz="4" w:space="0" w:color="CCCCCC"/>
+              <w:left w:val="single" w:sz="4" w:space="0" w:color="CCCCCC"/>
+              <w:bottom w:val="single" w:sz="4" w:space="0" w:color="CCCCCC"/>
+              <w:right w:val="single" w:sz="4" w:space="0" w:color="CCCCCC"/>
+            </w:tcBorders>
+          </w:tcPr>
+          <w:p>
+            <w:r>
+              <w:rPr>
+                <w:sz w:val="20"/>
+              </w:rPr>
+              <w:t>None</w:t>
+            </w:r>
+          </w:p>
+        </w:tc>
+      </w:tr>
+      <w:tr>
+        <w:tc>
+          <w:tcPr>
+            <w:tcW w:type="dxa" w:w="2592"/>
+            <w:shd w:val="clear" w:color="auto" w:fill="F9FAFB"/>
+            <w:tcBorders>
+              <w:top w:val="single" w:sz="4" w:space="0" w:color="CCCCCC"/>
+              <w:left w:val="single" w:sz="4" w:space="0" w:color="CCCCCC"/>
+              <w:bottom w:val="single" w:sz="4" w:space="0" w:color="CCCCCC"/>
+              <w:right w:val="single" w:sz="4" w:space="0" w:color="CCCCCC"/>
+            </w:tcBorders>
+          </w:tcPr>
+          <w:p>
+            <w:r>
+              <w:rPr>
+                <w:b/>
+                <w:color w:val="1F2937"/>
+                <w:sz w:val="20"/>
+              </w:rPr>
+              <w:t>Changes Requested</w:t>
+            </w:r>
+          </w:p>
+        </w:tc>
+        <w:tc>
+          <w:tcPr>
+            <w:tcW w:type="dxa" w:w="8208"/>
+            <w:tcBorders>
+              <w:top w:val="single" w:sz="4" w:space="0" w:color="CCCCCC"/>
+              <w:left w:val="single" w:sz="4" w:space="0" w:color="CCCCCC"/>
+              <w:bottom w:val="single" w:sz="4" w:space="0" w:color="CCCCCC"/>
+              <w:right w:val="single" w:sz="4" w:space="0" w:color="CCCCCC"/>
+            </w:tcBorders>
+          </w:tcPr>
+          <w:p>
+            <w:r>
+              <w:rPr>
+                <w:sz w:val="20"/>
+              </w:rPr>
+              <w:t>None</w:t>
+            </w:r>
+          </w:p>
+        </w:tc>
+      </w:tr>
+      <w:tr>
+        <w:tc>
+          <w:tcPr>
+            <w:tcW w:type="dxa" w:w="2592"/>
+            <w:shd w:val="clear" w:color="auto" w:fill="F9FAFB"/>
+            <w:tcBorders>
+              <w:top w:val="single" w:sz="4" w:space="0" w:color="CCCCCC"/>
+              <w:left w:val="single" w:sz="4" w:space="0" w:color="CCCCCC"/>
+              <w:bottom w:val="single" w:sz="4" w:space="0" w:color="CCCCCC"/>
+              <w:right w:val="single" w:sz="4" w:space="0" w:color="CCCCCC"/>
+            </w:tcBorders>
+          </w:tcPr>
+          <w:p>
+            <w:r>
+              <w:rPr>
+                <w:b/>
+                <w:color w:val="1F2937"/>
+                <w:sz w:val="20"/>
+              </w:rPr>
+              <w:t>Comments</w:t>
+            </w:r>
+          </w:p>
+        </w:tc>
+        <w:tc>
+          <w:tcPr>
+            <w:tcW w:type="dxa" w:w="8208"/>
+            <w:tcBorders>
+              <w:top w:val="single" w:sz="4" w:space="0" w:color="CCCCCC"/>
+              <w:left w:val="single" w:sz="4" w:space="0" w:color="CCCCCC"/>
+              <w:bottom w:val="single" w:sz="4" w:space="0" w:color="CCCCCC"/>
+              <w:right w:val="single" w:sz="4" w:space="0" w:color="CCCCCC"/>
+            </w:tcBorders>
+          </w:tcPr>
+          <w:p>
+            <w:r>
+              <w:rPr>
+                <w:sz w:val="20"/>
+              </w:rPr>
+              <w:t>0 general  |  0 review</w:t>
+            </w:r>
+          </w:p>
+        </w:tc>
+      </w:tr>
+      <w:tr>
+        <w:tc>
+          <w:tcPr>
+            <w:tcW w:type="dxa" w:w="2592"/>
+            <w:shd w:val="clear" w:color="auto" w:fill="F9FAFB"/>
+            <w:tcBorders>
+              <w:top w:val="single" w:sz="4" w:space="0" w:color="CCCCCC"/>
+              <w:left w:val="single" w:sz="4" w:space="0" w:color="CCCCCC"/>
+              <w:bottom w:val="single" w:sz="4" w:space="0" w:color="CCCCCC"/>
+              <w:right w:val="single" w:sz="4" w:space="0" w:color="CCCCCC"/>
+            </w:tcBorders>
+          </w:tcPr>
+          <w:p>
+            <w:r>
+              <w:rPr>
+                <w:b/>
+                <w:color w:val="1F2937"/>
+                <w:sz w:val="20"/>
+              </w:rPr>
+              <w:t>Linked Issues</w:t>
+            </w:r>
+          </w:p>
+        </w:tc>
+        <w:tc>
+          <w:tcPr>
+            <w:tcW w:type="dxa" w:w="8208"/>
+            <w:tcBorders>
+              <w:top w:val="single" w:sz="4" w:space="0" w:color="CCCCCC"/>
+              <w:left w:val="single" w:sz="4" w:space="0" w:color="CCCCCC"/>
+              <w:bottom w:val="single" w:sz="4" w:space="0" w:color="CCCCCC"/>
+              <w:right w:val="single" w:sz="4" w:space="0" w:color="CCCCCC"/>
+            </w:tcBorders>
+          </w:tcPr>
+          <w:p>
+            <w:r>
+              <w:rPr>
+                <w:sz w:val="20"/>
+              </w:rPr>
+              <w:t>0</w:t>
+            </w:r>
+          </w:p>
+        </w:tc>
+      </w:tr>
+      <w:tr>
+        <w:tc>
+          <w:tcPr>
+            <w:tcW w:type="dxa" w:w="2592"/>
+            <w:shd w:val="clear" w:color="auto" w:fill="F9FAFB"/>
+            <w:tcBorders>
+              <w:top w:val="single" w:sz="4" w:space="0" w:color="CCCCCC"/>
+              <w:left w:val="single" w:sz="4" w:space="0" w:color="CCCCCC"/>
+              <w:bottom w:val="single" w:sz="4" w:space="0" w:color="CCCCCC"/>
+              <w:right w:val="single" w:sz="4" w:space="0" w:color="CCCCCC"/>
+            </w:tcBorders>
+          </w:tcPr>
+          <w:p>
+            <w:r>
+              <w:rPr>
+                <w:b/>
+                <w:color w:val="1F2937"/>
+                <w:sz w:val="20"/>
+              </w:rPr>
+              <w:t>PR URL</w:t>
+            </w:r>
+          </w:p>
+        </w:tc>
+        <w:tc>
+          <w:tcPr>
+            <w:tcW w:type="dxa" w:w="8208"/>
+            <w:tcBorders>
+              <w:top w:val="single" w:sz="4" w:space="0" w:color="CCCCCC"/>
+              <w:left w:val="single" w:sz="4" w:space="0" w:color="CCCCCC"/>
+              <w:bottom w:val="single" w:sz="4" w:space="0" w:color="CCCCCC"/>
+              <w:right w:val="single" w:sz="4" w:space="0" w:color="CCCCCC"/>
+            </w:tcBorders>
+          </w:tcPr>
+          <w:p>
+            <w:r>
+              <w:rPr>
+                <w:sz w:val="20"/>
+              </w:rPr>
+              <w:t>https://github.com/Janiyamt/PR-AGENT/pull/19</w:t>
+            </w:r>
+          </w:p>
+        </w:tc>
+      </w:tr>
+    </w:tbl>
+    <w:p>
+      <w:pPr>
+        <w:spacing w:before="160" w:after="40"/>
+      </w:pPr>
+      <w:r>
+        <w:rPr>
+          <w:b/>
+          <w:i w:val="0"/>
+          <w:color w:val="1F2937"/>
+          <w:sz w:val="20"/>
+        </w:rPr>
+        <w:t>Commit Messages:</w:t>
+      </w:r>
+    </w:p>
+    <w:p>
+      <w:pPr>
+        <w:spacing w:before="0" w:after="40"/>
+      </w:pPr>
+      <w:r>
+        <w:rPr>
+          <w:b w:val="0"/>
+          <w:i w:val="0"/>
+          <w:color w:val="6B7280"/>
+          <w:sz w:val="18"/>
+        </w:rPr>
+        <w:t xml:space="preserve">  • Add initial README with test description</w:t>
+      </w:r>
+    </w:p>
+    <w:p>
+      <w:pPr>
+        <w:spacing w:before="0" w:after="40"/>
+      </w:pPr>
+      <w:r>
+        <w:rPr>
+          <w:b w:val="0"/>
+          <w:i w:val="0"/>
+          <w:color w:val="6B7280"/>
+          <w:sz w:val="18"/>
+        </w:rPr>
+        <w:t xml:space="preserve">  • Merge branch 'master' into bot_test</w:t>
+      </w:r>
+    </w:p>
+    <w:p>
+      <w:pPr>
+        <w:spacing w:before="160" w:after="40"/>
+      </w:pPr>
+      <w:r>
+        <w:rPr>
+          <w:b/>
+          <w:i w:val="0"/>
+          <w:color w:val="1F2937"/>
+          <w:sz w:val="20"/>
+        </w:rPr>
+        <w:t>Before → After:</w:t>
+      </w:r>
+    </w:p>
+    <w:p>
+      <w:pPr>
+        <w:spacing w:before="80" w:after="200"/>
+        <w:ind w:left="432"/>
+        <w:pBdr>
+          <w:left w:val="single" w:sz="12" w:space="10" w:color="3B82F6"/>
+        </w:pBdr>
+      </w:pPr>
+      <w:r>
+        <w:rPr>
+          <w:i/>
+          <w:color w:val="1F2937"/>
+          <w:sz w:val="21"/>
+        </w:rPr>
+        <w:t>Before the merge, the repository had no README file, leaving it without introductory documentation on tests. After the merge, a basic README is now present, offering an initial overview of the test descriptions to guide users.</w:t>
+      </w:r>
+    </w:p>
+    <w:p>
+      <w:pPr>
+        <w:spacing w:before="120" w:after="40"/>
+      </w:pPr>
+      <w:r>
+        <w:rPr>
+          <w:b/>
+          <w:i w:val="0"/>
+          <w:color w:val="1F2937"/>
+          <w:sz w:val="20"/>
+        </w:rPr>
+        <w:t>Key Impacts:</w:t>
+      </w:r>
+    </w:p>
+    <w:p>
+      <w:pPr>
+        <w:spacing w:before="0" w:after="40"/>
+      </w:pPr>
+      <w:r>
+        <w:rPr>
+          <w:b w:val="0"/>
+          <w:i w:val="0"/>
+          <w:color w:val="6B7280"/>
+          <w:sz w:val="18"/>
+        </w:rPr>
+        <w:t xml:space="preserve">  • No functional impact as no code was altered; only documentation was added.</w:t>
+      </w:r>
+    </w:p>
+    <w:p>
+      <w:pPr>
+        <w:spacing w:before="0" w:after="40"/>
+      </w:pPr>
+      <w:r>
+        <w:rPr>
+          <w:b w:val="0"/>
+          <w:i w:val="0"/>
+          <w:color w:val="6B7280"/>
+          <w:sz w:val="18"/>
+        </w:rPr>
+        <w:t xml:space="preserve">  • Low risk, but potential edge case if the test description is incomplete or outdated, leading to confusion for new users.</w:t>
+      </w:r>
+    </w:p>
+    <w:p>
+      <w:pPr>
+        <w:spacing w:before="0" w:after="40"/>
+      </w:pPr>
+      <w:r>
+        <w:rPr>
+          <w:b w:val="0"/>
+          <w:i w:val="0"/>
+          <w:color w:val="6B7280"/>
+          <w:sz w:val="18"/>
+        </w:rPr>
+        <w:t xml:space="preserve">  • No performance or security implications since this is purely a documentation update.</w:t>
+      </w:r>
+    </w:p>
+    <w:p>
+      <w:pPr>
+        <w:spacing w:before="120" w:after="40"/>
+      </w:pPr>
+      <w:r>
+        <w:rPr>
+          <w:b/>
+          <w:i w:val="0"/>
+          <w:color w:val="1F2937"/>
+          <w:sz w:val="20"/>
+        </w:rPr>
+        <w:t>Review Notes:</w:t>
+      </w:r>
+    </w:p>
+    <w:p>
+      <w:pPr>
+        <w:spacing w:before="0" w:after="80"/>
+      </w:pPr>
+      <w:r>
+        <w:rPr>
+          <w:b w:val="0"/>
+          <w:i w:val="0"/>
+          <w:color w:val="6B7280"/>
+          <w:sz w:val="18"/>
+        </w:rPr>
+        <w:t>The PR lacked formal approvals or requested changes, and was self-merged by the author, indicating an informal review process. No code diffs were available, suggesting the changes were minimal and non-technical.</w:t>
+      </w:r>
+    </w:p>
+    <w:p>
+      <w:pPr>
+        <w:spacing w:before="80" w:after="80"/>
+        <w:pBdr>
+          <w:bottom w:val="single" w:sz="4" w:space="1" w:color="E5E7EB"/>
+        </w:pBdr>
+      </w:pPr>
     </w:p>
     <w:p>
       <w:pPr>
@@ -6849,7 +7696,7 @@
           <w:color w:val="9CA3AF"/>
           <w:sz w:val="18"/>
         </w:rPr>
-        <w:t>Merge Events Report  •  Generated by PR-Agent v2  •  March 04, 2026 at 11:52 UTC</w:t>
+        <w:t>Merge Events Report  •  Generated by PR-Agent v2  •  April 28, 2026 at 06:09 UTC</w:t>
       </w:r>
     </w:p>
     <w:sectPr>

</xml_diff>